<commit_message>
Building and Updating system -- need to troubleshoot.
</commit_message>
<xml_diff>
--- a/Frequency_Survey/Frequency_Survey_Project_Management.docx
+++ b/Frequency_Survey/Frequency_Survey_Project_Management.docx
@@ -193,6 +193,9 @@
     <w:p/>
     <w:p>
       <w:r>
+        <w:rPr>
+          <w:noProof/>
+        </w:rPr>
         <w:drawing>
           <wp:inline distT="0" distB="0" distL="0" distR="0" wp14:anchorId="03DD8F86" wp14:editId="46E19807">
             <wp:extent cx="5620039" cy="2482978"/>
@@ -233,6 +236,9 @@
     <w:p/>
     <w:p>
       <w:r>
+        <w:rPr>
+          <w:noProof/>
+        </w:rPr>
         <w:drawing>
           <wp:inline distT="0" distB="0" distL="0" distR="0" wp14:anchorId="4A869E09" wp14:editId="2A66A204">
             <wp:extent cx="4007056" cy="1752690"/>
@@ -273,6 +279,9 @@
     <w:p/>
     <w:p>
       <w:r>
+        <w:rPr>
+          <w:noProof/>
+        </w:rPr>
         <w:drawing>
           <wp:inline distT="0" distB="0" distL="0" distR="0" wp14:anchorId="7153929C" wp14:editId="7899EA4B">
             <wp:extent cx="3733992" cy="1873346"/>
@@ -321,13 +330,7 @@
       </w:r>
       <w:r>
         <w:lastRenderedPageBreak/>
-        <w:t xml:space="preserve">New uSD Card DS </w:t>
-      </w:r>
-      <w:r>
-        <w:t>2</w:t>
-      </w:r>
-      <w:r>
-        <w:t xml:space="preserve"> dot Validrive Report </w:t>
+        <w:t xml:space="preserve">New uSD Card DS 2 dot Validrive Report </w:t>
       </w:r>
       <w:r>
         <w:rPr>
@@ -367,12 +370,6 @@
         <w:gridCol w:w="3600"/>
       </w:tblGrid>
       <w:tr>
-        <w:tblPrEx>
-          <w:tblCellMar>
-            <w:top w:w="0" w:type="dxa"/>
-            <w:bottom w:w="0" w:type="dxa"/>
-          </w:tblCellMar>
-        </w:tblPrEx>
         <w:trPr>
           <w:jc w:val="center"/>
         </w:trPr>
@@ -410,12 +407,6 @@
         </w:tc>
       </w:tr>
       <w:tr>
-        <w:tblPrEx>
-          <w:tblCellMar>
-            <w:top w:w="0" w:type="dxa"/>
-            <w:bottom w:w="0" w:type="dxa"/>
-          </w:tblCellMar>
-        </w:tblPrEx>
         <w:trPr>
           <w:jc w:val="center"/>
         </w:trPr>
@@ -453,12 +444,6 @@
         </w:tc>
       </w:tr>
       <w:tr>
-        <w:tblPrEx>
-          <w:tblCellMar>
-            <w:top w:w="0" w:type="dxa"/>
-            <w:bottom w:w="0" w:type="dxa"/>
-          </w:tblCellMar>
-        </w:tblPrEx>
         <w:trPr>
           <w:jc w:val="center"/>
         </w:trPr>
@@ -496,12 +481,6 @@
         </w:tc>
       </w:tr>
       <w:tr>
-        <w:tblPrEx>
-          <w:tblCellMar>
-            <w:top w:w="0" w:type="dxa"/>
-            <w:bottom w:w="0" w:type="dxa"/>
-          </w:tblCellMar>
-        </w:tblPrEx>
         <w:trPr>
           <w:jc w:val="center"/>
         </w:trPr>
@@ -539,12 +518,6 @@
         </w:tc>
       </w:tr>
       <w:tr>
-        <w:tblPrEx>
-          <w:tblCellMar>
-            <w:top w:w="0" w:type="dxa"/>
-            <w:bottom w:w="0" w:type="dxa"/>
-          </w:tblCellMar>
-        </w:tblPrEx>
         <w:trPr>
           <w:jc w:val="center"/>
         </w:trPr>
@@ -582,12 +555,6 @@
         </w:tc>
       </w:tr>
       <w:tr>
-        <w:tblPrEx>
-          <w:tblCellMar>
-            <w:top w:w="0" w:type="dxa"/>
-            <w:bottom w:w="0" w:type="dxa"/>
-          </w:tblCellMar>
-        </w:tblPrEx>
         <w:trPr>
           <w:jc w:val="center"/>
         </w:trPr>
@@ -625,12 +592,6 @@
         </w:tc>
       </w:tr>
       <w:tr>
-        <w:tblPrEx>
-          <w:tblCellMar>
-            <w:top w:w="0" w:type="dxa"/>
-            <w:bottom w:w="0" w:type="dxa"/>
-          </w:tblCellMar>
-        </w:tblPrEx>
         <w:trPr>
           <w:jc w:val="center"/>
         </w:trPr>
@@ -671,6 +632,9 @@
     <w:p/>
     <w:p>
       <w:r>
+        <w:rPr>
+          <w:noProof/>
+        </w:rPr>
         <w:drawing>
           <wp:inline distT="0" distB="0" distL="0" distR="0" wp14:anchorId="42B02F20" wp14:editId="056FF5DC">
             <wp:extent cx="3416300" cy="1689100"/>
@@ -743,12 +707,6 @@
         <w:gridCol w:w="1950"/>
       </w:tblGrid>
       <w:tr>
-        <w:tblPrEx>
-          <w:tblCellMar>
-            <w:top w:w="0" w:type="dxa"/>
-            <w:bottom w:w="0" w:type="dxa"/>
-          </w:tblCellMar>
-        </w:tblPrEx>
         <w:trPr>
           <w:jc w:val="center"/>
         </w:trPr>
@@ -798,12 +756,6 @@
         </w:tc>
       </w:tr>
       <w:tr>
-        <w:tblPrEx>
-          <w:tblCellMar>
-            <w:top w:w="0" w:type="dxa"/>
-            <w:bottom w:w="0" w:type="dxa"/>
-          </w:tblCellMar>
-        </w:tblPrEx>
         <w:trPr>
           <w:jc w:val="center"/>
         </w:trPr>
@@ -857,12 +809,6 @@
         </w:tc>
       </w:tr>
       <w:tr>
-        <w:tblPrEx>
-          <w:tblCellMar>
-            <w:top w:w="0" w:type="dxa"/>
-            <w:bottom w:w="0" w:type="dxa"/>
-          </w:tblCellMar>
-        </w:tblPrEx>
         <w:trPr>
           <w:jc w:val="center"/>
         </w:trPr>
@@ -916,12 +862,6 @@
         </w:tc>
       </w:tr>
       <w:tr>
-        <w:tblPrEx>
-          <w:tblCellMar>
-            <w:top w:w="0" w:type="dxa"/>
-            <w:bottom w:w="0" w:type="dxa"/>
-          </w:tblCellMar>
-        </w:tblPrEx>
         <w:trPr>
           <w:jc w:val="center"/>
         </w:trPr>
@@ -975,12 +915,6 @@
         </w:tc>
       </w:tr>
       <w:tr>
-        <w:tblPrEx>
-          <w:tblCellMar>
-            <w:top w:w="0" w:type="dxa"/>
-            <w:bottom w:w="0" w:type="dxa"/>
-          </w:tblCellMar>
-        </w:tblPrEx>
         <w:trPr>
           <w:jc w:val="center"/>
         </w:trPr>
@@ -1034,12 +968,6 @@
         </w:tc>
       </w:tr>
       <w:tr>
-        <w:tblPrEx>
-          <w:tblCellMar>
-            <w:top w:w="0" w:type="dxa"/>
-            <w:bottom w:w="0" w:type="dxa"/>
-          </w:tblCellMar>
-        </w:tblPrEx>
         <w:trPr>
           <w:jc w:val="center"/>
         </w:trPr>
@@ -1093,12 +1021,6 @@
         </w:tc>
       </w:tr>
       <w:tr>
-        <w:tblPrEx>
-          <w:tblCellMar>
-            <w:top w:w="0" w:type="dxa"/>
-            <w:bottom w:w="0" w:type="dxa"/>
-          </w:tblCellMar>
-        </w:tblPrEx>
         <w:trPr>
           <w:jc w:val="center"/>
         </w:trPr>
@@ -1152,12 +1074,6 @@
         </w:tc>
       </w:tr>
       <w:tr>
-        <w:tblPrEx>
-          <w:tblCellMar>
-            <w:top w:w="0" w:type="dxa"/>
-            <w:bottom w:w="0" w:type="dxa"/>
-          </w:tblCellMar>
-        </w:tblPrEx>
         <w:trPr>
           <w:jc w:val="center"/>
         </w:trPr>
@@ -1212,12 +1128,6 @@
         </w:tc>
       </w:tr>
       <w:tr>
-        <w:tblPrEx>
-          <w:tblCellMar>
-            <w:top w:w="0" w:type="dxa"/>
-            <w:bottom w:w="0" w:type="dxa"/>
-          </w:tblCellMar>
-        </w:tblPrEx>
         <w:trPr>
           <w:jc w:val="center"/>
         </w:trPr>
@@ -1271,12 +1181,6 @@
         </w:tc>
       </w:tr>
       <w:tr>
-        <w:tblPrEx>
-          <w:tblCellMar>
-            <w:top w:w="0" w:type="dxa"/>
-            <w:bottom w:w="0" w:type="dxa"/>
-          </w:tblCellMar>
-        </w:tblPrEx>
         <w:trPr>
           <w:jc w:val="center"/>
         </w:trPr>
@@ -1350,6 +1254,9 @@
     <w:p/>
     <w:p>
       <w:r>
+        <w:rPr>
+          <w:noProof/>
+        </w:rPr>
         <w:drawing>
           <wp:inline distT="0" distB="0" distL="0" distR="0" wp14:anchorId="6636FA6A" wp14:editId="5ECD3344">
             <wp:extent cx="5943600" cy="4076700"/>
@@ -1391,6 +1298,9 @@
     <w:p/>
     <w:p>
       <w:r>
+        <w:rPr>
+          <w:noProof/>
+        </w:rPr>
         <w:lastRenderedPageBreak/>
         <w:drawing>
           <wp:inline distT="0" distB="0" distL="0" distR="0" wp14:anchorId="6900DFB1" wp14:editId="784B8099">
@@ -1429,6 +1339,521 @@
         </w:drawing>
       </w:r>
     </w:p>
+    <w:p/>
+    <w:p/>
+    <w:p>
+      <w:r>
+        <w:br w:type="page"/>
+      </w:r>
+    </w:p>
+    <w:p>
+      <w:r>
+        <w:lastRenderedPageBreak/>
+        <w:t>4/23/</w:t>
+      </w:r>
+      <w:r>
+        <w:t>25</w:t>
+      </w:r>
+    </w:p>
+    <w:p/>
+    <w:p>
+      <w:pPr>
+        <w:rPr>
+          <w:b/>
+          <w:bCs/>
+        </w:rPr>
+      </w:pPr>
+      <w:r>
+        <w:rPr>
+          <w:b/>
+          <w:bCs/>
+        </w:rPr>
+        <w:t>S S H &lt; U S E R &gt; @ &lt; I P &gt;</w:t>
+      </w:r>
+    </w:p>
+    <w:p>
+      <w:r>
+        <w:t>Connects to another Linux system with SSH</w:t>
+      </w:r>
+    </w:p>
+    <w:p>
+      <w:r>
+        <w:rPr>
+          <w:i/>
+          <w:iCs/>
+        </w:rPr>
+        <w:t xml:space="preserve">Example: </w:t>
+      </w:r>
+      <w:r>
+        <w:t xml:space="preserve">ssh </w:t>
+      </w:r>
+      <w:hyperlink r:id="rId11" w:history="1">
+        <w:r>
+          <w:rPr>
+            <w:rStyle w:val="Hyperlink"/>
+          </w:rPr>
+          <w:t>pat@192.168.1.1</w:t>
+        </w:r>
+      </w:hyperlink>
+    </w:p>
+    <w:p/>
+    <w:p>
+      <w:pPr>
+        <w:rPr>
+          <w:strike/>
+          <w:color w:val="FF0000"/>
+        </w:rPr>
+      </w:pPr>
+      <w:r>
+        <w:rPr>
+          <w:strike/>
+          <w:color w:val="FF0000"/>
+        </w:rPr>
+        <w:t xml:space="preserve">ssh </w:t>
+      </w:r>
+      <w:hyperlink r:id="rId12" w:history="1">
+        <w:r>
+          <w:rPr>
+            <w:rStyle w:val="Hyperlink"/>
+            <w:strike/>
+            <w:color w:val="FF0000"/>
+          </w:rPr>
+          <w:t>unicycle9312</w:t>
+        </w:r>
+        <w:r>
+          <w:rPr>
+            <w:rStyle w:val="Hyperlink"/>
+            <w:strike/>
+            <w:color w:val="FF0000"/>
+          </w:rPr>
+          <w:t>@198.168.4.190</w:t>
+        </w:r>
+      </w:hyperlink>
+    </w:p>
+    <w:p/>
+    <w:p>
+      <w:r>
+        <w:t>To SSH into a Raspberry Pi, you need to ensure that SSH is enabled on the device. If it's not enabled, you can create a file named "ssh" in the boot directory of the SD card, then insert it back into the Raspberry Pi and boot it up to enable SSH</w:t>
+      </w:r>
+    </w:p>
+    <w:p/>
+    <w:p>
+      <w:r>
+        <w:t>FAIL – Try Reimaging</w:t>
+      </w:r>
+    </w:p>
+    <w:p/>
+    <w:p>
+      <w:r>
+        <w:rPr>
+          <w:noProof/>
+        </w:rPr>
+        <w:lastRenderedPageBreak/>
+        <w:drawing>
+          <wp:inline distT="0" distB="0" distL="0" distR="0" wp14:anchorId="165958CA" wp14:editId="367D11EF">
+            <wp:extent cx="5943600" cy="4165600"/>
+            <wp:effectExtent l="0" t="0" r="0" b="6350"/>
+            <wp:docPr id="935272670" name="Picture 1" descr="A screenshot of a computer&#10;&#10;AI-generated content may be incorrect."/>
+            <wp:cNvGraphicFramePr>
+              <a:graphicFrameLocks xmlns:a="http://schemas.openxmlformats.org/drawingml/2006/main" noChangeAspect="1"/>
+            </wp:cNvGraphicFramePr>
+            <a:graphic xmlns:a="http://schemas.openxmlformats.org/drawingml/2006/main">
+              <a:graphicData uri="http://schemas.openxmlformats.org/drawingml/2006/picture">
+                <pic:pic xmlns:pic="http://schemas.openxmlformats.org/drawingml/2006/picture">
+                  <pic:nvPicPr>
+                    <pic:cNvPr id="935272670" name="Picture 1" descr="A screenshot of a computer&#10;&#10;AI-generated content may be incorrect."/>
+                    <pic:cNvPicPr/>
+                  </pic:nvPicPr>
+                  <pic:blipFill>
+                    <a:blip r:embed="rId13"/>
+                    <a:stretch>
+                      <a:fillRect/>
+                    </a:stretch>
+                  </pic:blipFill>
+                  <pic:spPr>
+                    <a:xfrm>
+                      <a:off x="0" y="0"/>
+                      <a:ext cx="5943600" cy="4165600"/>
+                    </a:xfrm>
+                    <a:prstGeom prst="rect">
+                      <a:avLst/>
+                    </a:prstGeom>
+                  </pic:spPr>
+                </pic:pic>
+              </a:graphicData>
+            </a:graphic>
+          </wp:inline>
+        </w:drawing>
+      </w:r>
+    </w:p>
+    <w:p/>
+    <w:p>
+      <w:r>
+        <w:rPr>
+          <w:noProof/>
+        </w:rPr>
+        <w:lastRenderedPageBreak/>
+        <w:drawing>
+          <wp:inline distT="0" distB="0" distL="0" distR="0" wp14:anchorId="11610329" wp14:editId="07DECBD2">
+            <wp:extent cx="5943600" cy="4102100"/>
+            <wp:effectExtent l="0" t="0" r="0" b="0"/>
+            <wp:docPr id="1007017037" name="Picture 1" descr="A screenshot of a computer&#10;&#10;AI-generated content may be incorrect."/>
+            <wp:cNvGraphicFramePr>
+              <a:graphicFrameLocks xmlns:a="http://schemas.openxmlformats.org/drawingml/2006/main" noChangeAspect="1"/>
+            </wp:cNvGraphicFramePr>
+            <a:graphic xmlns:a="http://schemas.openxmlformats.org/drawingml/2006/main">
+              <a:graphicData uri="http://schemas.openxmlformats.org/drawingml/2006/picture">
+                <pic:pic xmlns:pic="http://schemas.openxmlformats.org/drawingml/2006/picture">
+                  <pic:nvPicPr>
+                    <pic:cNvPr id="1007017037" name="Picture 1" descr="A screenshot of a computer&#10;&#10;AI-generated content may be incorrect."/>
+                    <pic:cNvPicPr/>
+                  </pic:nvPicPr>
+                  <pic:blipFill>
+                    <a:blip r:embed="rId14"/>
+                    <a:stretch>
+                      <a:fillRect/>
+                    </a:stretch>
+                  </pic:blipFill>
+                  <pic:spPr>
+                    <a:xfrm>
+                      <a:off x="0" y="0"/>
+                      <a:ext cx="5943600" cy="4102100"/>
+                    </a:xfrm>
+                    <a:prstGeom prst="rect">
+                      <a:avLst/>
+                    </a:prstGeom>
+                  </pic:spPr>
+                </pic:pic>
+              </a:graphicData>
+            </a:graphic>
+          </wp:inline>
+        </w:drawing>
+      </w:r>
+    </w:p>
+    <w:p/>
+    <w:p/>
+    <w:p>
+      <w:r>
+        <w:t>Microsoft Windows [Version 10.0.19045.5737]</w:t>
+      </w:r>
+    </w:p>
+    <w:p>
+      <w:r>
+        <w:t>(c) Microsoft Corporation. All rights reserved.</w:t>
+      </w:r>
+    </w:p>
+    <w:p/>
+    <w:p>
+      <w:r>
+        <w:t>C:\Users\N5QC&gt;ssh unicycle9312@</w:t>
+      </w:r>
+      <w:r>
+        <w:rPr>
+          <w:color w:val="FF0000"/>
+        </w:rPr>
+        <w:t>198</w:t>
+      </w:r>
+      <w:r>
+        <w:t>.168.4.190</w:t>
+      </w:r>
+    </w:p>
+    <w:p>
+      <w:r>
+        <w:t xml:space="preserve">ssh: connect to host </w:t>
+      </w:r>
+      <w:r>
+        <w:rPr>
+          <w:color w:val="FF0000"/>
+        </w:rPr>
+        <w:t>198</w:t>
+      </w:r>
+      <w:r>
+        <w:t>.168.4.190 port 22: Connection timed out</w:t>
+      </w:r>
+    </w:p>
+    <w:p/>
+    <w:p/>
+    <w:p>
+      <w:pPr>
+        <w:rPr>
+          <w:color w:val="FF0000"/>
+        </w:rPr>
+      </w:pPr>
+      <w:r>
+        <w:rPr>
+          <w:color w:val="FF0000"/>
+        </w:rPr>
+        <w:t xml:space="preserve">BAD IP:  </w:t>
+      </w:r>
+      <w:r>
+        <w:rPr>
+          <w:color w:val="FF0000"/>
+        </w:rPr>
+        <w:t>198.168.4.190</w:t>
+      </w:r>
+      <w:r>
+        <w:rPr>
+          <w:color w:val="FF0000"/>
+        </w:rPr>
+        <w:t xml:space="preserve"> </w:t>
+      </w:r>
+      <w:r>
+        <w:rPr>
+          <w:color w:val="FF0000"/>
+        </w:rPr>
+        <w:sym w:font="Wingdings" w:char="F0E0"/>
+      </w:r>
+      <w:r>
+        <w:rPr>
+          <w:color w:val="FF0000"/>
+        </w:rPr>
+        <w:t xml:space="preserve"> </w:t>
+      </w:r>
+      <w:r>
+        <w:rPr>
+          <w:color w:val="FF0000"/>
+        </w:rPr>
+        <w:t>19</w:t>
+      </w:r>
+      <w:r>
+        <w:rPr>
+          <w:color w:val="FF0000"/>
+        </w:rPr>
+        <w:t>2</w:t>
+      </w:r>
+      <w:r>
+        <w:rPr>
+          <w:color w:val="FF0000"/>
+        </w:rPr>
+        <w:t>.168.4.190</w:t>
+      </w:r>
+    </w:p>
+    <w:p/>
+    <w:p>
+      <w:pPr>
+        <w:rPr>
+          <w:b/>
+          <w:bCs/>
+          <w:color w:val="00B050"/>
+        </w:rPr>
+      </w:pPr>
+      <w:hyperlink r:id="rId15" w:history="1">
+        <w:r>
+          <w:rPr>
+            <w:rStyle w:val="Hyperlink"/>
+            <w:b/>
+            <w:bCs/>
+          </w:rPr>
+          <w:t>unicycle9312@192.168.4.190</w:t>
+        </w:r>
+      </w:hyperlink>
+    </w:p>
+    <w:p>
+      <w:pPr>
+        <w:rPr>
+          <w:b/>
+          <w:bCs/>
+          <w:color w:val="00B050"/>
+        </w:rPr>
+      </w:pPr>
+    </w:p>
+    <w:p>
+      <w:r>
+        <w:lastRenderedPageBreak/>
+        <w:drawing>
+          <wp:inline distT="0" distB="0" distL="0" distR="0" wp14:anchorId="03EE0F13" wp14:editId="481B4BAD">
+            <wp:extent cx="4921503" cy="3791145"/>
+            <wp:effectExtent l="0" t="0" r="0" b="0"/>
+            <wp:docPr id="643627674" name="Picture 1" descr="A screenshot of a computer security alert&#10;&#10;AI-generated content may be incorrect."/>
+            <wp:cNvGraphicFramePr>
+              <a:graphicFrameLocks xmlns:a="http://schemas.openxmlformats.org/drawingml/2006/main" noChangeAspect="1"/>
+            </wp:cNvGraphicFramePr>
+            <a:graphic xmlns:a="http://schemas.openxmlformats.org/drawingml/2006/main">
+              <a:graphicData uri="http://schemas.openxmlformats.org/drawingml/2006/picture">
+                <pic:pic xmlns:pic="http://schemas.openxmlformats.org/drawingml/2006/picture">
+                  <pic:nvPicPr>
+                    <pic:cNvPr id="643627674" name="Picture 1" descr="A screenshot of a computer security alert&#10;&#10;AI-generated content may be incorrect."/>
+                    <pic:cNvPicPr/>
+                  </pic:nvPicPr>
+                  <pic:blipFill>
+                    <a:blip r:embed="rId16"/>
+                    <a:stretch>
+                      <a:fillRect/>
+                    </a:stretch>
+                  </pic:blipFill>
+                  <pic:spPr>
+                    <a:xfrm>
+                      <a:off x="0" y="0"/>
+                      <a:ext cx="4921503" cy="3791145"/>
+                    </a:xfrm>
+                    <a:prstGeom prst="rect">
+                      <a:avLst/>
+                    </a:prstGeom>
+                  </pic:spPr>
+                </pic:pic>
+              </a:graphicData>
+            </a:graphic>
+          </wp:inline>
+        </w:drawing>
+      </w:r>
+    </w:p>
+    <w:p/>
+    <w:p>
+      <w:r>
+        <w:t>sudo apt-get update</w:t>
+      </w:r>
+    </w:p>
+    <w:p>
+      <w:r>
+        <w:t>sudo apt-get upgrade</w:t>
+      </w:r>
+    </w:p>
+    <w:p>
+      <w:r>
+        <w:t>s</w:t>
+      </w:r>
+      <w:r>
+        <w:t>udo apt-get dist-upgrade</w:t>
+      </w:r>
+    </w:p>
+    <w:p>
+      <w:r>
+        <w:t>sudo reboot</w:t>
+      </w:r>
+    </w:p>
+    <w:p>
+      <w:r>
+        <w:t>shutdown -h now</w:t>
+      </w:r>
+    </w:p>
+    <w:p/>
+    <w:p/>
+    <w:p>
+      <w:pPr>
+        <w:rPr>
+          <w:b/>
+          <w:bCs/>
+          <w:color w:val="00B050"/>
+        </w:rPr>
+      </w:pPr>
+      <w:r>
+        <w:rPr>
+          <w:b/>
+          <w:bCs/>
+          <w:color w:val="00B050"/>
+        </w:rPr>
+        <w:t>sudo apt install rtl-sdr python3-matplotlib python3-numpy sox git</w:t>
+      </w:r>
+    </w:p>
+    <w:p/>
+    <w:p>
+      <w:r>
+        <w:rPr>
+          <w:b/>
+          <w:bCs/>
+          <w:color w:val="00B050"/>
+        </w:rPr>
+        <w:t xml:space="preserve">git clone </w:t>
+      </w:r>
+      <w:hyperlink r:id="rId17" w:history="1">
+        <w:r>
+          <w:rPr>
+            <w:b/>
+            <w:bCs/>
+            <w:color w:val="00B050"/>
+          </w:rPr>
+          <w:t>https://github.com/keenerd/rtl-sdr.git</w:t>
+        </w:r>
+      </w:hyperlink>
+      <w:r>
+        <w:br/>
+      </w:r>
+      <w:r>
+        <w:rPr>
+          <w:color w:val="FF0000"/>
+        </w:rPr>
+        <w:t>cp rtl-sdr/rtl_power/heatmap.py ~/sdr-monitor/</w:t>
+      </w:r>
+    </w:p>
+    <w:p/>
+    <w:p>
+      <w:r>
+        <w:t>unicycle9312@Frequency:~ $ cp rtl-sdr/rtl_power/heatmap.py ~/sdr-monitor/</w:t>
+      </w:r>
+    </w:p>
+    <w:p>
+      <w:r>
+        <w:lastRenderedPageBreak/>
+        <w:t>cp: cannot stat 'rtl-sdr/rtl_power/heatmap.py': No such file or directory</w:t>
+      </w:r>
+    </w:p>
+    <w:p>
+      <w:r>
+        <w:t>unicycle9312@Frequency:~ $ ls</w:t>
+      </w:r>
+    </w:p>
+    <w:p>
+      <w:r>
+        <w:t>Bookshelf  Desktop  Documents  Downloads  Music  Pictures  Public  rtl-sdr  Templates  Videos</w:t>
+      </w:r>
+    </w:p>
+    <w:p>
+      <w:r>
+        <w:t>unicycle9312@Frequency:~ $ cd rtl-sdr</w:t>
+      </w:r>
+    </w:p>
+    <w:p>
+      <w:r>
+        <w:t>unicycle9312@Frequency:~/rtl-sdr $ ls</w:t>
+      </w:r>
+    </w:p>
+    <w:p>
+      <w:r>
+        <w:t>AUTHORS  CMakeLists.txt  COPYING      git-version-gen  librtlsdr.pc.in  Makefile.am  rtlsdr.conf    src</w:t>
+      </w:r>
+    </w:p>
+    <w:p>
+      <w:r>
+        <w:t>cmake    configure.ac    Doxyfile.in  include          m4               README       rtl-sdr.rules</w:t>
+      </w:r>
+    </w:p>
+    <w:p/>
+    <w:p>
+      <w:pPr>
+        <w:pBdr>
+          <w:bottom w:val="double" w:sz="6" w:space="1" w:color="auto"/>
+        </w:pBdr>
+      </w:pPr>
+    </w:p>
+    <w:p/>
+    <w:p>
+      <w:r>
+        <w:t>unicycle9312@Frequency:~/rtl-sdr $ shutdown -h now</w:t>
+      </w:r>
+    </w:p>
+    <w:p>
+      <w:r>
+        <w:t>Call to PowerOff failed: Interactive authentication required.</w:t>
+      </w:r>
+    </w:p>
+    <w:p>
+      <w:r>
+        <w:t>unicycle9312@Frequency:~/rtl-sdr $ sudo shutdown -h now</w:t>
+      </w:r>
+    </w:p>
+    <w:p/>
+    <w:p>
+      <w:r>
+        <w:t>Broadcast message from root@Frequency on pts/1 (Wed 2025-04-23 20:49:50 CDT):</w:t>
+      </w:r>
+    </w:p>
+    <w:p/>
+    <w:p>
+      <w:r>
+        <w:t>The system will power off now!</w:t>
+      </w:r>
+    </w:p>
+    <w:p/>
     <w:sectPr>
       <w:pgSz w:w="12240" w:h="15840"/>
       <w:pgMar w:top="1440" w:right="1440" w:bottom="1440" w:left="1440" w:header="720" w:footer="720" w:gutter="0"/>

</xml_diff>

<commit_message>
First 2 scans on card.
</commit_message>
<xml_diff>
--- a/Frequency_Survey/Frequency_Survey_Project_Management.docx
+++ b/Frequency_Survey/Frequency_Survey_Project_Management.docx
@@ -1583,13 +1583,7 @@
         <w:rPr>
           <w:color w:val="FF0000"/>
         </w:rPr>
-        <w:t xml:space="preserve">BAD IP:  </w:t>
-      </w:r>
-      <w:r>
-        <w:rPr>
-          <w:color w:val="FF0000"/>
-        </w:rPr>
-        <w:t>198.168.4.190</w:t>
+        <w:t>BAD IP:  198.168.4.190</w:t>
       </w:r>
       <w:r>
         <w:rPr>
@@ -1607,25 +1601,7 @@
         <w:rPr>
           <w:color w:val="FF0000"/>
         </w:rPr>
-        <w:t xml:space="preserve"> </w:t>
-      </w:r>
-      <w:r>
-        <w:rPr>
-          <w:color w:val="FF0000"/>
-        </w:rPr>
-        <w:t>19</w:t>
-      </w:r>
-      <w:r>
-        <w:rPr>
-          <w:color w:val="FF0000"/>
-        </w:rPr>
-        <w:t>2</w:t>
-      </w:r>
-      <w:r>
-        <w:rPr>
-          <w:color w:val="FF0000"/>
-        </w:rPr>
-        <w:t>.168.4.190</w:t>
+        <w:t xml:space="preserve"> 192.168.4.190</w:t>
       </w:r>
     </w:p>
     <w:p/>
@@ -1659,6 +1635,9 @@
     </w:p>
     <w:p>
       <w:r>
+        <w:rPr>
+          <w:noProof/>
+        </w:rPr>
         <w:lastRenderedPageBreak/>
         <w:drawing>
           <wp:inline distT="0" distB="0" distL="0" distR="0" wp14:anchorId="03EE0F13" wp14:editId="481B4BAD">
@@ -1718,6 +1697,11 @@
     </w:p>
     <w:p>
       <w:r>
+        <w:t>logout or exit</w:t>
+      </w:r>
+    </w:p>
+    <w:p>
+      <w:r>
         <w:t>sudo reboot</w:t>
       </w:r>
     </w:p>
@@ -1778,12 +1762,12 @@
     <w:p/>
     <w:p>
       <w:r>
+        <w:lastRenderedPageBreak/>
         <w:t>unicycle9312@Frequency:~ $ cp rtl-sdr/rtl_power/heatmap.py ~/sdr-monitor/</w:t>
       </w:r>
     </w:p>
     <w:p>
       <w:r>
-        <w:lastRenderedPageBreak/>
         <w:t>cp: cannot stat 'rtl-sdr/rtl_power/heatmap.py': No such file or directory</w:t>
       </w:r>
     </w:p>
@@ -1853,6 +1837,232 @@
         <w:t>The system will power off now!</w:t>
       </w:r>
     </w:p>
+    <w:p>
+      <w:r>
+        <w:br w:type="page"/>
+      </w:r>
+    </w:p>
+    <w:p>
+      <w:r>
+        <w:lastRenderedPageBreak/>
+        <w:t>4/24/25</w:t>
+      </w:r>
+    </w:p>
+    <w:p/>
+    <w:p>
+      <w:pPr>
+        <w:rPr>
+          <w:b/>
+          <w:bCs/>
+          <w:u w:val="single"/>
+        </w:rPr>
+      </w:pPr>
+      <w:r>
+        <w:rPr>
+          <w:b/>
+          <w:bCs/>
+          <w:u w:val="single"/>
+        </w:rPr>
+        <w:t>Tiger VNC</w:t>
+      </w:r>
+    </w:p>
+    <w:p/>
+    <w:p>
+      <w:pPr>
+        <w:pStyle w:val="ListParagraph"/>
+        <w:numPr>
+          <w:ilvl w:val="0"/>
+          <w:numId w:val="7"/>
+        </w:numPr>
+        <w:suppressAutoHyphens/>
+        <w:spacing w:after="0" w:line="240" w:lineRule="auto"/>
+        <w:rPr>
+          <w:rFonts w:ascii="Calibri" w:hAnsi="Calibri" w:cs="Calibri"/>
+        </w:rPr>
+      </w:pPr>
+      <w:r>
+        <w:rPr>
+          <w:rFonts w:ascii="Calibri" w:hAnsi="Calibri" w:cs="Calibri"/>
+        </w:rPr>
+        <w:t>Enable VNC Server with sudo raspi-config</w:t>
+      </w:r>
+    </w:p>
+    <w:p/>
+    <w:p/>
+    <w:p>
+      <w:r>
+        <w:drawing>
+          <wp:inline distT="0" distB="0" distL="0" distR="0" wp14:anchorId="3301522C" wp14:editId="06F4E692">
+            <wp:extent cx="5131064" cy="3073558"/>
+            <wp:effectExtent l="0" t="0" r="0" b="0"/>
+            <wp:docPr id="864256390" name="Picture 1" descr="A screenshot of a computer&#10;&#10;AI-generated content may be incorrect."/>
+            <wp:cNvGraphicFramePr>
+              <a:graphicFrameLocks xmlns:a="http://schemas.openxmlformats.org/drawingml/2006/main" noChangeAspect="1"/>
+            </wp:cNvGraphicFramePr>
+            <a:graphic xmlns:a="http://schemas.openxmlformats.org/drawingml/2006/main">
+              <a:graphicData uri="http://schemas.openxmlformats.org/drawingml/2006/picture">
+                <pic:pic xmlns:pic="http://schemas.openxmlformats.org/drawingml/2006/picture">
+                  <pic:nvPicPr>
+                    <pic:cNvPr id="864256390" name="Picture 1" descr="A screenshot of a computer&#10;&#10;AI-generated content may be incorrect."/>
+                    <pic:cNvPicPr/>
+                  </pic:nvPicPr>
+                  <pic:blipFill>
+                    <a:blip r:embed="rId18"/>
+                    <a:stretch>
+                      <a:fillRect/>
+                    </a:stretch>
+                  </pic:blipFill>
+                  <pic:spPr>
+                    <a:xfrm>
+                      <a:off x="0" y="0"/>
+                      <a:ext cx="5131064" cy="3073558"/>
+                    </a:xfrm>
+                    <a:prstGeom prst="rect">
+                      <a:avLst/>
+                    </a:prstGeom>
+                  </pic:spPr>
+                </pic:pic>
+              </a:graphicData>
+            </a:graphic>
+          </wp:inline>
+        </w:drawing>
+      </w:r>
+    </w:p>
+    <w:p/>
+    <w:p/>
+    <w:p>
+      <w:r>
+        <w:t>sudo apt install rtl-sdr sox git python3-pip screen</w:t>
+      </w:r>
+    </w:p>
+    <w:p/>
+    <w:p>
+      <w:r>
+        <w:t>echo 'blacklist dvb_usb_rtl28xxu' | sudo tee /etc/modprobe.d/no-rtl.conf</w:t>
+      </w:r>
+    </w:p>
+    <w:p/>
+    <w:p>
+      <w:r>
+        <w:t>sudo reboot</w:t>
+      </w:r>
+    </w:p>
+    <w:p/>
+    <w:p>
+      <w:pPr>
+        <w:rPr>
+          <w:i/>
+          <w:iCs/>
+          <w:strike/>
+        </w:rPr>
+      </w:pPr>
+      <w:r>
+        <w:rPr>
+          <w:i/>
+          <w:iCs/>
+          <w:strike/>
+        </w:rPr>
+        <w:t>rtl_power -f 440M:450M:25k -i 15s -e 1h traffic.csv</w:t>
+      </w:r>
+    </w:p>
+    <w:p>
+      <w:r>
+        <w:lastRenderedPageBreak/>
+        <w:t>rtl_power -f 4</w:t>
+      </w:r>
+      <w:r>
+        <w:t>3</w:t>
+      </w:r>
+      <w:r>
+        <w:t>0M:450M:25k -i 15s -e 1h traffic.csv</w:t>
+      </w:r>
+    </w:p>
+    <w:p/>
+    <w:p/>
+    <w:p>
+      <w:r>
+        <w:drawing>
+          <wp:inline distT="0" distB="0" distL="0" distR="0" wp14:anchorId="47F25AFD" wp14:editId="0C4BDAF1">
+            <wp:extent cx="5943600" cy="3181985"/>
+            <wp:effectExtent l="0" t="0" r="0" b="0"/>
+            <wp:docPr id="933240114" name="Picture 1" descr="A computer screen shot of a computer screen&#10;&#10;AI-generated content may be incorrect."/>
+            <wp:cNvGraphicFramePr>
+              <a:graphicFrameLocks xmlns:a="http://schemas.openxmlformats.org/drawingml/2006/main" noChangeAspect="1"/>
+            </wp:cNvGraphicFramePr>
+            <a:graphic xmlns:a="http://schemas.openxmlformats.org/drawingml/2006/main">
+              <a:graphicData uri="http://schemas.openxmlformats.org/drawingml/2006/picture">
+                <pic:pic xmlns:pic="http://schemas.openxmlformats.org/drawingml/2006/picture">
+                  <pic:nvPicPr>
+                    <pic:cNvPr id="933240114" name="Picture 1" descr="A computer screen shot of a computer screen&#10;&#10;AI-generated content may be incorrect."/>
+                    <pic:cNvPicPr/>
+                  </pic:nvPicPr>
+                  <pic:blipFill>
+                    <a:blip r:embed="rId19"/>
+                    <a:stretch>
+                      <a:fillRect/>
+                    </a:stretch>
+                  </pic:blipFill>
+                  <pic:spPr>
+                    <a:xfrm>
+                      <a:off x="0" y="0"/>
+                      <a:ext cx="5943600" cy="3181985"/>
+                    </a:xfrm>
+                    <a:prstGeom prst="rect">
+                      <a:avLst/>
+                    </a:prstGeom>
+                  </pic:spPr>
+                </pic:pic>
+              </a:graphicData>
+            </a:graphic>
+          </wp:inline>
+        </w:drawing>
+      </w:r>
+    </w:p>
+    <w:p/>
+    <w:p>
+      <w:r>
+        <w:t>Don’t worry about message – look at data.</w:t>
+      </w:r>
+    </w:p>
+    <w:p/>
+    <w:p>
+      <w:r>
+        <w:t>rtl_power -f 4</w:t>
+      </w:r>
+      <w:r>
+        <w:t>3</w:t>
+      </w:r>
+      <w:r>
+        <w:t>0</w:t>
+      </w:r>
+      <w:r>
+        <w:t>000000</w:t>
+      </w:r>
+      <w:r>
+        <w:t>:450</w:t>
+      </w:r>
+      <w:r>
+        <w:t>000000</w:t>
+      </w:r>
+      <w:r>
+        <w:t>:25</w:t>
+      </w:r>
+      <w:r>
+        <w:t>000</w:t>
+      </w:r>
+      <w:r>
+        <w:t xml:space="preserve"> -i 15s -e 1h traffic</w:t>
+      </w:r>
+      <w:r>
+        <w:t>2</w:t>
+      </w:r>
+      <w:r>
+        <w:t>.csv</w:t>
+      </w:r>
+    </w:p>
+    <w:p/>
+    <w:p/>
+    <w:p/>
     <w:p/>
     <w:sectPr>
       <w:pgSz w:w="12240" w:h="15840"/>
@@ -2757,6 +2967,146 @@
       <w:rPr>
         <w:rFonts w:ascii="Symbol" w:hAnsi="Symbol" w:hint="default"/>
         <w:sz w:val="20"/>
+      </w:rPr>
+    </w:lvl>
+  </w:abstractNum>
+  <w:abstractNum w:abstractNumId="6" w15:restartNumberingAfterBreak="0">
+    <w:nsid w:val="615F4899"/>
+    <w:multiLevelType w:val="multilevel"/>
+    <w:tmpl w:val="C9266CD0"/>
+    <w:lvl w:ilvl="0">
+      <w:start w:val="1"/>
+      <w:numFmt w:val="bullet"/>
+      <w:lvlText w:val=""/>
+      <w:lvlJc w:val="left"/>
+      <w:pPr>
+        <w:tabs>
+          <w:tab w:val="num" w:pos="0"/>
+        </w:tabs>
+        <w:ind w:left="720" w:hanging="360"/>
+      </w:pPr>
+      <w:rPr>
+        <w:rFonts w:ascii="Wingdings" w:hAnsi="Wingdings" w:cs="Wingdings" w:hint="default"/>
+      </w:rPr>
+    </w:lvl>
+    <w:lvl w:ilvl="1">
+      <w:start w:val="1"/>
+      <w:numFmt w:val="bullet"/>
+      <w:lvlText w:val="o"/>
+      <w:lvlJc w:val="left"/>
+      <w:pPr>
+        <w:tabs>
+          <w:tab w:val="num" w:pos="0"/>
+        </w:tabs>
+        <w:ind w:left="1440" w:hanging="360"/>
+      </w:pPr>
+      <w:rPr>
+        <w:rFonts w:ascii="Courier New" w:hAnsi="Courier New" w:cs="Courier New" w:hint="default"/>
+      </w:rPr>
+    </w:lvl>
+    <w:lvl w:ilvl="2">
+      <w:start w:val="1"/>
+      <w:numFmt w:val="bullet"/>
+      <w:lvlText w:val=""/>
+      <w:lvlJc w:val="left"/>
+      <w:pPr>
+        <w:tabs>
+          <w:tab w:val="num" w:pos="0"/>
+        </w:tabs>
+        <w:ind w:left="2160" w:hanging="360"/>
+      </w:pPr>
+      <w:rPr>
+        <w:rFonts w:ascii="Wingdings" w:hAnsi="Wingdings" w:cs="Wingdings" w:hint="default"/>
+      </w:rPr>
+    </w:lvl>
+    <w:lvl w:ilvl="3">
+      <w:start w:val="1"/>
+      <w:numFmt w:val="bullet"/>
+      <w:lvlText w:val=""/>
+      <w:lvlJc w:val="left"/>
+      <w:pPr>
+        <w:tabs>
+          <w:tab w:val="num" w:pos="0"/>
+        </w:tabs>
+        <w:ind w:left="2880" w:hanging="360"/>
+      </w:pPr>
+      <w:rPr>
+        <w:rFonts w:ascii="Symbol" w:hAnsi="Symbol" w:cs="Symbol" w:hint="default"/>
+      </w:rPr>
+    </w:lvl>
+    <w:lvl w:ilvl="4">
+      <w:start w:val="1"/>
+      <w:numFmt w:val="bullet"/>
+      <w:lvlText w:val="o"/>
+      <w:lvlJc w:val="left"/>
+      <w:pPr>
+        <w:tabs>
+          <w:tab w:val="num" w:pos="0"/>
+        </w:tabs>
+        <w:ind w:left="3600" w:hanging="360"/>
+      </w:pPr>
+      <w:rPr>
+        <w:rFonts w:ascii="Courier New" w:hAnsi="Courier New" w:cs="Courier New" w:hint="default"/>
+      </w:rPr>
+    </w:lvl>
+    <w:lvl w:ilvl="5">
+      <w:start w:val="1"/>
+      <w:numFmt w:val="bullet"/>
+      <w:lvlText w:val=""/>
+      <w:lvlJc w:val="left"/>
+      <w:pPr>
+        <w:tabs>
+          <w:tab w:val="num" w:pos="0"/>
+        </w:tabs>
+        <w:ind w:left="4320" w:hanging="360"/>
+      </w:pPr>
+      <w:rPr>
+        <w:rFonts w:ascii="Wingdings" w:hAnsi="Wingdings" w:cs="Wingdings" w:hint="default"/>
+      </w:rPr>
+    </w:lvl>
+    <w:lvl w:ilvl="6">
+      <w:start w:val="1"/>
+      <w:numFmt w:val="bullet"/>
+      <w:lvlText w:val=""/>
+      <w:lvlJc w:val="left"/>
+      <w:pPr>
+        <w:tabs>
+          <w:tab w:val="num" w:pos="0"/>
+        </w:tabs>
+        <w:ind w:left="5040" w:hanging="360"/>
+      </w:pPr>
+      <w:rPr>
+        <w:rFonts w:ascii="Symbol" w:hAnsi="Symbol" w:cs="Symbol" w:hint="default"/>
+      </w:rPr>
+    </w:lvl>
+    <w:lvl w:ilvl="7">
+      <w:start w:val="1"/>
+      <w:numFmt w:val="bullet"/>
+      <w:lvlText w:val="o"/>
+      <w:lvlJc w:val="left"/>
+      <w:pPr>
+        <w:tabs>
+          <w:tab w:val="num" w:pos="0"/>
+        </w:tabs>
+        <w:ind w:left="5760" w:hanging="360"/>
+      </w:pPr>
+      <w:rPr>
+        <w:rFonts w:ascii="Courier New" w:hAnsi="Courier New" w:cs="Courier New" w:hint="default"/>
+      </w:rPr>
+    </w:lvl>
+    <w:lvl w:ilvl="8">
+      <w:start w:val="1"/>
+      <w:numFmt w:val="bullet"/>
+      <w:lvlText w:val=""/>
+      <w:lvlJc w:val="left"/>
+      <w:pPr>
+        <w:tabs>
+          <w:tab w:val="num" w:pos="0"/>
+        </w:tabs>
+        <w:ind w:left="6480" w:hanging="360"/>
+      </w:pPr>
+      <w:rPr>
+        <w:rFonts w:ascii="Wingdings" w:hAnsi="Wingdings" w:cs="Wingdings" w:hint="default"/>
       </w:rPr>
     </w:lvl>
   </w:abstractNum>
@@ -2777,6 +3127,9 @@
   </w:num>
   <w:num w:numId="6" w16cid:durableId="422070613">
     <w:abstractNumId w:val="0"/>
+  </w:num>
+  <w:num w:numId="7" w16cid:durableId="751925626">
+    <w:abstractNumId w:val="6"/>
   </w:num>
 </w:numbering>
 </file>
@@ -3384,6 +3737,7 @@
   <w:style w:type="character" w:default="1" w:styleId="DefaultParagraphFont">
     <w:name w:val="Default Paragraph Font"/>
     <w:uiPriority w:val="1"/>
+    <w:semiHidden/>
     <w:unhideWhenUsed/>
   </w:style>
   <w:style w:type="table" w:default="1" w:styleId="TableNormal">

</xml_diff>

<commit_message>
First Combined rough analysis
</commit_message>
<xml_diff>
--- a/Frequency_Survey/Frequency_Survey_Project_Management.docx
+++ b/Frequency_Survey/Frequency_Survey_Project_Management.docx
@@ -116,7 +116,15 @@
         </w:numPr>
       </w:pPr>
       <w:r>
-        <w:t xml:space="preserve">Check uSD Card Inventory </w:t>
+        <w:t xml:space="preserve">Check </w:t>
+      </w:r>
+      <w:proofErr w:type="spellStart"/>
+      <w:r>
+        <w:t>uSD</w:t>
+      </w:r>
+      <w:proofErr w:type="spellEnd"/>
+      <w:r>
+        <w:t xml:space="preserve"> Card Inventory </w:t>
       </w:r>
     </w:p>
     <w:p>
@@ -161,10 +169,26 @@
     <w:p>
       <w:r>
         <w:lastRenderedPageBreak/>
-        <w:t>New uSD Card DS</w:t>
-      </w:r>
-      <w:r>
-        <w:t xml:space="preserve"> 1 dot Validrive Report</w:t>
+        <w:t xml:space="preserve">New </w:t>
+      </w:r>
+      <w:proofErr w:type="spellStart"/>
+      <w:r>
+        <w:t>uSD</w:t>
+      </w:r>
+      <w:proofErr w:type="spellEnd"/>
+      <w:r>
+        <w:t xml:space="preserve"> Card DS</w:t>
+      </w:r>
+      <w:r>
+        <w:t xml:space="preserve"> 1 dot </w:t>
+      </w:r>
+      <w:proofErr w:type="spellStart"/>
+      <w:r>
+        <w:t>Validrive</w:t>
+      </w:r>
+      <w:proofErr w:type="spellEnd"/>
+      <w:r>
+        <w:t xml:space="preserve"> Report</w:t>
       </w:r>
       <w:r>
         <w:t xml:space="preserve"> </w:t>
@@ -330,7 +354,23 @@
       </w:r>
       <w:r>
         <w:lastRenderedPageBreak/>
-        <w:t xml:space="preserve">New uSD Card DS 2 dot Validrive Report </w:t>
+        <w:t xml:space="preserve">New </w:t>
+      </w:r>
+      <w:proofErr w:type="spellStart"/>
+      <w:r>
+        <w:t>uSD</w:t>
+      </w:r>
+      <w:proofErr w:type="spellEnd"/>
+      <w:r>
+        <w:t xml:space="preserve"> Card DS 2 dot </w:t>
+      </w:r>
+      <w:proofErr w:type="spellStart"/>
+      <w:r>
+        <w:t>Validrive</w:t>
+      </w:r>
+      <w:proofErr w:type="spellEnd"/>
+      <w:r>
+        <w:t xml:space="preserve"> Report </w:t>
       </w:r>
       <w:r>
         <w:rPr>
@@ -401,7 +441,15 @@
           </w:tcPr>
           <w:p>
             <w:r>
-              <w:t> 4/21/2025  at  2:47 PM</w:t>
+              <w:t> 4/21/</w:t>
+            </w:r>
+            <w:proofErr w:type="gramStart"/>
+            <w:r>
+              <w:t>2025  at</w:t>
+            </w:r>
+            <w:proofErr w:type="gramEnd"/>
+            <w:r>
+              <w:t>  2:47 PM</w:t>
             </w:r>
           </w:p>
         </w:tc>
@@ -586,8 +634,13 @@
           </w:tcPr>
           <w:p>
             <w:r>
-              <w:t> storage_device</w:t>
+              <w:t> </w:t>
             </w:r>
+            <w:proofErr w:type="spellStart"/>
+            <w:r>
+              <w:t>storage_device</w:t>
+            </w:r>
+            <w:proofErr w:type="spellEnd"/>
           </w:p>
         </w:tc>
       </w:tr>
@@ -1368,7 +1421,23 @@
           <w:b/>
           <w:bCs/>
         </w:rPr>
-        <w:t>S S H &lt; U S E R &gt; @ &lt; I P &gt;</w:t>
+        <w:t xml:space="preserve">S </w:t>
+      </w:r>
+      <w:proofErr w:type="spellStart"/>
+      <w:r>
+        <w:rPr>
+          <w:b/>
+          <w:bCs/>
+        </w:rPr>
+        <w:t>S</w:t>
+      </w:r>
+      <w:proofErr w:type="spellEnd"/>
+      <w:r>
+        <w:rPr>
+          <w:b/>
+          <w:bCs/>
+        </w:rPr>
+        <w:t xml:space="preserve"> H &lt; U S E R &gt; @ &lt; I P &gt;</w:t>
       </w:r>
     </w:p>
     <w:p>
@@ -1583,7 +1652,21 @@
         <w:rPr>
           <w:color w:val="FF0000"/>
         </w:rPr>
-        <w:t>BAD IP:  198.168.4.190</w:t>
+        <w:t>BAD IP</w:t>
+      </w:r>
+      <w:proofErr w:type="gramStart"/>
+      <w:r>
+        <w:rPr>
+          <w:color w:val="FF0000"/>
+        </w:rPr>
+        <w:t>:  198.168</w:t>
+      </w:r>
+      <w:proofErr w:type="gramEnd"/>
+      <w:r>
+        <w:rPr>
+          <w:color w:val="FF0000"/>
+        </w:rPr>
+        <w:t>.4.190</w:t>
       </w:r>
       <w:r>
         <w:rPr>
@@ -1678,21 +1761,44 @@
     </w:p>
     <w:p/>
     <w:p>
-      <w:r>
-        <w:t>sudo apt-get update</w:t>
-      </w:r>
-    </w:p>
-    <w:p>
-      <w:r>
-        <w:t>sudo apt-get upgrade</w:t>
-      </w:r>
-    </w:p>
-    <w:p>
+      <w:proofErr w:type="spellStart"/>
+      <w:r>
+        <w:t>sudo</w:t>
+      </w:r>
+      <w:proofErr w:type="spellEnd"/>
+      <w:r>
+        <w:t xml:space="preserve"> apt-get update</w:t>
+      </w:r>
+    </w:p>
+    <w:p>
+      <w:proofErr w:type="spellStart"/>
+      <w:r>
+        <w:t>sudo</w:t>
+      </w:r>
+      <w:proofErr w:type="spellEnd"/>
+      <w:r>
+        <w:t xml:space="preserve"> apt-get upgrade</w:t>
+      </w:r>
+    </w:p>
+    <w:p>
+      <w:proofErr w:type="spellStart"/>
       <w:r>
         <w:t>s</w:t>
       </w:r>
       <w:r>
-        <w:t>udo apt-get dist-upgrade</w:t>
+        <w:t>udo</w:t>
+      </w:r>
+      <w:proofErr w:type="spellEnd"/>
+      <w:r>
+        <w:t xml:space="preserve"> apt-get </w:t>
+      </w:r>
+      <w:proofErr w:type="spellStart"/>
+      <w:r>
+        <w:t>dist</w:t>
+      </w:r>
+      <w:proofErr w:type="spellEnd"/>
+      <w:r>
+        <w:t>-upgrade</w:t>
       </w:r>
     </w:p>
     <w:p>
@@ -1701,8 +1807,13 @@
       </w:r>
     </w:p>
     <w:p>
-      <w:r>
-        <w:t>sudo reboot</w:t>
+      <w:proofErr w:type="spellStart"/>
+      <w:r>
+        <w:t>sudo</w:t>
+      </w:r>
+      <w:proofErr w:type="spellEnd"/>
+      <w:r>
+        <w:t xml:space="preserve"> reboot</w:t>
       </w:r>
     </w:p>
     <w:p>
@@ -1720,13 +1831,41 @@
           <w:color w:val="00B050"/>
         </w:rPr>
       </w:pPr>
+      <w:proofErr w:type="spellStart"/>
       <w:r>
         <w:rPr>
           <w:b/>
           <w:bCs/>
           <w:color w:val="00B050"/>
         </w:rPr>
-        <w:t>sudo apt install rtl-sdr python3-matplotlib python3-numpy sox git</w:t>
+        <w:t>sudo</w:t>
+      </w:r>
+      <w:proofErr w:type="spellEnd"/>
+      <w:r>
+        <w:rPr>
+          <w:b/>
+          <w:bCs/>
+          <w:color w:val="00B050"/>
+        </w:rPr>
+        <w:t xml:space="preserve"> apt install </w:t>
+      </w:r>
+      <w:proofErr w:type="spellStart"/>
+      <w:r>
+        <w:rPr>
+          <w:b/>
+          <w:bCs/>
+          <w:color w:val="00B050"/>
+        </w:rPr>
+        <w:t>rtl-sdr</w:t>
+      </w:r>
+      <w:proofErr w:type="spellEnd"/>
+      <w:r>
+        <w:rPr>
+          <w:b/>
+          <w:bCs/>
+          <w:color w:val="00B050"/>
+        </w:rPr>
+        <w:t xml:space="preserve"> python3-matplotlib python3-numpy sox git</w:t>
       </w:r>
     </w:p>
     <w:p/>
@@ -1756,50 +1895,230 @@
         <w:rPr>
           <w:color w:val="FF0000"/>
         </w:rPr>
-        <w:t>cp rtl-sdr/rtl_power/heatmap.py ~/sdr-monitor/</w:t>
+        <w:t>cp rtl-sdr/rtl_power/heatmap.py ~/</w:t>
+      </w:r>
+      <w:proofErr w:type="spellStart"/>
+      <w:r>
+        <w:rPr>
+          <w:color w:val="FF0000"/>
+        </w:rPr>
+        <w:t>sdr</w:t>
+      </w:r>
+      <w:proofErr w:type="spellEnd"/>
+      <w:r>
+        <w:rPr>
+          <w:color w:val="FF0000"/>
+        </w:rPr>
+        <w:t>-monitor/</w:t>
       </w:r>
     </w:p>
     <w:p/>
     <w:p>
       <w:r>
         <w:lastRenderedPageBreak/>
-        <w:t>unicycle9312@Frequency:~ $ cp rtl-sdr/rtl_power/heatmap.py ~/sdr-monitor/</w:t>
-      </w:r>
-    </w:p>
-    <w:p>
-      <w:r>
-        <w:t>cp: cannot stat 'rtl-sdr/rtl_power/heatmap.py': No such file or directory</w:t>
-      </w:r>
-    </w:p>
-    <w:p>
-      <w:r>
-        <w:t>unicycle9312@Frequency:~ $ ls</w:t>
-      </w:r>
-    </w:p>
-    <w:p>
-      <w:r>
-        <w:t>Bookshelf  Desktop  Documents  Downloads  Music  Pictures  Public  rtl-sdr  Templates  Videos</w:t>
-      </w:r>
-    </w:p>
-    <w:p>
-      <w:r>
-        <w:t>unicycle9312@Frequency:~ $ cd rtl-sdr</w:t>
-      </w:r>
-    </w:p>
-    <w:p>
-      <w:r>
-        <w:t>unicycle9312@Frequency:~/rtl-sdr $ ls</w:t>
-      </w:r>
-    </w:p>
-    <w:p>
-      <w:r>
-        <w:t>AUTHORS  CMakeLists.txt  COPYING      git-version-gen  librtlsdr.pc.in  Makefile.am  rtlsdr.conf    src</w:t>
-      </w:r>
-    </w:p>
-    <w:p>
-      <w:r>
-        <w:t>cmake    configure.ac    Doxyfile.in  include          m4               README       rtl-sdr.rules</w:t>
-      </w:r>
+        <w:t>unicycle9312@</w:t>
+      </w:r>
+      <w:proofErr w:type="gramStart"/>
+      <w:r>
+        <w:t>Frequency:~</w:t>
+      </w:r>
+      <w:proofErr w:type="gramEnd"/>
+      <w:r>
+        <w:t xml:space="preserve"> $ cp rtl-sdr/rtl_power/heatmap.py ~/</w:t>
+      </w:r>
+      <w:proofErr w:type="spellStart"/>
+      <w:r>
+        <w:t>sdr</w:t>
+      </w:r>
+      <w:proofErr w:type="spellEnd"/>
+      <w:r>
+        <w:t>-monitor/</w:t>
+      </w:r>
+    </w:p>
+    <w:p>
+      <w:r>
+        <w:t>cp: cannot stat '</w:t>
+      </w:r>
+      <w:proofErr w:type="spellStart"/>
+      <w:r>
+        <w:t>rtl-sdr</w:t>
+      </w:r>
+      <w:proofErr w:type="spellEnd"/>
+      <w:r>
+        <w:t>/</w:t>
+      </w:r>
+      <w:proofErr w:type="spellStart"/>
+      <w:r>
+        <w:t>rtl_power</w:t>
+      </w:r>
+      <w:proofErr w:type="spellEnd"/>
+      <w:r>
+        <w:t>/heatmap.py': No such file or directory</w:t>
+      </w:r>
+    </w:p>
+    <w:p>
+      <w:r>
+        <w:t>unicycle9312@</w:t>
+      </w:r>
+      <w:proofErr w:type="gramStart"/>
+      <w:r>
+        <w:t>Frequency:~</w:t>
+      </w:r>
+      <w:proofErr w:type="gramEnd"/>
+      <w:r>
+        <w:t xml:space="preserve"> $ ls</w:t>
+      </w:r>
+    </w:p>
+    <w:p>
+      <w:proofErr w:type="gramStart"/>
+      <w:r>
+        <w:t>Bookshelf  Desktop</w:t>
+      </w:r>
+      <w:proofErr w:type="gramEnd"/>
+      <w:r>
+        <w:t xml:space="preserve">  </w:t>
+      </w:r>
+      <w:proofErr w:type="gramStart"/>
+      <w:r>
+        <w:t>Documents  Downloads</w:t>
+      </w:r>
+      <w:proofErr w:type="gramEnd"/>
+      <w:r>
+        <w:t xml:space="preserve">  </w:t>
+      </w:r>
+      <w:proofErr w:type="gramStart"/>
+      <w:r>
+        <w:t>Music  Pictures</w:t>
+      </w:r>
+      <w:proofErr w:type="gramEnd"/>
+      <w:r>
+        <w:t xml:space="preserve">  </w:t>
+      </w:r>
+      <w:proofErr w:type="gramStart"/>
+      <w:r>
+        <w:t xml:space="preserve">Public  </w:t>
+      </w:r>
+      <w:proofErr w:type="spellStart"/>
+      <w:r>
+        <w:t>rtl</w:t>
+      </w:r>
+      <w:proofErr w:type="gramEnd"/>
+      <w:r>
+        <w:t>-</w:t>
+      </w:r>
+      <w:proofErr w:type="gramStart"/>
+      <w:r>
+        <w:t>sdr</w:t>
+      </w:r>
+      <w:proofErr w:type="spellEnd"/>
+      <w:r>
+        <w:t xml:space="preserve">  Templates</w:t>
+      </w:r>
+      <w:proofErr w:type="gramEnd"/>
+      <w:r>
+        <w:t xml:space="preserve">  Videos</w:t>
+      </w:r>
+    </w:p>
+    <w:p>
+      <w:r>
+        <w:t>unicycle9312@</w:t>
+      </w:r>
+      <w:proofErr w:type="gramStart"/>
+      <w:r>
+        <w:t>Frequency:~</w:t>
+      </w:r>
+      <w:proofErr w:type="gramEnd"/>
+      <w:r>
+        <w:t xml:space="preserve"> $ cd </w:t>
+      </w:r>
+      <w:proofErr w:type="spellStart"/>
+      <w:r>
+        <w:t>rtl-sdr</w:t>
+      </w:r>
+      <w:proofErr w:type="spellEnd"/>
+    </w:p>
+    <w:p>
+      <w:r>
+        <w:t>unicycle9312@</w:t>
+      </w:r>
+      <w:proofErr w:type="gramStart"/>
+      <w:r>
+        <w:t>Frequency:~</w:t>
+      </w:r>
+      <w:proofErr w:type="gramEnd"/>
+      <w:r>
+        <w:t>/</w:t>
+      </w:r>
+      <w:proofErr w:type="spellStart"/>
+      <w:r>
+        <w:t>rtl-sdr</w:t>
+      </w:r>
+      <w:proofErr w:type="spellEnd"/>
+      <w:r>
+        <w:t xml:space="preserve"> $ ls</w:t>
+      </w:r>
+    </w:p>
+    <w:p>
+      <w:proofErr w:type="gramStart"/>
+      <w:r>
+        <w:t>AUTHORS  CMakeLists.txt</w:t>
+      </w:r>
+      <w:proofErr w:type="gramEnd"/>
+      <w:r>
+        <w:t xml:space="preserve">  COPYING      git-version-</w:t>
+      </w:r>
+      <w:proofErr w:type="gramStart"/>
+      <w:r>
+        <w:t>gen  librtlsdr.pc.in</w:t>
+      </w:r>
+      <w:proofErr w:type="gramEnd"/>
+      <w:r>
+        <w:t xml:space="preserve">  </w:t>
+      </w:r>
+      <w:proofErr w:type="gramStart"/>
+      <w:r>
+        <w:t xml:space="preserve">Makefile.am  </w:t>
+      </w:r>
+      <w:proofErr w:type="spellStart"/>
+      <w:r>
+        <w:t>rtlsdr</w:t>
+      </w:r>
+      <w:proofErr w:type="gramEnd"/>
+      <w:r>
+        <w:t>.conf</w:t>
+      </w:r>
+      <w:proofErr w:type="spellEnd"/>
+      <w:r>
+        <w:t xml:space="preserve">    </w:t>
+      </w:r>
+      <w:proofErr w:type="spellStart"/>
+      <w:r>
+        <w:t>src</w:t>
+      </w:r>
+      <w:proofErr w:type="spellEnd"/>
+    </w:p>
+    <w:p>
+      <w:proofErr w:type="spellStart"/>
+      <w:r>
+        <w:t>cmake</w:t>
+      </w:r>
+      <w:proofErr w:type="spellEnd"/>
+      <w:r>
+        <w:t xml:space="preserve">    configure.ac    </w:t>
+      </w:r>
+      <w:proofErr w:type="gramStart"/>
+      <w:r>
+        <w:t>Doxyfile.in  include</w:t>
+      </w:r>
+      <w:proofErr w:type="gramEnd"/>
+      <w:r>
+        <w:t xml:space="preserve">          m4               README       </w:t>
+      </w:r>
+      <w:proofErr w:type="spellStart"/>
+      <w:r>
+        <w:t>rtl-sdr.rules</w:t>
+      </w:r>
+      <w:proofErr w:type="spellEnd"/>
     </w:p>
     <w:p/>
     <w:p>
@@ -1812,7 +2131,23 @@
     <w:p/>
     <w:p>
       <w:r>
-        <w:t>unicycle9312@Frequency:~/rtl-sdr $ shutdown -h now</w:t>
+        <w:t>unicycle9312@</w:t>
+      </w:r>
+      <w:proofErr w:type="gramStart"/>
+      <w:r>
+        <w:t>Frequency:~</w:t>
+      </w:r>
+      <w:proofErr w:type="gramEnd"/>
+      <w:r>
+        <w:t>/</w:t>
+      </w:r>
+      <w:proofErr w:type="spellStart"/>
+      <w:r>
+        <w:t>rtl-sdr</w:t>
+      </w:r>
+      <w:proofErr w:type="spellEnd"/>
+      <w:r>
+        <w:t xml:space="preserve"> $ shutdown -h now</w:t>
       </w:r>
     </w:p>
     <w:p>
@@ -1822,13 +2157,45 @@
     </w:p>
     <w:p>
       <w:r>
-        <w:t>unicycle9312@Frequency:~/rtl-sdr $ sudo shutdown -h now</w:t>
+        <w:t>unicycle9312@</w:t>
+      </w:r>
+      <w:proofErr w:type="gramStart"/>
+      <w:r>
+        <w:t>Frequency:~</w:t>
+      </w:r>
+      <w:proofErr w:type="gramEnd"/>
+      <w:r>
+        <w:t>/</w:t>
+      </w:r>
+      <w:proofErr w:type="spellStart"/>
+      <w:r>
+        <w:t>rtl-sdr</w:t>
+      </w:r>
+      <w:proofErr w:type="spellEnd"/>
+      <w:r>
+        <w:t xml:space="preserve"> $ </w:t>
+      </w:r>
+      <w:proofErr w:type="spellStart"/>
+      <w:r>
+        <w:t>sudo</w:t>
+      </w:r>
+      <w:proofErr w:type="spellEnd"/>
+      <w:r>
+        <w:t xml:space="preserve"> shutdown -h now</w:t>
       </w:r>
     </w:p>
     <w:p/>
     <w:p>
       <w:r>
-        <w:t>Broadcast message from root@Frequency on pts/1 (Wed 2025-04-23 20:49:50 CDT):</w:t>
+        <w:t xml:space="preserve">Broadcast message from </w:t>
+      </w:r>
+      <w:proofErr w:type="spellStart"/>
+      <w:r>
+        <w:t>root@Frequency</w:t>
+      </w:r>
+      <w:proofErr w:type="spellEnd"/>
+      <w:r>
+        <w:t xml:space="preserve"> on pts/1 (Wed 2025-04-23 20:49:50 CDT):</w:t>
       </w:r>
     </w:p>
     <w:p/>
@@ -1884,13 +2251,44 @@
         <w:rPr>
           <w:rFonts w:ascii="Calibri" w:hAnsi="Calibri" w:cs="Calibri"/>
         </w:rPr>
-        <w:t>Enable VNC Server with sudo raspi-config</w:t>
+        <w:t xml:space="preserve">Enable VNC Server with </w:t>
+      </w:r>
+      <w:proofErr w:type="spellStart"/>
+      <w:r>
+        <w:rPr>
+          <w:rFonts w:ascii="Calibri" w:hAnsi="Calibri" w:cs="Calibri"/>
+        </w:rPr>
+        <w:t>sudo</w:t>
+      </w:r>
+      <w:proofErr w:type="spellEnd"/>
+      <w:r>
+        <w:rPr>
+          <w:rFonts w:ascii="Calibri" w:hAnsi="Calibri" w:cs="Calibri"/>
+        </w:rPr>
+        <w:t xml:space="preserve"> </w:t>
+      </w:r>
+      <w:proofErr w:type="spellStart"/>
+      <w:r>
+        <w:rPr>
+          <w:rFonts w:ascii="Calibri" w:hAnsi="Calibri" w:cs="Calibri"/>
+        </w:rPr>
+        <w:t>raspi</w:t>
+      </w:r>
+      <w:proofErr w:type="spellEnd"/>
+      <w:r>
+        <w:rPr>
+          <w:rFonts w:ascii="Calibri" w:hAnsi="Calibri" w:cs="Calibri"/>
+        </w:rPr>
+        <w:t>-config</w:t>
       </w:r>
     </w:p>
     <w:p/>
     <w:p/>
     <w:p>
       <w:r>
+        <w:rPr>
+          <w:noProof/>
+        </w:rPr>
         <w:drawing>
           <wp:inline distT="0" distB="0" distL="0" distR="0" wp14:anchorId="3301522C" wp14:editId="06F4E692">
             <wp:extent cx="5131064" cy="3073558"/>
@@ -1931,20 +2329,67 @@
     <w:p/>
     <w:p/>
     <w:p>
-      <w:r>
-        <w:t>sudo apt install rtl-sdr sox git python3-pip screen</w:t>
+      <w:proofErr w:type="spellStart"/>
+      <w:r>
+        <w:t>sudo</w:t>
+      </w:r>
+      <w:proofErr w:type="spellEnd"/>
+      <w:r>
+        <w:t xml:space="preserve"> apt install </w:t>
+      </w:r>
+      <w:proofErr w:type="spellStart"/>
+      <w:r>
+        <w:t>rtl-sdr</w:t>
+      </w:r>
+      <w:proofErr w:type="spellEnd"/>
+      <w:r>
+        <w:t xml:space="preserve"> sox git python3-pip screen</w:t>
       </w:r>
     </w:p>
     <w:p/>
     <w:p>
       <w:r>
-        <w:t>echo 'blacklist dvb_usb_rtl28xxu' | sudo tee /etc/modprobe.d/no-rtl.conf</w:t>
-      </w:r>
+        <w:t xml:space="preserve">echo 'blacklist dvb_usb_rtl28xxu' | </w:t>
+      </w:r>
+      <w:proofErr w:type="spellStart"/>
+      <w:r>
+        <w:t>sudo</w:t>
+      </w:r>
+      <w:proofErr w:type="spellEnd"/>
+      <w:r>
+        <w:t xml:space="preserve"> tee /</w:t>
+      </w:r>
+      <w:proofErr w:type="spellStart"/>
+      <w:r>
+        <w:t>etc</w:t>
+      </w:r>
+      <w:proofErr w:type="spellEnd"/>
+      <w:r>
+        <w:t>/</w:t>
+      </w:r>
+      <w:proofErr w:type="spellStart"/>
+      <w:r>
+        <w:t>modprobe.d</w:t>
+      </w:r>
+      <w:proofErr w:type="spellEnd"/>
+      <w:r>
+        <w:t>/no-</w:t>
+      </w:r>
+      <w:proofErr w:type="spellStart"/>
+      <w:r>
+        <w:t>rtl.conf</w:t>
+      </w:r>
+      <w:proofErr w:type="spellEnd"/>
     </w:p>
     <w:p/>
     <w:p>
-      <w:r>
-        <w:t>sudo reboot</w:t>
+      <w:proofErr w:type="spellStart"/>
+      <w:r>
+        <w:t>sudo</w:t>
+      </w:r>
+      <w:proofErr w:type="spellEnd"/>
+      <w:r>
+        <w:t xml:space="preserve"> reboot</w:t>
       </w:r>
     </w:p>
     <w:p/>
@@ -1956,31 +2401,75 @@
           <w:strike/>
         </w:rPr>
       </w:pPr>
+      <w:proofErr w:type="spellStart"/>
       <w:r>
         <w:rPr>
           <w:i/>
           <w:iCs/>
           <w:strike/>
         </w:rPr>
-        <w:t>rtl_power -f 440M:450M:25k -i 15s -e 1h traffic.csv</w:t>
-      </w:r>
-    </w:p>
-    <w:p>
+        <w:t>rtl_power</w:t>
+      </w:r>
+      <w:proofErr w:type="spellEnd"/>
+      <w:r>
+        <w:rPr>
+          <w:i/>
+          <w:iCs/>
+          <w:strike/>
+        </w:rPr>
+        <w:t xml:space="preserve"> -f 440M:450M:25k -</w:t>
+      </w:r>
+      <w:proofErr w:type="spellStart"/>
+      <w:r>
+        <w:rPr>
+          <w:i/>
+          <w:iCs/>
+          <w:strike/>
+        </w:rPr>
+        <w:t>i</w:t>
+      </w:r>
+      <w:proofErr w:type="spellEnd"/>
+      <w:r>
+        <w:rPr>
+          <w:i/>
+          <w:iCs/>
+          <w:strike/>
+        </w:rPr>
+        <w:t xml:space="preserve"> 15s -e 1h traffic.csv</w:t>
+      </w:r>
+    </w:p>
+    <w:p>
+      <w:proofErr w:type="spellStart"/>
       <w:r>
         <w:lastRenderedPageBreak/>
-        <w:t>rtl_power -f 4</w:t>
+        <w:t>rtl_power</w:t>
+      </w:r>
+      <w:proofErr w:type="spellEnd"/>
+      <w:r>
+        <w:t xml:space="preserve"> -f 4</w:t>
       </w:r>
       <w:r>
         <w:t>3</w:t>
       </w:r>
       <w:r>
-        <w:t>0M:450M:25k -i 15s -e 1h traffic.csv</w:t>
+        <w:t>0M:450M:25k -</w:t>
+      </w:r>
+      <w:proofErr w:type="spellStart"/>
+      <w:r>
+        <w:t>i</w:t>
+      </w:r>
+      <w:proofErr w:type="spellEnd"/>
+      <w:r>
+        <w:t xml:space="preserve"> 15s -e 1h traffic.csv</w:t>
       </w:r>
     </w:p>
     <w:p/>
     <w:p/>
     <w:p>
       <w:r>
+        <w:rPr>
+          <w:noProof/>
+        </w:rPr>
         <w:drawing>
           <wp:inline distT="0" distB="0" distL="0" distR="0" wp14:anchorId="47F25AFD" wp14:editId="0C4BDAF1">
             <wp:extent cx="5943600" cy="3181985"/>
@@ -2026,8 +2515,13 @@
     </w:p>
     <w:p/>
     <w:p>
-      <w:r>
-        <w:t>rtl_power -f 4</w:t>
+      <w:proofErr w:type="spellStart"/>
+      <w:r>
+        <w:t>rtl_power</w:t>
+      </w:r>
+      <w:proofErr w:type="spellEnd"/>
+      <w:r>
+        <w:t xml:space="preserve"> -f 4</w:t>
       </w:r>
       <w:r>
         <w:t>3</w:t>
@@ -2051,13 +2545,1736 @@
         <w:t>000</w:t>
       </w:r>
       <w:r>
-        <w:t xml:space="preserve"> -i 15s -e 1h traffic</w:t>
+        <w:t xml:space="preserve"> -</w:t>
+      </w:r>
+      <w:proofErr w:type="spellStart"/>
+      <w:r>
+        <w:t>i</w:t>
+      </w:r>
+      <w:proofErr w:type="spellEnd"/>
+      <w:r>
+        <w:t xml:space="preserve"> 15s -e 1h traffic</w:t>
       </w:r>
       <w:r>
         <w:t>2</w:t>
       </w:r>
       <w:r>
         <w:t>.csv</w:t>
+      </w:r>
+    </w:p>
+    <w:p/>
+    <w:p>
+      <w:r>
+        <w:br w:type="page"/>
+      </w:r>
+    </w:p>
+    <w:p>
+      <w:r>
+        <w:lastRenderedPageBreak/>
+        <w:t>04/25/25</w:t>
+      </w:r>
+    </w:p>
+    <w:p/>
+    <w:p>
+      <w:r>
+        <w:t xml:space="preserve">Cloned </w:t>
+      </w:r>
+      <w:r>
+        <w:t>Repository to Raspberry Pi</w:t>
+      </w:r>
+    </w:p>
+    <w:p/>
+    <w:p>
+      <w:r>
+        <w:t>Set up Data Directory Tree</w:t>
+      </w:r>
+    </w:p>
+    <w:p/>
+    <w:p>
+      <w:r>
+        <w:t>python3 heatmap.py bandlog.csv output.png</w:t>
+      </w:r>
+    </w:p>
+    <w:p/>
+    <w:p>
+      <w:r>
+        <w:t>traffic.csv</w:t>
+      </w:r>
+      <w:r>
+        <w:t xml:space="preserve">  </w:t>
+      </w:r>
+      <w:r>
+        <w:sym w:font="Wingdings" w:char="F0E0"/>
+      </w:r>
+      <w:r>
+        <w:t xml:space="preserve"> Traffic_Map.png</w:t>
+      </w:r>
+      <w:r>
+        <w:t xml:space="preserve">  </w:t>
+      </w:r>
+      <w:r>
+        <w:t xml:space="preserve">    </w:t>
+      </w:r>
+      <w:r>
+        <w:t xml:space="preserve">python3 heatmap.py </w:t>
+      </w:r>
+      <w:r>
+        <w:t>traffic</w:t>
+      </w:r>
+      <w:r>
+        <w:t xml:space="preserve">.csv </w:t>
+      </w:r>
+      <w:r>
+        <w:t>Traffic_Map.png</w:t>
+      </w:r>
+    </w:p>
+    <w:p/>
+    <w:p>
+      <w:r>
+        <w:t>heatmap.py': [</w:t>
+      </w:r>
+      <w:proofErr w:type="spellStart"/>
+      <w:r>
+        <w:t>Errno</w:t>
+      </w:r>
+      <w:proofErr w:type="spellEnd"/>
+      <w:r>
+        <w:t xml:space="preserve"> 2] No such file or directory</w:t>
+      </w:r>
+    </w:p>
+    <w:p/>
+    <w:p>
+      <w:r>
+        <w:t xml:space="preserve">Download heatmap.py to:  </w:t>
+      </w:r>
+    </w:p>
+    <w:p>
+      <w:r>
+        <w:t>cd ~/</w:t>
+      </w:r>
+      <w:proofErr w:type="spellStart"/>
+      <w:r>
+        <w:t>sdr</w:t>
+      </w:r>
+      <w:proofErr w:type="spellEnd"/>
+      <w:r>
+        <w:t>-monitor</w:t>
+      </w:r>
+    </w:p>
+    <w:p/>
+    <w:p>
+      <w:r>
+        <w:t>~/Documents/Repositories/D-Star/</w:t>
+      </w:r>
+      <w:proofErr w:type="spellStart"/>
+      <w:r>
+        <w:t>Frequency_Survey</w:t>
+      </w:r>
+      <w:proofErr w:type="spellEnd"/>
+      <w:r>
+        <w:t>/Data/2025_04_24</w:t>
+      </w:r>
+    </w:p>
+    <w:p>
+      <w:r>
+        <w:t>python3 heatmap.py logs/scan_2025-04-25_13-00.csv output/heatmap_2025-04-25_13-00.png</w:t>
+      </w:r>
+    </w:p>
+    <w:p/>
+    <w:p>
+      <w:pPr>
+        <w:rPr>
+          <w:b/>
+          <w:bCs/>
+          <w:color w:val="00B050"/>
+        </w:rPr>
+      </w:pPr>
+      <w:r>
+        <w:rPr>
+          <w:b/>
+          <w:bCs/>
+          <w:color w:val="00B050"/>
+        </w:rPr>
+        <w:t>cd ~/</w:t>
+      </w:r>
+      <w:proofErr w:type="spellStart"/>
+      <w:r>
+        <w:rPr>
+          <w:b/>
+          <w:bCs/>
+          <w:color w:val="00B050"/>
+        </w:rPr>
+        <w:t>sdr</w:t>
+      </w:r>
+      <w:proofErr w:type="spellEnd"/>
+      <w:r>
+        <w:rPr>
+          <w:b/>
+          <w:bCs/>
+          <w:color w:val="00B050"/>
+        </w:rPr>
+        <w:t>-monitor</w:t>
+      </w:r>
+    </w:p>
+    <w:p>
+      <w:pPr>
+        <w:rPr>
+          <w:b/>
+          <w:bCs/>
+          <w:color w:val="00B050"/>
+        </w:rPr>
+      </w:pPr>
+      <w:r>
+        <w:rPr>
+          <w:b/>
+          <w:bCs/>
+          <w:color w:val="00B050"/>
+        </w:rPr>
+        <w:t xml:space="preserve">python3 </w:t>
+      </w:r>
+      <w:proofErr w:type="gramStart"/>
+      <w:r>
+        <w:rPr>
+          <w:b/>
+          <w:bCs/>
+          <w:color w:val="00B050"/>
+        </w:rPr>
+        <w:t xml:space="preserve">heatmap.py  </w:t>
+      </w:r>
+      <w:r>
+        <w:rPr>
+          <w:b/>
+          <w:bCs/>
+          <w:color w:val="00B050"/>
+        </w:rPr>
+        <w:t>~</w:t>
+      </w:r>
+      <w:proofErr w:type="gramEnd"/>
+      <w:r>
+        <w:rPr>
+          <w:b/>
+          <w:bCs/>
+          <w:color w:val="00B050"/>
+        </w:rPr>
+        <w:t>/Documents/Repositories/D-Star/Frequency_Survey/Data/2025_04_24</w:t>
+      </w:r>
+      <w:r>
+        <w:rPr>
+          <w:b/>
+          <w:bCs/>
+          <w:color w:val="00B050"/>
+        </w:rPr>
+        <w:t>/traffic.csv</w:t>
+      </w:r>
+      <w:r>
+        <w:rPr>
+          <w:b/>
+          <w:bCs/>
+          <w:color w:val="00B050"/>
+        </w:rPr>
+        <w:t xml:space="preserve"> </w:t>
+      </w:r>
+      <w:r>
+        <w:rPr>
+          <w:b/>
+          <w:bCs/>
+          <w:color w:val="00B050"/>
+        </w:rPr>
+        <w:t>~/Documents/Repositories/D-Star/Frequency_Survey/Data/2025_04_24/</w:t>
+      </w:r>
+      <w:r>
+        <w:rPr>
+          <w:b/>
+          <w:bCs/>
+          <w:color w:val="00B050"/>
+        </w:rPr>
+        <w:t>Traffic_Map.png</w:t>
+      </w:r>
+    </w:p>
+    <w:p>
+      <w:pPr>
+        <w:rPr>
+          <w:b/>
+          <w:bCs/>
+          <w:color w:val="00B050"/>
+        </w:rPr>
+      </w:pPr>
+    </w:p>
+    <w:p>
+      <w:r>
+        <w:t>loading</w:t>
+      </w:r>
+    </w:p>
+    <w:p>
+      <w:r>
+        <w:t>x: 1025, y: 240, z: (-29.840000, -3.740000)</w:t>
+      </w:r>
+    </w:p>
+    <w:p>
+      <w:r>
+        <w:t>drawing</w:t>
+      </w:r>
+    </w:p>
+    <w:p>
+      <w:r>
+        <w:lastRenderedPageBreak/>
+        <w:t>labeling</w:t>
+      </w:r>
+    </w:p>
+    <w:p>
+      <w:r>
+        <w:t>/home/unicycle9312/</w:t>
+      </w:r>
+      <w:proofErr w:type="spellStart"/>
+      <w:r>
+        <w:t>sdr</w:t>
+      </w:r>
+      <w:proofErr w:type="spellEnd"/>
+      <w:r>
+        <w:t xml:space="preserve">-monitor/heatmap.py:470: </w:t>
+      </w:r>
+      <w:proofErr w:type="spellStart"/>
+      <w:r>
+        <w:t>DeprecationWarning</w:t>
+      </w:r>
+      <w:proofErr w:type="spellEnd"/>
+      <w:r>
+        <w:t xml:space="preserve">: </w:t>
+      </w:r>
+      <w:proofErr w:type="spellStart"/>
+      <w:r>
+        <w:t>getsize</w:t>
+      </w:r>
+      <w:proofErr w:type="spellEnd"/>
+      <w:r>
+        <w:t xml:space="preserve"> is deprecated and will be removed in Pillow 10 (2023-07-01). Use </w:t>
+      </w:r>
+      <w:proofErr w:type="spellStart"/>
+      <w:r>
+        <w:t>getbbox</w:t>
+      </w:r>
+      <w:proofErr w:type="spellEnd"/>
+      <w:r>
+        <w:t xml:space="preserve"> or </w:t>
+      </w:r>
+      <w:proofErr w:type="spellStart"/>
+      <w:r>
+        <w:t>getlength</w:t>
+      </w:r>
+      <w:proofErr w:type="spellEnd"/>
+      <w:r>
+        <w:t xml:space="preserve"> instead.</w:t>
+      </w:r>
+    </w:p>
+    <w:p>
+      <w:r>
+        <w:t xml:space="preserve">  s = </w:t>
+      </w:r>
+      <w:proofErr w:type="spellStart"/>
+      <w:proofErr w:type="gramStart"/>
+      <w:r>
+        <w:t>f.getsize</w:t>
+      </w:r>
+      <w:proofErr w:type="spellEnd"/>
+      <w:proofErr w:type="gramEnd"/>
+      <w:r>
+        <w:t>(label)</w:t>
+      </w:r>
+    </w:p>
+    <w:p>
+      <w:r>
+        <w:t>/home/unicycle9312/</w:t>
+      </w:r>
+      <w:proofErr w:type="spellStart"/>
+      <w:r>
+        <w:t>sdr</w:t>
+      </w:r>
+      <w:proofErr w:type="spellEnd"/>
+      <w:r>
+        <w:t xml:space="preserve">-monitor/heatmap.py:475: </w:t>
+      </w:r>
+      <w:proofErr w:type="spellStart"/>
+      <w:r>
+        <w:t>DeprecationWarning</w:t>
+      </w:r>
+      <w:proofErr w:type="spellEnd"/>
+      <w:r>
+        <w:t xml:space="preserve">: ANTIALIAS is deprecated and will be removed in Pillow 10 (2023-07-01). Use LANCZOS or </w:t>
+      </w:r>
+      <w:proofErr w:type="spellStart"/>
+      <w:r>
+        <w:t>Resampling.LANCZOS</w:t>
+      </w:r>
+      <w:proofErr w:type="spellEnd"/>
+      <w:r>
+        <w:t xml:space="preserve"> instead.</w:t>
+      </w:r>
+    </w:p>
+    <w:p>
+      <w:r>
+        <w:t xml:space="preserve">  return </w:t>
+      </w:r>
+      <w:proofErr w:type="spellStart"/>
+      <w:r>
+        <w:t>w_</w:t>
+      </w:r>
+      <w:proofErr w:type="gramStart"/>
+      <w:r>
+        <w:t>img.resize</w:t>
+      </w:r>
+      <w:proofErr w:type="spellEnd"/>
+      <w:proofErr w:type="gramEnd"/>
+      <w:r>
+        <w:t>((</w:t>
+      </w:r>
+      <w:proofErr w:type="gramStart"/>
+      <w:r>
+        <w:t>s[0]/</w:t>
+      </w:r>
+      <w:proofErr w:type="gramEnd"/>
+      <w:r>
+        <w:t xml:space="preserve">/3, </w:t>
+      </w:r>
+      <w:proofErr w:type="gramStart"/>
+      <w:r>
+        <w:t>s[</w:t>
+      </w:r>
+      <w:proofErr w:type="gramEnd"/>
+      <w:r>
+        <w:t xml:space="preserve">1]//3), </w:t>
+      </w:r>
+      <w:proofErr w:type="spellStart"/>
+      <w:r>
+        <w:t>Image.ANTIALIAS</w:t>
+      </w:r>
+      <w:proofErr w:type="spellEnd"/>
+      <w:r>
+        <w:t>)</w:t>
+      </w:r>
+    </w:p>
+    <w:p>
+      <w:r>
+        <w:t>saving</w:t>
+      </w:r>
+    </w:p>
+    <w:p/>
+    <w:p/>
+    <w:p>
+      <w:r>
+        <w:t>traffic2.csv</w:t>
+      </w:r>
+      <w:r>
+        <w:t xml:space="preserve"> </w:t>
+      </w:r>
+      <w:r>
+        <w:sym w:font="Wingdings" w:char="F0E0"/>
+      </w:r>
+      <w:r>
+        <w:t xml:space="preserve"> Traffic_Map</w:t>
+      </w:r>
+      <w:r>
+        <w:t>2</w:t>
+      </w:r>
+      <w:r>
+        <w:t>.png</w:t>
+      </w:r>
+    </w:p>
+    <w:p/>
+    <w:p>
+      <w:pPr>
+        <w:rPr>
+          <w:b/>
+          <w:bCs/>
+          <w:color w:val="00B050"/>
+        </w:rPr>
+      </w:pPr>
+      <w:r>
+        <w:rPr>
+          <w:b/>
+          <w:bCs/>
+          <w:color w:val="00B050"/>
+        </w:rPr>
+        <w:t xml:space="preserve">python3 </w:t>
+      </w:r>
+      <w:proofErr w:type="gramStart"/>
+      <w:r>
+        <w:rPr>
+          <w:b/>
+          <w:bCs/>
+          <w:color w:val="00B050"/>
+        </w:rPr>
+        <w:t>heatmap.py  ~</w:t>
+      </w:r>
+      <w:proofErr w:type="gramEnd"/>
+      <w:r>
+        <w:rPr>
+          <w:b/>
+          <w:bCs/>
+          <w:color w:val="00B050"/>
+        </w:rPr>
+        <w:t>/Documents/Repositories/D-Star/Frequency_Survey/Data/2025_04_24/traffic</w:t>
+      </w:r>
+      <w:r>
+        <w:rPr>
+          <w:b/>
+          <w:bCs/>
+          <w:color w:val="00B050"/>
+        </w:rPr>
+        <w:t>2</w:t>
+      </w:r>
+      <w:r>
+        <w:rPr>
+          <w:b/>
+          <w:bCs/>
+          <w:color w:val="00B050"/>
+        </w:rPr>
+        <w:t>.csv ~/Documents/Repositories/D-Star/Frequency_Survey/Data/2025_04_24/Traffic_Map</w:t>
+      </w:r>
+      <w:r>
+        <w:rPr>
+          <w:b/>
+          <w:bCs/>
+          <w:color w:val="00B050"/>
+        </w:rPr>
+        <w:t>2</w:t>
+      </w:r>
+      <w:r>
+        <w:rPr>
+          <w:b/>
+          <w:bCs/>
+          <w:color w:val="00B050"/>
+        </w:rPr>
+        <w:t>.png</w:t>
+      </w:r>
+    </w:p>
+    <w:p/>
+    <w:p>
+      <w:r>
+        <w:drawing>
+          <wp:inline distT="0" distB="0" distL="0" distR="0" wp14:anchorId="7CDF07F4" wp14:editId="611F6A90">
+            <wp:extent cx="5943600" cy="1537970"/>
+            <wp:effectExtent l="0" t="0" r="0" b="5080"/>
+            <wp:docPr id="443427444" name="Picture 1" descr="A yellow tape measure over a black and blue background&#10;&#10;AI-generated content may be incorrect."/>
+            <wp:cNvGraphicFramePr>
+              <a:graphicFrameLocks xmlns:a="http://schemas.openxmlformats.org/drawingml/2006/main" noChangeAspect="1"/>
+            </wp:cNvGraphicFramePr>
+            <a:graphic xmlns:a="http://schemas.openxmlformats.org/drawingml/2006/main">
+              <a:graphicData uri="http://schemas.openxmlformats.org/drawingml/2006/picture">
+                <pic:pic xmlns:pic="http://schemas.openxmlformats.org/drawingml/2006/picture">
+                  <pic:nvPicPr>
+                    <pic:cNvPr id="443427444" name="Picture 1" descr="A yellow tape measure over a black and blue background&#10;&#10;AI-generated content may be incorrect."/>
+                    <pic:cNvPicPr/>
+                  </pic:nvPicPr>
+                  <pic:blipFill>
+                    <a:blip r:embed="rId20"/>
+                    <a:stretch>
+                      <a:fillRect/>
+                    </a:stretch>
+                  </pic:blipFill>
+                  <pic:spPr>
+                    <a:xfrm>
+                      <a:off x="0" y="0"/>
+                      <a:ext cx="5943600" cy="1537970"/>
+                    </a:xfrm>
+                    <a:prstGeom prst="rect">
+                      <a:avLst/>
+                    </a:prstGeom>
+                  </pic:spPr>
+                </pic:pic>
+              </a:graphicData>
+            </a:graphic>
+          </wp:inline>
+        </w:drawing>
+      </w:r>
+    </w:p>
+    <w:p/>
+    <w:p>
+      <w:r>
+        <w:lastRenderedPageBreak/>
+        <w:drawing>
+          <wp:inline distT="0" distB="0" distL="0" distR="0" wp14:anchorId="49594325" wp14:editId="45E9794E">
+            <wp:extent cx="5943600" cy="1537970"/>
+            <wp:effectExtent l="0" t="0" r="0" b="5080"/>
+            <wp:docPr id="2089292710" name="Picture 1" descr="A yellow tape measure over a black and blue background&#10;&#10;AI-generated content may be incorrect."/>
+            <wp:cNvGraphicFramePr>
+              <a:graphicFrameLocks xmlns:a="http://schemas.openxmlformats.org/drawingml/2006/main" noChangeAspect="1"/>
+            </wp:cNvGraphicFramePr>
+            <a:graphic xmlns:a="http://schemas.openxmlformats.org/drawingml/2006/main">
+              <a:graphicData uri="http://schemas.openxmlformats.org/drawingml/2006/picture">
+                <pic:pic xmlns:pic="http://schemas.openxmlformats.org/drawingml/2006/picture">
+                  <pic:nvPicPr>
+                    <pic:cNvPr id="2089292710" name="Picture 1" descr="A yellow tape measure over a black and blue background&#10;&#10;AI-generated content may be incorrect."/>
+                    <pic:cNvPicPr/>
+                  </pic:nvPicPr>
+                  <pic:blipFill>
+                    <a:blip r:embed="rId21"/>
+                    <a:stretch>
+                      <a:fillRect/>
+                    </a:stretch>
+                  </pic:blipFill>
+                  <pic:spPr>
+                    <a:xfrm>
+                      <a:off x="0" y="0"/>
+                      <a:ext cx="5943600" cy="1537970"/>
+                    </a:xfrm>
+                    <a:prstGeom prst="rect">
+                      <a:avLst/>
+                    </a:prstGeom>
+                  </pic:spPr>
+                </pic:pic>
+              </a:graphicData>
+            </a:graphic>
+          </wp:inline>
+        </w:drawing>
+      </w:r>
+    </w:p>
+    <w:p/>
+    <w:p/>
+    <w:p>
+      <w:r>
+        <w:t>Absolutely — let’s take a closer look at your two heatmaps and interpret what’s happening across the 70</w:t>
+      </w:r>
+      <w:r>
+        <w:rPr>
+          <w:rFonts w:ascii="Arial" w:hAnsi="Arial" w:cs="Arial"/>
+        </w:rPr>
+        <w:t> </w:t>
+      </w:r>
+      <w:r>
+        <w:t>cm band (430</w:t>
+      </w:r>
+      <w:r>
+        <w:rPr>
+          <w:rFonts w:ascii="Aptos" w:hAnsi="Aptos" w:cs="Aptos"/>
+        </w:rPr>
+        <w:t>–</w:t>
+      </w:r>
+      <w:r>
+        <w:t>450</w:t>
+      </w:r>
+      <w:r>
+        <w:rPr>
+          <w:rFonts w:ascii="Arial" w:hAnsi="Arial" w:cs="Arial"/>
+        </w:rPr>
+        <w:t> </w:t>
+      </w:r>
+      <w:r>
+        <w:t>MHz).</w:t>
+      </w:r>
+    </w:p>
+    <w:p>
+      <w:r>
+        <w:pict w14:anchorId="627EC8F2">
+          <v:rect id="_x0000_i1025" style="width:0;height:1.5pt" o:hralign="center" o:hrstd="t" o:hr="t" fillcolor="#a0a0a0" stroked="f"/>
+        </w:pict>
+      </w:r>
+    </w:p>
+    <w:p>
+      <w:pPr>
+        <w:rPr>
+          <w:b/>
+          <w:bCs/>
+        </w:rPr>
+      </w:pPr>
+      <w:r>
+        <w:rPr>
+          <w:rFonts w:ascii="Segoe UI Emoji" w:hAnsi="Segoe UI Emoji" w:cs="Segoe UI Emoji"/>
+          <w:b/>
+          <w:bCs/>
+        </w:rPr>
+        <w:t>🛰️</w:t>
+      </w:r>
+      <w:r>
+        <w:rPr>
+          <w:b/>
+          <w:bCs/>
+        </w:rPr>
+        <w:t xml:space="preserve"> Overview of Your Heatmaps</w:t>
+      </w:r>
+    </w:p>
+    <w:p>
+      <w:pPr>
+        <w:rPr>
+          <w:b/>
+          <w:bCs/>
+        </w:rPr>
+      </w:pPr>
+      <w:r>
+        <w:rPr>
+          <w:b/>
+          <w:bCs/>
+        </w:rPr>
+        <w:t>Common Settings</w:t>
+      </w:r>
+    </w:p>
+    <w:p>
+      <w:pPr>
+        <w:numPr>
+          <w:ilvl w:val="0"/>
+          <w:numId w:val="8"/>
+        </w:numPr>
+      </w:pPr>
+      <w:r>
+        <w:rPr>
+          <w:b/>
+          <w:bCs/>
+        </w:rPr>
+        <w:t>Scan range:</w:t>
+      </w:r>
+      <w:r>
+        <w:t xml:space="preserve"> 430.000</w:t>
+      </w:r>
+      <w:r>
+        <w:rPr>
+          <w:rFonts w:ascii="Arial" w:hAnsi="Arial" w:cs="Arial"/>
+        </w:rPr>
+        <w:t> </w:t>
+      </w:r>
+      <w:r>
+        <w:t>MHz to 450.000</w:t>
+      </w:r>
+      <w:r>
+        <w:rPr>
+          <w:rFonts w:ascii="Arial" w:hAnsi="Arial" w:cs="Arial"/>
+        </w:rPr>
+        <w:t> </w:t>
+      </w:r>
+      <w:r>
+        <w:t>MHz (full 70</w:t>
+      </w:r>
+      <w:r>
+        <w:rPr>
+          <w:rFonts w:ascii="Arial" w:hAnsi="Arial" w:cs="Arial"/>
+        </w:rPr>
+        <w:t> </w:t>
+      </w:r>
+      <w:r>
+        <w:t>cm band)</w:t>
+      </w:r>
+    </w:p>
+    <w:p>
+      <w:pPr>
+        <w:numPr>
+          <w:ilvl w:val="0"/>
+          <w:numId w:val="8"/>
+        </w:numPr>
+      </w:pPr>
+      <w:r>
+        <w:rPr>
+          <w:b/>
+          <w:bCs/>
+        </w:rPr>
+        <w:t>Step:</w:t>
+      </w:r>
+      <w:r>
+        <w:t xml:space="preserve"> 25</w:t>
+      </w:r>
+      <w:r>
+        <w:rPr>
+          <w:rFonts w:ascii="Arial" w:hAnsi="Arial" w:cs="Arial"/>
+        </w:rPr>
+        <w:t> </w:t>
+      </w:r>
+      <w:r>
+        <w:t>kHz</w:t>
+      </w:r>
+    </w:p>
+    <w:p>
+      <w:pPr>
+        <w:numPr>
+          <w:ilvl w:val="0"/>
+          <w:numId w:val="8"/>
+        </w:numPr>
+      </w:pPr>
+      <w:r>
+        <w:rPr>
+          <w:b/>
+          <w:bCs/>
+        </w:rPr>
+        <w:t>Time per row:</w:t>
+      </w:r>
+      <w:r>
+        <w:t xml:space="preserve"> 15</w:t>
+      </w:r>
+      <w:r>
+        <w:rPr>
+          <w:rFonts w:ascii="Arial" w:hAnsi="Arial" w:cs="Arial"/>
+        </w:rPr>
+        <w:t> </w:t>
+      </w:r>
+      <w:r>
+        <w:t>s</w:t>
+      </w:r>
+    </w:p>
+    <w:p>
+      <w:pPr>
+        <w:numPr>
+          <w:ilvl w:val="0"/>
+          <w:numId w:val="8"/>
+        </w:numPr>
+      </w:pPr>
+      <w:r>
+        <w:rPr>
+          <w:b/>
+          <w:bCs/>
+        </w:rPr>
+        <w:t>Duration:</w:t>
+      </w:r>
+      <w:r>
+        <w:t xml:space="preserve"> ~15 minutes (judging by the vertical dimension)</w:t>
+      </w:r>
+    </w:p>
+    <w:p>
+      <w:r>
+        <w:pict w14:anchorId="34EFE1ED">
+          <v:rect id="_x0000_i1026" style="width:0;height:1.5pt" o:hralign="center" o:hrstd="t" o:hr="t" fillcolor="#a0a0a0" stroked="f"/>
+        </w:pict>
+      </w:r>
+    </w:p>
+    <w:p>
+      <w:pPr>
+        <w:rPr>
+          <w:b/>
+          <w:bCs/>
+        </w:rPr>
+      </w:pPr>
+      <w:r>
+        <w:rPr>
+          <w:rFonts w:ascii="Segoe UI Emoji" w:hAnsi="Segoe UI Emoji" w:cs="Segoe UI Emoji"/>
+          <w:b/>
+          <w:bCs/>
+        </w:rPr>
+        <w:t>🔍</w:t>
+      </w:r>
+      <w:r>
+        <w:rPr>
+          <w:b/>
+          <w:bCs/>
+        </w:rPr>
+        <w:t xml:space="preserve"> First Heatmap (Traffic_Map.png)</w:t>
+      </w:r>
+    </w:p>
+    <w:p>
+      <w:r>
+        <w:rPr>
+          <w:b/>
+          <w:bCs/>
+        </w:rPr>
+        <w:t>Start time:</w:t>
+      </w:r>
+      <w:r>
+        <w:t xml:space="preserve"> 2025-04-24 13:45:57</w:t>
+      </w:r>
+    </w:p>
+    <w:p>
+      <w:pPr>
+        <w:rPr>
+          <w:b/>
+          <w:bCs/>
+        </w:rPr>
+      </w:pPr>
+      <w:r>
+        <w:rPr>
+          <w:rFonts w:ascii="Segoe UI Emoji" w:hAnsi="Segoe UI Emoji" w:cs="Segoe UI Emoji"/>
+          <w:b/>
+          <w:bCs/>
+        </w:rPr>
+        <w:t>🔦</w:t>
+      </w:r>
+      <w:r>
+        <w:rPr>
+          <w:b/>
+          <w:bCs/>
+        </w:rPr>
+        <w:t xml:space="preserve"> Observations:</w:t>
+      </w:r>
+    </w:p>
+    <w:p>
+      <w:pPr>
+        <w:numPr>
+          <w:ilvl w:val="0"/>
+          <w:numId w:val="9"/>
+        </w:numPr>
+      </w:pPr>
+      <w:r>
+        <w:rPr>
+          <w:b/>
+          <w:bCs/>
+        </w:rPr>
+        <w:t>430–439</w:t>
+      </w:r>
+      <w:r>
+        <w:rPr>
+          <w:rFonts w:ascii="Arial" w:hAnsi="Arial" w:cs="Arial"/>
+          <w:b/>
+          <w:bCs/>
+        </w:rPr>
+        <w:t> </w:t>
+      </w:r>
+      <w:r>
+        <w:rPr>
+          <w:b/>
+          <w:bCs/>
+        </w:rPr>
+        <w:t>MHz:</w:t>
+      </w:r>
+      <w:r>
+        <w:t xml:space="preserve"> Strong and continuous activity. The bright yellow vertical bars indicate persistent transmissions.</w:t>
+      </w:r>
+    </w:p>
+    <w:p>
+      <w:pPr>
+        <w:numPr>
+          <w:ilvl w:val="1"/>
+          <w:numId w:val="9"/>
+        </w:numPr>
+      </w:pPr>
+      <w:r>
+        <w:t>Likely candidates: digital trunked systems, control channels, or repeated emissions.</w:t>
+      </w:r>
+    </w:p>
+    <w:p>
+      <w:pPr>
+        <w:numPr>
+          <w:ilvl w:val="0"/>
+          <w:numId w:val="9"/>
+        </w:numPr>
+      </w:pPr>
+      <w:r>
+        <w:rPr>
+          <w:b/>
+          <w:bCs/>
+        </w:rPr>
+        <w:t>440–445</w:t>
+      </w:r>
+      <w:r>
+        <w:rPr>
+          <w:rFonts w:ascii="Arial" w:hAnsi="Arial" w:cs="Arial"/>
+          <w:b/>
+          <w:bCs/>
+        </w:rPr>
+        <w:t> </w:t>
+      </w:r>
+      <w:r>
+        <w:rPr>
+          <w:b/>
+          <w:bCs/>
+        </w:rPr>
+        <w:t>MHz:</w:t>
+      </w:r>
+      <w:r>
+        <w:t xml:space="preserve"> Sparse activity. Most of this region is dark, suggesting it's mostly unused.</w:t>
+      </w:r>
+    </w:p>
+    <w:p>
+      <w:pPr>
+        <w:numPr>
+          <w:ilvl w:val="0"/>
+          <w:numId w:val="9"/>
+        </w:numPr>
+      </w:pPr>
+      <w:r>
+        <w:rPr>
+          <w:b/>
+          <w:bCs/>
+        </w:rPr>
+        <w:lastRenderedPageBreak/>
+        <w:t>Around 446</w:t>
+      </w:r>
+      <w:r>
+        <w:rPr>
+          <w:rFonts w:ascii="Arial" w:hAnsi="Arial" w:cs="Arial"/>
+          <w:b/>
+          <w:bCs/>
+        </w:rPr>
+        <w:t> </w:t>
+      </w:r>
+      <w:r>
+        <w:rPr>
+          <w:b/>
+          <w:bCs/>
+        </w:rPr>
+        <w:t>MHz:</w:t>
+      </w:r>
+      <w:r>
+        <w:t xml:space="preserve"> A narrow vertical stripe of medium-brightness — possibly a D-Star repeater or another narrowband digital signal.</w:t>
+      </w:r>
+    </w:p>
+    <w:p>
+      <w:pPr>
+        <w:numPr>
+          <w:ilvl w:val="0"/>
+          <w:numId w:val="9"/>
+        </w:numPr>
+      </w:pPr>
+      <w:r>
+        <w:rPr>
+          <w:b/>
+          <w:bCs/>
+        </w:rPr>
+        <w:t>449–450</w:t>
+      </w:r>
+      <w:r>
+        <w:rPr>
+          <w:rFonts w:ascii="Arial" w:hAnsi="Arial" w:cs="Arial"/>
+          <w:b/>
+          <w:bCs/>
+        </w:rPr>
+        <w:t> </w:t>
+      </w:r>
+      <w:r>
+        <w:rPr>
+          <w:b/>
+          <w:bCs/>
+        </w:rPr>
+        <w:t>MHz:</w:t>
+      </w:r>
+      <w:r>
+        <w:t xml:space="preserve"> Mostly quiet.</w:t>
+      </w:r>
+    </w:p>
+    <w:p>
+      <w:r>
+        <w:pict w14:anchorId="71BB1E28">
+          <v:rect id="_x0000_i1027" style="width:0;height:1.5pt" o:hralign="center" o:hrstd="t" o:hr="t" fillcolor="#a0a0a0" stroked="f"/>
+        </w:pict>
+      </w:r>
+    </w:p>
+    <w:p>
+      <w:pPr>
+        <w:rPr>
+          <w:b/>
+          <w:bCs/>
+        </w:rPr>
+      </w:pPr>
+      <w:r>
+        <w:rPr>
+          <w:rFonts w:ascii="Segoe UI Emoji" w:hAnsi="Segoe UI Emoji" w:cs="Segoe UI Emoji"/>
+          <w:b/>
+          <w:bCs/>
+        </w:rPr>
+        <w:t>🔍</w:t>
+      </w:r>
+      <w:r>
+        <w:rPr>
+          <w:b/>
+          <w:bCs/>
+        </w:rPr>
+        <w:t xml:space="preserve"> Second Heatmap (Traffic_Map2.png)</w:t>
+      </w:r>
+    </w:p>
+    <w:p>
+      <w:r>
+        <w:rPr>
+          <w:b/>
+          <w:bCs/>
+        </w:rPr>
+        <w:t>Start time:</w:t>
+      </w:r>
+      <w:r>
+        <w:t xml:space="preserve"> 2025-04-24 14:52:08 (a little over an hour later)</w:t>
+      </w:r>
+    </w:p>
+    <w:p>
+      <w:pPr>
+        <w:rPr>
+          <w:b/>
+          <w:bCs/>
+        </w:rPr>
+      </w:pPr>
+      <w:r>
+        <w:rPr>
+          <w:rFonts w:ascii="Segoe UI Emoji" w:hAnsi="Segoe UI Emoji" w:cs="Segoe UI Emoji"/>
+          <w:b/>
+          <w:bCs/>
+        </w:rPr>
+        <w:t>🔦</w:t>
+      </w:r>
+      <w:r>
+        <w:rPr>
+          <w:b/>
+          <w:bCs/>
+        </w:rPr>
+        <w:t xml:space="preserve"> Observations:</w:t>
+      </w:r>
+    </w:p>
+    <w:p>
+      <w:pPr>
+        <w:numPr>
+          <w:ilvl w:val="0"/>
+          <w:numId w:val="10"/>
+        </w:numPr>
+      </w:pPr>
+      <w:r>
+        <w:t>Nearly identical pattern to the first one:</w:t>
+      </w:r>
+    </w:p>
+    <w:p>
+      <w:pPr>
+        <w:numPr>
+          <w:ilvl w:val="1"/>
+          <w:numId w:val="10"/>
+        </w:numPr>
+      </w:pPr>
+      <w:r>
+        <w:rPr>
+          <w:b/>
+          <w:bCs/>
+        </w:rPr>
+        <w:t>430–439</w:t>
+      </w:r>
+      <w:r>
+        <w:rPr>
+          <w:rFonts w:ascii="Arial" w:hAnsi="Arial" w:cs="Arial"/>
+          <w:b/>
+          <w:bCs/>
+        </w:rPr>
+        <w:t> </w:t>
+      </w:r>
+      <w:r>
+        <w:rPr>
+          <w:b/>
+          <w:bCs/>
+        </w:rPr>
+        <w:t>MHz:</w:t>
+      </w:r>
+      <w:r>
+        <w:t xml:space="preserve"> Same consistent, high-strength usage.</w:t>
+      </w:r>
+    </w:p>
+    <w:p>
+      <w:pPr>
+        <w:numPr>
+          <w:ilvl w:val="1"/>
+          <w:numId w:val="10"/>
+        </w:numPr>
+      </w:pPr>
+      <w:r>
+        <w:rPr>
+          <w:b/>
+          <w:bCs/>
+        </w:rPr>
+        <w:t>441–445</w:t>
+      </w:r>
+      <w:r>
+        <w:rPr>
+          <w:rFonts w:ascii="Arial" w:hAnsi="Arial" w:cs="Arial"/>
+          <w:b/>
+          <w:bCs/>
+        </w:rPr>
+        <w:t> </w:t>
+      </w:r>
+      <w:r>
+        <w:rPr>
+          <w:b/>
+          <w:bCs/>
+        </w:rPr>
+        <w:t>MHz:</w:t>
+      </w:r>
+      <w:r>
+        <w:t xml:space="preserve"> Still mostly unused.</w:t>
+      </w:r>
+    </w:p>
+    <w:p>
+      <w:pPr>
+        <w:numPr>
+          <w:ilvl w:val="1"/>
+          <w:numId w:val="10"/>
+        </w:numPr>
+      </w:pPr>
+      <w:r>
+        <w:rPr>
+          <w:b/>
+          <w:bCs/>
+        </w:rPr>
+        <w:t>446</w:t>
+      </w:r>
+      <w:r>
+        <w:rPr>
+          <w:rFonts w:ascii="Arial" w:hAnsi="Arial" w:cs="Arial"/>
+          <w:b/>
+          <w:bCs/>
+        </w:rPr>
+        <w:t> </w:t>
+      </w:r>
+      <w:r>
+        <w:rPr>
+          <w:b/>
+          <w:bCs/>
+        </w:rPr>
+        <w:t>MHz:</w:t>
+      </w:r>
+      <w:r>
+        <w:t xml:space="preserve"> Still present — consistent signal, likely a repeater.</w:t>
+      </w:r>
+    </w:p>
+    <w:p>
+      <w:pPr>
+        <w:numPr>
+          <w:ilvl w:val="1"/>
+          <w:numId w:val="10"/>
+        </w:numPr>
+      </w:pPr>
+      <w:r>
+        <w:rPr>
+          <w:b/>
+          <w:bCs/>
+        </w:rPr>
+        <w:t>No major new signals</w:t>
+      </w:r>
+      <w:r>
+        <w:t xml:space="preserve">, suggesting low variation in traffic during this </w:t>
+      </w:r>
+      <w:proofErr w:type="gramStart"/>
+      <w:r>
+        <w:t>time period</w:t>
+      </w:r>
+      <w:proofErr w:type="gramEnd"/>
+      <w:r>
+        <w:t>.</w:t>
+      </w:r>
+    </w:p>
+    <w:p>
+      <w:r>
+        <w:pict w14:anchorId="3280D54D">
+          <v:rect id="_x0000_i1028" style="width:0;height:1.5pt" o:hralign="center" o:hrstd="t" o:hr="t" fillcolor="#a0a0a0" stroked="f"/>
+        </w:pict>
+      </w:r>
+    </w:p>
+    <w:p>
+      <w:pPr>
+        <w:rPr>
+          <w:b/>
+          <w:bCs/>
+        </w:rPr>
+      </w:pPr>
+      <w:r>
+        <w:rPr>
+          <w:rFonts w:ascii="Segoe UI Emoji" w:hAnsi="Segoe UI Emoji" w:cs="Segoe UI Emoji"/>
+          <w:b/>
+          <w:bCs/>
+        </w:rPr>
+        <w:t>🧠</w:t>
+      </w:r>
+      <w:r>
+        <w:rPr>
+          <w:b/>
+          <w:bCs/>
+        </w:rPr>
+        <w:t xml:space="preserve"> Interpretation Summary</w:t>
+      </w:r>
+    </w:p>
+    <w:tbl>
+      <w:tblPr>
+        <w:tblW w:w="0" w:type="auto"/>
+        <w:tblCellSpacing w:w="15" w:type="dxa"/>
+        <w:tblCellMar>
+          <w:top w:w="15" w:type="dxa"/>
+          <w:left w:w="15" w:type="dxa"/>
+          <w:bottom w:w="15" w:type="dxa"/>
+          <w:right w:w="15" w:type="dxa"/>
+        </w:tblCellMar>
+        <w:tblLook w:val="04A0" w:firstRow="1" w:lastRow="0" w:firstColumn="1" w:lastColumn="0" w:noHBand="0" w:noVBand="1"/>
+      </w:tblPr>
+      <w:tblGrid>
+        <w:gridCol w:w="1760"/>
+        <w:gridCol w:w="2095"/>
+        <w:gridCol w:w="5505"/>
+      </w:tblGrid>
+      <w:tr>
+        <w:trPr>
+          <w:tblHeader/>
+          <w:tblCellSpacing w:w="15" w:type="dxa"/>
+        </w:trPr>
+        <w:tc>
+          <w:tcPr>
+            <w:tcW w:w="0" w:type="auto"/>
+            <w:vAlign w:val="center"/>
+            <w:hideMark/>
+          </w:tcPr>
+          <w:p>
+            <w:pPr>
+              <w:rPr>
+                <w:b/>
+                <w:bCs/>
+              </w:rPr>
+            </w:pPr>
+            <w:r>
+              <w:rPr>
+                <w:b/>
+                <w:bCs/>
+              </w:rPr>
+              <w:t>Frequency Band</w:t>
+            </w:r>
+          </w:p>
+        </w:tc>
+        <w:tc>
+          <w:tcPr>
+            <w:tcW w:w="0" w:type="auto"/>
+            <w:vAlign w:val="center"/>
+            <w:hideMark/>
+          </w:tcPr>
+          <w:p>
+            <w:pPr>
+              <w:rPr>
+                <w:b/>
+                <w:bCs/>
+              </w:rPr>
+            </w:pPr>
+            <w:r>
+              <w:rPr>
+                <w:b/>
+                <w:bCs/>
+              </w:rPr>
+              <w:t>Activity</w:t>
+            </w:r>
+          </w:p>
+        </w:tc>
+        <w:tc>
+          <w:tcPr>
+            <w:tcW w:w="0" w:type="auto"/>
+            <w:vAlign w:val="center"/>
+            <w:hideMark/>
+          </w:tcPr>
+          <w:p>
+            <w:pPr>
+              <w:rPr>
+                <w:b/>
+                <w:bCs/>
+              </w:rPr>
+            </w:pPr>
+            <w:r>
+              <w:rPr>
+                <w:b/>
+                <w:bCs/>
+              </w:rPr>
+              <w:t>Likely Use</w:t>
+            </w:r>
+          </w:p>
+        </w:tc>
+      </w:tr>
+      <w:tr>
+        <w:trPr>
+          <w:tblCellSpacing w:w="15" w:type="dxa"/>
+        </w:trPr>
+        <w:tc>
+          <w:tcPr>
+            <w:tcW w:w="0" w:type="auto"/>
+            <w:vAlign w:val="center"/>
+            <w:hideMark/>
+          </w:tcPr>
+          <w:p>
+            <w:r>
+              <w:rPr>
+                <w:b/>
+                <w:bCs/>
+              </w:rPr>
+              <w:t>430–439 MHz</w:t>
+            </w:r>
+          </w:p>
+        </w:tc>
+        <w:tc>
+          <w:tcPr>
+            <w:tcW w:w="0" w:type="auto"/>
+            <w:vAlign w:val="center"/>
+            <w:hideMark/>
+          </w:tcPr>
+          <w:p>
+            <w:r>
+              <w:t>Very active</w:t>
+            </w:r>
+          </w:p>
+        </w:tc>
+        <w:tc>
+          <w:tcPr>
+            <w:tcW w:w="0" w:type="auto"/>
+            <w:vAlign w:val="center"/>
+            <w:hideMark/>
+          </w:tcPr>
+          <w:p>
+            <w:r>
+              <w:t>Control/data channels, trunked digital, maybe P25 or DMR</w:t>
+            </w:r>
+          </w:p>
+        </w:tc>
+      </w:tr>
+      <w:tr>
+        <w:trPr>
+          <w:tblCellSpacing w:w="15" w:type="dxa"/>
+        </w:trPr>
+        <w:tc>
+          <w:tcPr>
+            <w:tcW w:w="0" w:type="auto"/>
+            <w:vAlign w:val="center"/>
+            <w:hideMark/>
+          </w:tcPr>
+          <w:p>
+            <w:r>
+              <w:rPr>
+                <w:b/>
+                <w:bCs/>
+              </w:rPr>
+              <w:t>440–445 MHz</w:t>
+            </w:r>
+          </w:p>
+        </w:tc>
+        <w:tc>
+          <w:tcPr>
+            <w:tcW w:w="0" w:type="auto"/>
+            <w:vAlign w:val="center"/>
+            <w:hideMark/>
+          </w:tcPr>
+          <w:p>
+            <w:r>
+              <w:t>Mostly quiet</w:t>
+            </w:r>
+          </w:p>
+        </w:tc>
+        <w:tc>
+          <w:tcPr>
+            <w:tcW w:w="0" w:type="auto"/>
+            <w:vAlign w:val="center"/>
+            <w:hideMark/>
+          </w:tcPr>
+          <w:p>
+            <w:r>
+              <w:t>Candidate for simplex or custom experiments</w:t>
+            </w:r>
+          </w:p>
+        </w:tc>
+      </w:tr>
+      <w:tr>
+        <w:trPr>
+          <w:tblCellSpacing w:w="15" w:type="dxa"/>
+        </w:trPr>
+        <w:tc>
+          <w:tcPr>
+            <w:tcW w:w="0" w:type="auto"/>
+            <w:vAlign w:val="center"/>
+            <w:hideMark/>
+          </w:tcPr>
+          <w:p>
+            <w:r>
+              <w:rPr>
+                <w:b/>
+                <w:bCs/>
+              </w:rPr>
+              <w:t>446 MHz</w:t>
+            </w:r>
+          </w:p>
+        </w:tc>
+        <w:tc>
+          <w:tcPr>
+            <w:tcW w:w="0" w:type="auto"/>
+            <w:vAlign w:val="center"/>
+            <w:hideMark/>
+          </w:tcPr>
+          <w:p>
+            <w:r>
+              <w:t>Active narrow signal</w:t>
+            </w:r>
+          </w:p>
+        </w:tc>
+        <w:tc>
+          <w:tcPr>
+            <w:tcW w:w="0" w:type="auto"/>
+            <w:vAlign w:val="center"/>
+            <w:hideMark/>
+          </w:tcPr>
+          <w:p>
+            <w:r>
+              <w:t>Possibly D-Star or digital repeater</w:t>
+            </w:r>
+          </w:p>
+        </w:tc>
+      </w:tr>
+      <w:tr>
+        <w:trPr>
+          <w:tblCellSpacing w:w="15" w:type="dxa"/>
+        </w:trPr>
+        <w:tc>
+          <w:tcPr>
+            <w:tcW w:w="0" w:type="auto"/>
+            <w:vAlign w:val="center"/>
+            <w:hideMark/>
+          </w:tcPr>
+          <w:p>
+            <w:r>
+              <w:rPr>
+                <w:b/>
+                <w:bCs/>
+              </w:rPr>
+              <w:t>447–449 MHz</w:t>
+            </w:r>
+          </w:p>
+        </w:tc>
+        <w:tc>
+          <w:tcPr>
+            <w:tcW w:w="0" w:type="auto"/>
+            <w:vAlign w:val="center"/>
+            <w:hideMark/>
+          </w:tcPr>
+          <w:p>
+            <w:r>
+              <w:t>Sporadic/light usage</w:t>
+            </w:r>
+          </w:p>
+        </w:tc>
+        <w:tc>
+          <w:tcPr>
+            <w:tcW w:w="0" w:type="auto"/>
+            <w:vAlign w:val="center"/>
+            <w:hideMark/>
+          </w:tcPr>
+          <w:p>
+            <w:r>
+              <w:t xml:space="preserve">Possible </w:t>
+            </w:r>
+            <w:proofErr w:type="gramStart"/>
+            <w:r>
+              <w:t>repeater</w:t>
+            </w:r>
+            <w:proofErr w:type="gramEnd"/>
+            <w:r>
+              <w:t xml:space="preserve"> outputs or unused frequencies</w:t>
+            </w:r>
+          </w:p>
+        </w:tc>
+      </w:tr>
+    </w:tbl>
+    <w:p>
+      <w:r>
+        <w:pict w14:anchorId="1383ACB0">
+          <v:rect id="_x0000_i1029" style="width:0;height:1.5pt" o:hralign="center" o:hrstd="t" o:hr="t" fillcolor="#a0a0a0" stroked="f"/>
+        </w:pict>
+      </w:r>
+    </w:p>
+    <w:p>
+      <w:pPr>
+        <w:rPr>
+          <w:b/>
+          <w:bCs/>
+        </w:rPr>
+      </w:pPr>
+      <w:r>
+        <w:rPr>
+          <w:rFonts w:ascii="Segoe UI Emoji" w:hAnsi="Segoe UI Emoji" w:cs="Segoe UI Emoji"/>
+          <w:b/>
+          <w:bCs/>
+        </w:rPr>
+        <w:t>🧪</w:t>
+      </w:r>
+      <w:r>
+        <w:rPr>
+          <w:b/>
+          <w:bCs/>
+        </w:rPr>
+        <w:t xml:space="preserve"> Suggested Next Steps</w:t>
+      </w:r>
+    </w:p>
+    <w:p>
+      <w:pPr>
+        <w:rPr>
+          <w:b/>
+          <w:bCs/>
+        </w:rPr>
+      </w:pPr>
+      <w:r>
+        <w:rPr>
+          <w:rFonts w:ascii="Segoe UI Emoji" w:hAnsi="Segoe UI Emoji" w:cs="Segoe UI Emoji"/>
+          <w:b/>
+          <w:bCs/>
+        </w:rPr>
+        <w:t>✅</w:t>
+      </w:r>
+      <w:r>
+        <w:rPr>
+          <w:b/>
+          <w:bCs/>
+        </w:rPr>
+        <w:t xml:space="preserve"> Experiment 1 Follow-up:</w:t>
+      </w:r>
+    </w:p>
+    <w:p>
+      <w:r>
+        <w:lastRenderedPageBreak/>
+        <w:t xml:space="preserve">You’ve clearly </w:t>
+      </w:r>
+      <w:r>
+        <w:rPr>
+          <w:b/>
+          <w:bCs/>
+        </w:rPr>
+        <w:t>identified active vs. quiet zones</w:t>
+      </w:r>
+      <w:r>
+        <w:t>. Nice work!</w:t>
+      </w:r>
+    </w:p>
+    <w:p>
+      <w:r>
+        <w:t>Try plotting activity over time for just the quiet regions (e.g., 441–444</w:t>
+      </w:r>
+      <w:r>
+        <w:rPr>
+          <w:rFonts w:ascii="Arial" w:hAnsi="Arial" w:cs="Arial"/>
+        </w:rPr>
+        <w:t> </w:t>
+      </w:r>
+      <w:r>
+        <w:t>MHz) to catch rare usage.</w:t>
+      </w:r>
+    </w:p>
+    <w:p>
+      <w:pPr>
+        <w:rPr>
+          <w:b/>
+          <w:bCs/>
+        </w:rPr>
+      </w:pPr>
+      <w:r>
+        <w:rPr>
+          <w:rFonts w:ascii="Segoe UI Emoji" w:hAnsi="Segoe UI Emoji" w:cs="Segoe UI Emoji"/>
+          <w:b/>
+          <w:bCs/>
+        </w:rPr>
+        <w:t>✅</w:t>
+      </w:r>
+      <w:r>
+        <w:rPr>
+          <w:b/>
+          <w:bCs/>
+        </w:rPr>
+        <w:t xml:space="preserve"> Experiment 2 Preparation:</w:t>
+      </w:r>
+    </w:p>
+    <w:p>
+      <w:r>
+        <w:t xml:space="preserve">The </w:t>
+      </w:r>
+      <w:r>
+        <w:rPr>
+          <w:b/>
+          <w:bCs/>
+        </w:rPr>
+        <w:t>446</w:t>
+      </w:r>
+      <w:r>
+        <w:rPr>
+          <w:rFonts w:ascii="Arial" w:hAnsi="Arial" w:cs="Arial"/>
+          <w:b/>
+          <w:bCs/>
+        </w:rPr>
+        <w:t> </w:t>
+      </w:r>
+      <w:r>
+        <w:rPr>
+          <w:b/>
+          <w:bCs/>
+        </w:rPr>
+        <w:t>MHz signal</w:t>
+      </w:r>
+      <w:r>
+        <w:t xml:space="preserve"> is a great candidate to investigate further:</w:t>
+      </w:r>
+    </w:p>
+    <w:p>
+      <w:pPr>
+        <w:numPr>
+          <w:ilvl w:val="0"/>
+          <w:numId w:val="11"/>
+        </w:numPr>
+      </w:pPr>
+      <w:r>
+        <w:t xml:space="preserve">Try </w:t>
+      </w:r>
+      <w:r>
+        <w:rPr>
+          <w:b/>
+          <w:bCs/>
+        </w:rPr>
+        <w:t>tuning in live</w:t>
+      </w:r>
+      <w:r>
+        <w:t xml:space="preserve"> with </w:t>
+      </w:r>
+      <w:proofErr w:type="spellStart"/>
+      <w:r>
+        <w:t>gqrx</w:t>
+      </w:r>
+      <w:proofErr w:type="spellEnd"/>
+      <w:r>
+        <w:t xml:space="preserve"> or SDR++</w:t>
+      </w:r>
+    </w:p>
+    <w:p>
+      <w:pPr>
+        <w:numPr>
+          <w:ilvl w:val="0"/>
+          <w:numId w:val="11"/>
+        </w:numPr>
+      </w:pPr>
+      <w:r>
+        <w:t xml:space="preserve">Use </w:t>
+      </w:r>
+      <w:r>
+        <w:rPr>
+          <w:b/>
+          <w:bCs/>
+        </w:rPr>
+        <w:t>dstar_demod.py</w:t>
+      </w:r>
+      <w:r>
+        <w:t xml:space="preserve"> or </w:t>
+      </w:r>
+      <w:proofErr w:type="spellStart"/>
+      <w:r>
+        <w:t>dsd</w:t>
+      </w:r>
+      <w:proofErr w:type="spellEnd"/>
+      <w:r>
+        <w:t xml:space="preserve"> to try decoding</w:t>
+      </w:r>
+    </w:p>
+    <w:p>
+      <w:pPr>
+        <w:numPr>
+          <w:ilvl w:val="0"/>
+          <w:numId w:val="11"/>
+        </w:numPr>
+      </w:pPr>
+      <w:r>
+        <w:t>Log IQ samples for offline decoding if needed</w:t>
+      </w:r>
+    </w:p>
+    <w:p>
+      <w:r>
+        <w:pict w14:anchorId="3D849AE1">
+          <v:rect id="_x0000_i1030" style="width:0;height:1.5pt" o:hralign="center" o:hrstd="t" o:hr="t" fillcolor="#a0a0a0" stroked="f"/>
+        </w:pict>
+      </w:r>
+    </w:p>
+    <w:p>
+      <w:r>
+        <w:t>Would you like a custom script to extract power levels over time for just one frequency (like 446.0</w:t>
+      </w:r>
+      <w:r>
+        <w:rPr>
+          <w:rFonts w:ascii="Arial" w:hAnsi="Arial" w:cs="Arial"/>
+        </w:rPr>
+        <w:t> </w:t>
+      </w:r>
+      <w:r>
+        <w:t>MHz) to see patterns in Excel? Or do you want help trying to decode that 446</w:t>
+      </w:r>
+      <w:r>
+        <w:rPr>
+          <w:rFonts w:ascii="Arial" w:hAnsi="Arial" w:cs="Arial"/>
+        </w:rPr>
+        <w:t> </w:t>
+      </w:r>
+      <w:r>
+        <w:t>MHz signal?</w:t>
       </w:r>
     </w:p>
     <w:p/>
@@ -2971,6 +5188,304 @@
     </w:lvl>
   </w:abstractNum>
   <w:abstractNum w:abstractNumId="6" w15:restartNumberingAfterBreak="0">
+    <w:nsid w:val="56E54577"/>
+    <w:multiLevelType w:val="multilevel"/>
+    <w:tmpl w:val="3110975A"/>
+    <w:lvl w:ilvl="0">
+      <w:start w:val="1"/>
+      <w:numFmt w:val="bullet"/>
+      <w:lvlText w:val=""/>
+      <w:lvlJc w:val="left"/>
+      <w:pPr>
+        <w:tabs>
+          <w:tab w:val="num" w:pos="720"/>
+        </w:tabs>
+        <w:ind w:left="720" w:hanging="360"/>
+      </w:pPr>
+      <w:rPr>
+        <w:rFonts w:ascii="Symbol" w:hAnsi="Symbol" w:hint="default"/>
+        <w:sz w:val="20"/>
+      </w:rPr>
+    </w:lvl>
+    <w:lvl w:ilvl="1">
+      <w:start w:val="1"/>
+      <w:numFmt w:val="bullet"/>
+      <w:lvlText w:val="o"/>
+      <w:lvlJc w:val="left"/>
+      <w:pPr>
+        <w:tabs>
+          <w:tab w:val="num" w:pos="1440"/>
+        </w:tabs>
+        <w:ind w:left="1440" w:hanging="360"/>
+      </w:pPr>
+      <w:rPr>
+        <w:rFonts w:ascii="Courier New" w:hAnsi="Courier New" w:hint="default"/>
+        <w:sz w:val="20"/>
+      </w:rPr>
+    </w:lvl>
+    <w:lvl w:ilvl="2" w:tentative="1">
+      <w:start w:val="1"/>
+      <w:numFmt w:val="bullet"/>
+      <w:lvlText w:val=""/>
+      <w:lvlJc w:val="left"/>
+      <w:pPr>
+        <w:tabs>
+          <w:tab w:val="num" w:pos="2160"/>
+        </w:tabs>
+        <w:ind w:left="2160" w:hanging="360"/>
+      </w:pPr>
+      <w:rPr>
+        <w:rFonts w:ascii="Wingdings" w:hAnsi="Wingdings" w:hint="default"/>
+        <w:sz w:val="20"/>
+      </w:rPr>
+    </w:lvl>
+    <w:lvl w:ilvl="3" w:tentative="1">
+      <w:start w:val="1"/>
+      <w:numFmt w:val="bullet"/>
+      <w:lvlText w:val=""/>
+      <w:lvlJc w:val="left"/>
+      <w:pPr>
+        <w:tabs>
+          <w:tab w:val="num" w:pos="2880"/>
+        </w:tabs>
+        <w:ind w:left="2880" w:hanging="360"/>
+      </w:pPr>
+      <w:rPr>
+        <w:rFonts w:ascii="Wingdings" w:hAnsi="Wingdings" w:hint="default"/>
+        <w:sz w:val="20"/>
+      </w:rPr>
+    </w:lvl>
+    <w:lvl w:ilvl="4" w:tentative="1">
+      <w:start w:val="1"/>
+      <w:numFmt w:val="bullet"/>
+      <w:lvlText w:val=""/>
+      <w:lvlJc w:val="left"/>
+      <w:pPr>
+        <w:tabs>
+          <w:tab w:val="num" w:pos="3600"/>
+        </w:tabs>
+        <w:ind w:left="3600" w:hanging="360"/>
+      </w:pPr>
+      <w:rPr>
+        <w:rFonts w:ascii="Wingdings" w:hAnsi="Wingdings" w:hint="default"/>
+        <w:sz w:val="20"/>
+      </w:rPr>
+    </w:lvl>
+    <w:lvl w:ilvl="5" w:tentative="1">
+      <w:start w:val="1"/>
+      <w:numFmt w:val="bullet"/>
+      <w:lvlText w:val=""/>
+      <w:lvlJc w:val="left"/>
+      <w:pPr>
+        <w:tabs>
+          <w:tab w:val="num" w:pos="4320"/>
+        </w:tabs>
+        <w:ind w:left="4320" w:hanging="360"/>
+      </w:pPr>
+      <w:rPr>
+        <w:rFonts w:ascii="Wingdings" w:hAnsi="Wingdings" w:hint="default"/>
+        <w:sz w:val="20"/>
+      </w:rPr>
+    </w:lvl>
+    <w:lvl w:ilvl="6" w:tentative="1">
+      <w:start w:val="1"/>
+      <w:numFmt w:val="bullet"/>
+      <w:lvlText w:val=""/>
+      <w:lvlJc w:val="left"/>
+      <w:pPr>
+        <w:tabs>
+          <w:tab w:val="num" w:pos="5040"/>
+        </w:tabs>
+        <w:ind w:left="5040" w:hanging="360"/>
+      </w:pPr>
+      <w:rPr>
+        <w:rFonts w:ascii="Wingdings" w:hAnsi="Wingdings" w:hint="default"/>
+        <w:sz w:val="20"/>
+      </w:rPr>
+    </w:lvl>
+    <w:lvl w:ilvl="7" w:tentative="1">
+      <w:start w:val="1"/>
+      <w:numFmt w:val="bullet"/>
+      <w:lvlText w:val=""/>
+      <w:lvlJc w:val="left"/>
+      <w:pPr>
+        <w:tabs>
+          <w:tab w:val="num" w:pos="5760"/>
+        </w:tabs>
+        <w:ind w:left="5760" w:hanging="360"/>
+      </w:pPr>
+      <w:rPr>
+        <w:rFonts w:ascii="Wingdings" w:hAnsi="Wingdings" w:hint="default"/>
+        <w:sz w:val="20"/>
+      </w:rPr>
+    </w:lvl>
+    <w:lvl w:ilvl="8" w:tentative="1">
+      <w:start w:val="1"/>
+      <w:numFmt w:val="bullet"/>
+      <w:lvlText w:val=""/>
+      <w:lvlJc w:val="left"/>
+      <w:pPr>
+        <w:tabs>
+          <w:tab w:val="num" w:pos="6480"/>
+        </w:tabs>
+        <w:ind w:left="6480" w:hanging="360"/>
+      </w:pPr>
+      <w:rPr>
+        <w:rFonts w:ascii="Wingdings" w:hAnsi="Wingdings" w:hint="default"/>
+        <w:sz w:val="20"/>
+      </w:rPr>
+    </w:lvl>
+  </w:abstractNum>
+  <w:abstractNum w:abstractNumId="7" w15:restartNumberingAfterBreak="0">
+    <w:nsid w:val="5EB80AEC"/>
+    <w:multiLevelType w:val="multilevel"/>
+    <w:tmpl w:val="7B700978"/>
+    <w:lvl w:ilvl="0">
+      <w:start w:val="1"/>
+      <w:numFmt w:val="bullet"/>
+      <w:lvlText w:val=""/>
+      <w:lvlJc w:val="left"/>
+      <w:pPr>
+        <w:tabs>
+          <w:tab w:val="num" w:pos="720"/>
+        </w:tabs>
+        <w:ind w:left="720" w:hanging="360"/>
+      </w:pPr>
+      <w:rPr>
+        <w:rFonts w:ascii="Symbol" w:hAnsi="Symbol" w:hint="default"/>
+        <w:sz w:val="20"/>
+      </w:rPr>
+    </w:lvl>
+    <w:lvl w:ilvl="1">
+      <w:start w:val="1"/>
+      <w:numFmt w:val="bullet"/>
+      <w:lvlText w:val="o"/>
+      <w:lvlJc w:val="left"/>
+      <w:pPr>
+        <w:tabs>
+          <w:tab w:val="num" w:pos="1440"/>
+        </w:tabs>
+        <w:ind w:left="1440" w:hanging="360"/>
+      </w:pPr>
+      <w:rPr>
+        <w:rFonts w:ascii="Courier New" w:hAnsi="Courier New" w:hint="default"/>
+        <w:sz w:val="20"/>
+      </w:rPr>
+    </w:lvl>
+    <w:lvl w:ilvl="2" w:tentative="1">
+      <w:start w:val="1"/>
+      <w:numFmt w:val="bullet"/>
+      <w:lvlText w:val=""/>
+      <w:lvlJc w:val="left"/>
+      <w:pPr>
+        <w:tabs>
+          <w:tab w:val="num" w:pos="2160"/>
+        </w:tabs>
+        <w:ind w:left="2160" w:hanging="360"/>
+      </w:pPr>
+      <w:rPr>
+        <w:rFonts w:ascii="Wingdings" w:hAnsi="Wingdings" w:hint="default"/>
+        <w:sz w:val="20"/>
+      </w:rPr>
+    </w:lvl>
+    <w:lvl w:ilvl="3" w:tentative="1">
+      <w:start w:val="1"/>
+      <w:numFmt w:val="bullet"/>
+      <w:lvlText w:val=""/>
+      <w:lvlJc w:val="left"/>
+      <w:pPr>
+        <w:tabs>
+          <w:tab w:val="num" w:pos="2880"/>
+        </w:tabs>
+        <w:ind w:left="2880" w:hanging="360"/>
+      </w:pPr>
+      <w:rPr>
+        <w:rFonts w:ascii="Wingdings" w:hAnsi="Wingdings" w:hint="default"/>
+        <w:sz w:val="20"/>
+      </w:rPr>
+    </w:lvl>
+    <w:lvl w:ilvl="4" w:tentative="1">
+      <w:start w:val="1"/>
+      <w:numFmt w:val="bullet"/>
+      <w:lvlText w:val=""/>
+      <w:lvlJc w:val="left"/>
+      <w:pPr>
+        <w:tabs>
+          <w:tab w:val="num" w:pos="3600"/>
+        </w:tabs>
+        <w:ind w:left="3600" w:hanging="360"/>
+      </w:pPr>
+      <w:rPr>
+        <w:rFonts w:ascii="Wingdings" w:hAnsi="Wingdings" w:hint="default"/>
+        <w:sz w:val="20"/>
+      </w:rPr>
+    </w:lvl>
+    <w:lvl w:ilvl="5" w:tentative="1">
+      <w:start w:val="1"/>
+      <w:numFmt w:val="bullet"/>
+      <w:lvlText w:val=""/>
+      <w:lvlJc w:val="left"/>
+      <w:pPr>
+        <w:tabs>
+          <w:tab w:val="num" w:pos="4320"/>
+        </w:tabs>
+        <w:ind w:left="4320" w:hanging="360"/>
+      </w:pPr>
+      <w:rPr>
+        <w:rFonts w:ascii="Wingdings" w:hAnsi="Wingdings" w:hint="default"/>
+        <w:sz w:val="20"/>
+      </w:rPr>
+    </w:lvl>
+    <w:lvl w:ilvl="6" w:tentative="1">
+      <w:start w:val="1"/>
+      <w:numFmt w:val="bullet"/>
+      <w:lvlText w:val=""/>
+      <w:lvlJc w:val="left"/>
+      <w:pPr>
+        <w:tabs>
+          <w:tab w:val="num" w:pos="5040"/>
+        </w:tabs>
+        <w:ind w:left="5040" w:hanging="360"/>
+      </w:pPr>
+      <w:rPr>
+        <w:rFonts w:ascii="Wingdings" w:hAnsi="Wingdings" w:hint="default"/>
+        <w:sz w:val="20"/>
+      </w:rPr>
+    </w:lvl>
+    <w:lvl w:ilvl="7" w:tentative="1">
+      <w:start w:val="1"/>
+      <w:numFmt w:val="bullet"/>
+      <w:lvlText w:val=""/>
+      <w:lvlJc w:val="left"/>
+      <w:pPr>
+        <w:tabs>
+          <w:tab w:val="num" w:pos="5760"/>
+        </w:tabs>
+        <w:ind w:left="5760" w:hanging="360"/>
+      </w:pPr>
+      <w:rPr>
+        <w:rFonts w:ascii="Wingdings" w:hAnsi="Wingdings" w:hint="default"/>
+        <w:sz w:val="20"/>
+      </w:rPr>
+    </w:lvl>
+    <w:lvl w:ilvl="8" w:tentative="1">
+      <w:start w:val="1"/>
+      <w:numFmt w:val="bullet"/>
+      <w:lvlText w:val=""/>
+      <w:lvlJc w:val="left"/>
+      <w:pPr>
+        <w:tabs>
+          <w:tab w:val="num" w:pos="6480"/>
+        </w:tabs>
+        <w:ind w:left="6480" w:hanging="360"/>
+      </w:pPr>
+      <w:rPr>
+        <w:rFonts w:ascii="Wingdings" w:hAnsi="Wingdings" w:hint="default"/>
+        <w:sz w:val="20"/>
+      </w:rPr>
+    </w:lvl>
+  </w:abstractNum>
+  <w:abstractNum w:abstractNumId="8" w15:restartNumberingAfterBreak="0">
     <w:nsid w:val="615F4899"/>
     <w:multiLevelType w:val="multilevel"/>
     <w:tmpl w:val="C9266CD0"/>
@@ -3107,6 +5622,304 @@
       </w:pPr>
       <w:rPr>
         <w:rFonts w:ascii="Wingdings" w:hAnsi="Wingdings" w:cs="Wingdings" w:hint="default"/>
+      </w:rPr>
+    </w:lvl>
+  </w:abstractNum>
+  <w:abstractNum w:abstractNumId="9" w15:restartNumberingAfterBreak="0">
+    <w:nsid w:val="728521D6"/>
+    <w:multiLevelType w:val="multilevel"/>
+    <w:tmpl w:val="7A00D950"/>
+    <w:lvl w:ilvl="0">
+      <w:start w:val="1"/>
+      <w:numFmt w:val="bullet"/>
+      <w:lvlText w:val=""/>
+      <w:lvlJc w:val="left"/>
+      <w:pPr>
+        <w:tabs>
+          <w:tab w:val="num" w:pos="720"/>
+        </w:tabs>
+        <w:ind w:left="720" w:hanging="360"/>
+      </w:pPr>
+      <w:rPr>
+        <w:rFonts w:ascii="Symbol" w:hAnsi="Symbol" w:hint="default"/>
+        <w:sz w:val="20"/>
+      </w:rPr>
+    </w:lvl>
+    <w:lvl w:ilvl="1" w:tentative="1">
+      <w:start w:val="1"/>
+      <w:numFmt w:val="bullet"/>
+      <w:lvlText w:val="o"/>
+      <w:lvlJc w:val="left"/>
+      <w:pPr>
+        <w:tabs>
+          <w:tab w:val="num" w:pos="1440"/>
+        </w:tabs>
+        <w:ind w:left="1440" w:hanging="360"/>
+      </w:pPr>
+      <w:rPr>
+        <w:rFonts w:ascii="Courier New" w:hAnsi="Courier New" w:hint="default"/>
+        <w:sz w:val="20"/>
+      </w:rPr>
+    </w:lvl>
+    <w:lvl w:ilvl="2" w:tentative="1">
+      <w:start w:val="1"/>
+      <w:numFmt w:val="bullet"/>
+      <w:lvlText w:val=""/>
+      <w:lvlJc w:val="left"/>
+      <w:pPr>
+        <w:tabs>
+          <w:tab w:val="num" w:pos="2160"/>
+        </w:tabs>
+        <w:ind w:left="2160" w:hanging="360"/>
+      </w:pPr>
+      <w:rPr>
+        <w:rFonts w:ascii="Wingdings" w:hAnsi="Wingdings" w:hint="default"/>
+        <w:sz w:val="20"/>
+      </w:rPr>
+    </w:lvl>
+    <w:lvl w:ilvl="3" w:tentative="1">
+      <w:start w:val="1"/>
+      <w:numFmt w:val="bullet"/>
+      <w:lvlText w:val=""/>
+      <w:lvlJc w:val="left"/>
+      <w:pPr>
+        <w:tabs>
+          <w:tab w:val="num" w:pos="2880"/>
+        </w:tabs>
+        <w:ind w:left="2880" w:hanging="360"/>
+      </w:pPr>
+      <w:rPr>
+        <w:rFonts w:ascii="Wingdings" w:hAnsi="Wingdings" w:hint="default"/>
+        <w:sz w:val="20"/>
+      </w:rPr>
+    </w:lvl>
+    <w:lvl w:ilvl="4" w:tentative="1">
+      <w:start w:val="1"/>
+      <w:numFmt w:val="bullet"/>
+      <w:lvlText w:val=""/>
+      <w:lvlJc w:val="left"/>
+      <w:pPr>
+        <w:tabs>
+          <w:tab w:val="num" w:pos="3600"/>
+        </w:tabs>
+        <w:ind w:left="3600" w:hanging="360"/>
+      </w:pPr>
+      <w:rPr>
+        <w:rFonts w:ascii="Wingdings" w:hAnsi="Wingdings" w:hint="default"/>
+        <w:sz w:val="20"/>
+      </w:rPr>
+    </w:lvl>
+    <w:lvl w:ilvl="5" w:tentative="1">
+      <w:start w:val="1"/>
+      <w:numFmt w:val="bullet"/>
+      <w:lvlText w:val=""/>
+      <w:lvlJc w:val="left"/>
+      <w:pPr>
+        <w:tabs>
+          <w:tab w:val="num" w:pos="4320"/>
+        </w:tabs>
+        <w:ind w:left="4320" w:hanging="360"/>
+      </w:pPr>
+      <w:rPr>
+        <w:rFonts w:ascii="Wingdings" w:hAnsi="Wingdings" w:hint="default"/>
+        <w:sz w:val="20"/>
+      </w:rPr>
+    </w:lvl>
+    <w:lvl w:ilvl="6" w:tentative="1">
+      <w:start w:val="1"/>
+      <w:numFmt w:val="bullet"/>
+      <w:lvlText w:val=""/>
+      <w:lvlJc w:val="left"/>
+      <w:pPr>
+        <w:tabs>
+          <w:tab w:val="num" w:pos="5040"/>
+        </w:tabs>
+        <w:ind w:left="5040" w:hanging="360"/>
+      </w:pPr>
+      <w:rPr>
+        <w:rFonts w:ascii="Wingdings" w:hAnsi="Wingdings" w:hint="default"/>
+        <w:sz w:val="20"/>
+      </w:rPr>
+    </w:lvl>
+    <w:lvl w:ilvl="7" w:tentative="1">
+      <w:start w:val="1"/>
+      <w:numFmt w:val="bullet"/>
+      <w:lvlText w:val=""/>
+      <w:lvlJc w:val="left"/>
+      <w:pPr>
+        <w:tabs>
+          <w:tab w:val="num" w:pos="5760"/>
+        </w:tabs>
+        <w:ind w:left="5760" w:hanging="360"/>
+      </w:pPr>
+      <w:rPr>
+        <w:rFonts w:ascii="Wingdings" w:hAnsi="Wingdings" w:hint="default"/>
+        <w:sz w:val="20"/>
+      </w:rPr>
+    </w:lvl>
+    <w:lvl w:ilvl="8" w:tentative="1">
+      <w:start w:val="1"/>
+      <w:numFmt w:val="bullet"/>
+      <w:lvlText w:val=""/>
+      <w:lvlJc w:val="left"/>
+      <w:pPr>
+        <w:tabs>
+          <w:tab w:val="num" w:pos="6480"/>
+        </w:tabs>
+        <w:ind w:left="6480" w:hanging="360"/>
+      </w:pPr>
+      <w:rPr>
+        <w:rFonts w:ascii="Wingdings" w:hAnsi="Wingdings" w:hint="default"/>
+        <w:sz w:val="20"/>
+      </w:rPr>
+    </w:lvl>
+  </w:abstractNum>
+  <w:abstractNum w:abstractNumId="10" w15:restartNumberingAfterBreak="0">
+    <w:nsid w:val="7A9E54C7"/>
+    <w:multiLevelType w:val="multilevel"/>
+    <w:tmpl w:val="5C34A218"/>
+    <w:lvl w:ilvl="0">
+      <w:start w:val="1"/>
+      <w:numFmt w:val="bullet"/>
+      <w:lvlText w:val=""/>
+      <w:lvlJc w:val="left"/>
+      <w:pPr>
+        <w:tabs>
+          <w:tab w:val="num" w:pos="720"/>
+        </w:tabs>
+        <w:ind w:left="720" w:hanging="360"/>
+      </w:pPr>
+      <w:rPr>
+        <w:rFonts w:ascii="Symbol" w:hAnsi="Symbol" w:hint="default"/>
+        <w:sz w:val="20"/>
+      </w:rPr>
+    </w:lvl>
+    <w:lvl w:ilvl="1" w:tentative="1">
+      <w:start w:val="1"/>
+      <w:numFmt w:val="bullet"/>
+      <w:lvlText w:val="o"/>
+      <w:lvlJc w:val="left"/>
+      <w:pPr>
+        <w:tabs>
+          <w:tab w:val="num" w:pos="1440"/>
+        </w:tabs>
+        <w:ind w:left="1440" w:hanging="360"/>
+      </w:pPr>
+      <w:rPr>
+        <w:rFonts w:ascii="Courier New" w:hAnsi="Courier New" w:hint="default"/>
+        <w:sz w:val="20"/>
+      </w:rPr>
+    </w:lvl>
+    <w:lvl w:ilvl="2" w:tentative="1">
+      <w:start w:val="1"/>
+      <w:numFmt w:val="bullet"/>
+      <w:lvlText w:val=""/>
+      <w:lvlJc w:val="left"/>
+      <w:pPr>
+        <w:tabs>
+          <w:tab w:val="num" w:pos="2160"/>
+        </w:tabs>
+        <w:ind w:left="2160" w:hanging="360"/>
+      </w:pPr>
+      <w:rPr>
+        <w:rFonts w:ascii="Wingdings" w:hAnsi="Wingdings" w:hint="default"/>
+        <w:sz w:val="20"/>
+      </w:rPr>
+    </w:lvl>
+    <w:lvl w:ilvl="3" w:tentative="1">
+      <w:start w:val="1"/>
+      <w:numFmt w:val="bullet"/>
+      <w:lvlText w:val=""/>
+      <w:lvlJc w:val="left"/>
+      <w:pPr>
+        <w:tabs>
+          <w:tab w:val="num" w:pos="2880"/>
+        </w:tabs>
+        <w:ind w:left="2880" w:hanging="360"/>
+      </w:pPr>
+      <w:rPr>
+        <w:rFonts w:ascii="Wingdings" w:hAnsi="Wingdings" w:hint="default"/>
+        <w:sz w:val="20"/>
+      </w:rPr>
+    </w:lvl>
+    <w:lvl w:ilvl="4" w:tentative="1">
+      <w:start w:val="1"/>
+      <w:numFmt w:val="bullet"/>
+      <w:lvlText w:val=""/>
+      <w:lvlJc w:val="left"/>
+      <w:pPr>
+        <w:tabs>
+          <w:tab w:val="num" w:pos="3600"/>
+        </w:tabs>
+        <w:ind w:left="3600" w:hanging="360"/>
+      </w:pPr>
+      <w:rPr>
+        <w:rFonts w:ascii="Wingdings" w:hAnsi="Wingdings" w:hint="default"/>
+        <w:sz w:val="20"/>
+      </w:rPr>
+    </w:lvl>
+    <w:lvl w:ilvl="5" w:tentative="1">
+      <w:start w:val="1"/>
+      <w:numFmt w:val="bullet"/>
+      <w:lvlText w:val=""/>
+      <w:lvlJc w:val="left"/>
+      <w:pPr>
+        <w:tabs>
+          <w:tab w:val="num" w:pos="4320"/>
+        </w:tabs>
+        <w:ind w:left="4320" w:hanging="360"/>
+      </w:pPr>
+      <w:rPr>
+        <w:rFonts w:ascii="Wingdings" w:hAnsi="Wingdings" w:hint="default"/>
+        <w:sz w:val="20"/>
+      </w:rPr>
+    </w:lvl>
+    <w:lvl w:ilvl="6" w:tentative="1">
+      <w:start w:val="1"/>
+      <w:numFmt w:val="bullet"/>
+      <w:lvlText w:val=""/>
+      <w:lvlJc w:val="left"/>
+      <w:pPr>
+        <w:tabs>
+          <w:tab w:val="num" w:pos="5040"/>
+        </w:tabs>
+        <w:ind w:left="5040" w:hanging="360"/>
+      </w:pPr>
+      <w:rPr>
+        <w:rFonts w:ascii="Wingdings" w:hAnsi="Wingdings" w:hint="default"/>
+        <w:sz w:val="20"/>
+      </w:rPr>
+    </w:lvl>
+    <w:lvl w:ilvl="7" w:tentative="1">
+      <w:start w:val="1"/>
+      <w:numFmt w:val="bullet"/>
+      <w:lvlText w:val=""/>
+      <w:lvlJc w:val="left"/>
+      <w:pPr>
+        <w:tabs>
+          <w:tab w:val="num" w:pos="5760"/>
+        </w:tabs>
+        <w:ind w:left="5760" w:hanging="360"/>
+      </w:pPr>
+      <w:rPr>
+        <w:rFonts w:ascii="Wingdings" w:hAnsi="Wingdings" w:hint="default"/>
+        <w:sz w:val="20"/>
+      </w:rPr>
+    </w:lvl>
+    <w:lvl w:ilvl="8" w:tentative="1">
+      <w:start w:val="1"/>
+      <w:numFmt w:val="bullet"/>
+      <w:lvlText w:val=""/>
+      <w:lvlJc w:val="left"/>
+      <w:pPr>
+        <w:tabs>
+          <w:tab w:val="num" w:pos="6480"/>
+        </w:tabs>
+        <w:ind w:left="6480" w:hanging="360"/>
+      </w:pPr>
+      <w:rPr>
+        <w:rFonts w:ascii="Wingdings" w:hAnsi="Wingdings" w:hint="default"/>
+        <w:sz w:val="20"/>
       </w:rPr>
     </w:lvl>
   </w:abstractNum>
@@ -3129,7 +5942,19 @@
     <w:abstractNumId w:val="0"/>
   </w:num>
   <w:num w:numId="7" w16cid:durableId="751925626">
+    <w:abstractNumId w:val="8"/>
+  </w:num>
+  <w:num w:numId="8" w16cid:durableId="916011410">
+    <w:abstractNumId w:val="9"/>
+  </w:num>
+  <w:num w:numId="9" w16cid:durableId="1542210779">
+    <w:abstractNumId w:val="7"/>
+  </w:num>
+  <w:num w:numId="10" w16cid:durableId="51738587">
     <w:abstractNumId w:val="6"/>
+  </w:num>
+  <w:num w:numId="11" w16cid:durableId="1922643781">
+    <w:abstractNumId w:val="10"/>
   </w:num>
 </w:numbering>
 </file>

</xml_diff>

<commit_message>
Updated First analysis and focused scanning plan.
</commit_message>
<xml_diff>
--- a/Frequency_Survey/Frequency_Survey_Project_Management.docx
+++ b/Frequency_Survey/Frequency_Survey_Project_Management.docx
@@ -34,10 +34,21 @@
       </w:pPr>
     </w:p>
     <w:p>
-      <w:r>
-        <w:rPr>
-          <w:b/>
-          <w:bCs/>
+      <w:pPr>
+        <w:rPr>
+          <w:b/>
+          <w:bCs/>
+          <w:sz w:val="32"/>
+          <w:szCs w:val="32"/>
+          <w:u w:val="single"/>
+        </w:rPr>
+      </w:pPr>
+      <w:r>
+        <w:rPr>
+          <w:b/>
+          <w:bCs/>
+          <w:sz w:val="32"/>
+          <w:szCs w:val="32"/>
           <w:u w:val="single"/>
         </w:rPr>
         <w:t>Scope</w:t>
@@ -116,15 +127,7 @@
         </w:numPr>
       </w:pPr>
       <w:r>
-        <w:t xml:space="preserve">Check </w:t>
-      </w:r>
-      <w:proofErr w:type="spellStart"/>
-      <w:r>
-        <w:t>uSD</w:t>
-      </w:r>
-      <w:proofErr w:type="spellEnd"/>
-      <w:r>
-        <w:t xml:space="preserve"> Card Inventory </w:t>
+        <w:t xml:space="preserve">Check uSD Card Inventory </w:t>
       </w:r>
     </w:p>
     <w:p>
@@ -169,26 +172,10 @@
     <w:p>
       <w:r>
         <w:lastRenderedPageBreak/>
-        <w:t xml:space="preserve">New </w:t>
-      </w:r>
-      <w:proofErr w:type="spellStart"/>
-      <w:r>
-        <w:t>uSD</w:t>
-      </w:r>
-      <w:proofErr w:type="spellEnd"/>
-      <w:r>
-        <w:t xml:space="preserve"> Card DS</w:t>
-      </w:r>
-      <w:r>
-        <w:t xml:space="preserve"> 1 dot </w:t>
-      </w:r>
-      <w:proofErr w:type="spellStart"/>
-      <w:r>
-        <w:t>Validrive</w:t>
-      </w:r>
-      <w:proofErr w:type="spellEnd"/>
-      <w:r>
-        <w:t xml:space="preserve"> Report</w:t>
+        <w:t>New uSD Card DS</w:t>
+      </w:r>
+      <w:r>
+        <w:t xml:space="preserve"> 1 dot Validrive Report</w:t>
       </w:r>
       <w:r>
         <w:t xml:space="preserve"> </w:t>
@@ -354,23 +341,7 @@
       </w:r>
       <w:r>
         <w:lastRenderedPageBreak/>
-        <w:t xml:space="preserve">New </w:t>
-      </w:r>
-      <w:proofErr w:type="spellStart"/>
-      <w:r>
-        <w:t>uSD</w:t>
-      </w:r>
-      <w:proofErr w:type="spellEnd"/>
-      <w:r>
-        <w:t xml:space="preserve"> Card DS 2 dot </w:t>
-      </w:r>
-      <w:proofErr w:type="spellStart"/>
-      <w:r>
-        <w:t>Validrive</w:t>
-      </w:r>
-      <w:proofErr w:type="spellEnd"/>
-      <w:r>
-        <w:t xml:space="preserve"> Report </w:t>
+        <w:t xml:space="preserve">New uSD Card DS 2 dot Validrive Report </w:t>
       </w:r>
       <w:r>
         <w:rPr>
@@ -441,15 +412,7 @@
           </w:tcPr>
           <w:p>
             <w:r>
-              <w:t> 4/21/</w:t>
-            </w:r>
-            <w:proofErr w:type="gramStart"/>
-            <w:r>
-              <w:t>2025  at</w:t>
-            </w:r>
-            <w:proofErr w:type="gramEnd"/>
-            <w:r>
-              <w:t>  2:47 PM</w:t>
+              <w:t> 4/21/2025  at  2:47 PM</w:t>
             </w:r>
           </w:p>
         </w:tc>
@@ -634,13 +597,8 @@
           </w:tcPr>
           <w:p>
             <w:r>
-              <w:t> </w:t>
-            </w:r>
-            <w:proofErr w:type="spellStart"/>
-            <w:r>
-              <w:t>storage_device</w:t>
-            </w:r>
-            <w:proofErr w:type="spellEnd"/>
+              <w:t> storage_device</w:t>
+            </w:r>
           </w:p>
         </w:tc>
       </w:tr>
@@ -1400,11 +1358,34 @@
       </w:r>
     </w:p>
     <w:p>
-      <w:r>
+      <w:pPr>
+        <w:rPr>
+          <w:b/>
+          <w:bCs/>
+          <w:sz w:val="32"/>
+          <w:szCs w:val="32"/>
+          <w:u w:val="single"/>
+        </w:rPr>
+      </w:pPr>
+      <w:r>
+        <w:rPr>
+          <w:b/>
+          <w:bCs/>
+          <w:sz w:val="32"/>
+          <w:szCs w:val="32"/>
+          <w:u w:val="single"/>
+        </w:rPr>
         <w:lastRenderedPageBreak/>
         <w:t>4/23/</w:t>
       </w:r>
       <w:r>
+        <w:rPr>
+          <w:b/>
+          <w:bCs/>
+          <w:sz w:val="32"/>
+          <w:szCs w:val="32"/>
+          <w:u w:val="single"/>
+        </w:rPr>
         <w:t>25</w:t>
       </w:r>
     </w:p>
@@ -1421,23 +1402,7 @@
           <w:b/>
           <w:bCs/>
         </w:rPr>
-        <w:t xml:space="preserve">S </w:t>
-      </w:r>
-      <w:proofErr w:type="spellStart"/>
-      <w:r>
-        <w:rPr>
-          <w:b/>
-          <w:bCs/>
-        </w:rPr>
-        <w:t>S</w:t>
-      </w:r>
-      <w:proofErr w:type="spellEnd"/>
-      <w:r>
-        <w:rPr>
-          <w:b/>
-          <w:bCs/>
-        </w:rPr>
-        <w:t xml:space="preserve"> H &lt; U S E R &gt; @ &lt; I P &gt;</w:t>
+        <w:t>S S H &lt; U S E R &gt; @ &lt; I P &gt;</w:t>
       </w:r>
     </w:p>
     <w:p>
@@ -1652,21 +1617,7 @@
         <w:rPr>
           <w:color w:val="FF0000"/>
         </w:rPr>
-        <w:t>BAD IP</w:t>
-      </w:r>
-      <w:proofErr w:type="gramStart"/>
-      <w:r>
-        <w:rPr>
-          <w:color w:val="FF0000"/>
-        </w:rPr>
-        <w:t>:  198.168</w:t>
-      </w:r>
-      <w:proofErr w:type="gramEnd"/>
-      <w:r>
-        <w:rPr>
-          <w:color w:val="FF0000"/>
-        </w:rPr>
-        <w:t>.4.190</w:t>
+        <w:t>BAD IP:  198.168.4.190</w:t>
       </w:r>
       <w:r>
         <w:rPr>
@@ -1761,44 +1712,21 @@
     </w:p>
     <w:p/>
     <w:p>
-      <w:proofErr w:type="spellStart"/>
-      <w:r>
-        <w:t>sudo</w:t>
-      </w:r>
-      <w:proofErr w:type="spellEnd"/>
-      <w:r>
-        <w:t xml:space="preserve"> apt-get update</w:t>
-      </w:r>
-    </w:p>
-    <w:p>
-      <w:proofErr w:type="spellStart"/>
-      <w:r>
-        <w:t>sudo</w:t>
-      </w:r>
-      <w:proofErr w:type="spellEnd"/>
-      <w:r>
-        <w:t xml:space="preserve"> apt-get upgrade</w:t>
-      </w:r>
-    </w:p>
-    <w:p>
-      <w:proofErr w:type="spellStart"/>
+      <w:r>
+        <w:t>sudo apt-get update</w:t>
+      </w:r>
+    </w:p>
+    <w:p>
+      <w:r>
+        <w:t>sudo apt-get upgrade</w:t>
+      </w:r>
+    </w:p>
+    <w:p>
       <w:r>
         <w:t>s</w:t>
       </w:r>
       <w:r>
-        <w:t>udo</w:t>
-      </w:r>
-      <w:proofErr w:type="spellEnd"/>
-      <w:r>
-        <w:t xml:space="preserve"> apt-get </w:t>
-      </w:r>
-      <w:proofErr w:type="spellStart"/>
-      <w:r>
-        <w:t>dist</w:t>
-      </w:r>
-      <w:proofErr w:type="spellEnd"/>
-      <w:r>
-        <w:t>-upgrade</w:t>
+        <w:t>udo apt-get dist-upgrade</w:t>
       </w:r>
     </w:p>
     <w:p>
@@ -1807,13 +1735,8 @@
       </w:r>
     </w:p>
     <w:p>
-      <w:proofErr w:type="spellStart"/>
-      <w:r>
-        <w:t>sudo</w:t>
-      </w:r>
-      <w:proofErr w:type="spellEnd"/>
-      <w:r>
-        <w:t xml:space="preserve"> reboot</w:t>
+      <w:r>
+        <w:t>sudo reboot</w:t>
       </w:r>
     </w:p>
     <w:p>
@@ -1831,41 +1754,13 @@
           <w:color w:val="00B050"/>
         </w:rPr>
       </w:pPr>
-      <w:proofErr w:type="spellStart"/>
       <w:r>
         <w:rPr>
           <w:b/>
           <w:bCs/>
           <w:color w:val="00B050"/>
         </w:rPr>
-        <w:t>sudo</w:t>
-      </w:r>
-      <w:proofErr w:type="spellEnd"/>
-      <w:r>
-        <w:rPr>
-          <w:b/>
-          <w:bCs/>
-          <w:color w:val="00B050"/>
-        </w:rPr>
-        <w:t xml:space="preserve"> apt install </w:t>
-      </w:r>
-      <w:proofErr w:type="spellStart"/>
-      <w:r>
-        <w:rPr>
-          <w:b/>
-          <w:bCs/>
-          <w:color w:val="00B050"/>
-        </w:rPr>
-        <w:t>rtl-sdr</w:t>
-      </w:r>
-      <w:proofErr w:type="spellEnd"/>
-      <w:r>
-        <w:rPr>
-          <w:b/>
-          <w:bCs/>
-          <w:color w:val="00B050"/>
-        </w:rPr>
-        <w:t xml:space="preserve"> python3-matplotlib python3-numpy sox git</w:t>
+        <w:t>sudo apt install rtl-sdr python3-matplotlib python3-numpy sox git</w:t>
       </w:r>
     </w:p>
     <w:p/>
@@ -1895,230 +1790,50 @@
         <w:rPr>
           <w:color w:val="FF0000"/>
         </w:rPr>
-        <w:t>cp rtl-sdr/rtl_power/heatmap.py ~/</w:t>
-      </w:r>
-      <w:proofErr w:type="spellStart"/>
-      <w:r>
-        <w:rPr>
-          <w:color w:val="FF0000"/>
-        </w:rPr>
-        <w:t>sdr</w:t>
-      </w:r>
-      <w:proofErr w:type="spellEnd"/>
-      <w:r>
-        <w:rPr>
-          <w:color w:val="FF0000"/>
-        </w:rPr>
-        <w:t>-monitor/</w:t>
+        <w:t>cp rtl-sdr/rtl_power/heatmap.py ~/sdr-monitor/</w:t>
       </w:r>
     </w:p>
     <w:p/>
     <w:p>
       <w:r>
         <w:lastRenderedPageBreak/>
-        <w:t>unicycle9312@</w:t>
-      </w:r>
-      <w:proofErr w:type="gramStart"/>
-      <w:r>
-        <w:t>Frequency:~</w:t>
-      </w:r>
-      <w:proofErr w:type="gramEnd"/>
-      <w:r>
-        <w:t xml:space="preserve"> $ cp rtl-sdr/rtl_power/heatmap.py ~/</w:t>
-      </w:r>
-      <w:proofErr w:type="spellStart"/>
-      <w:r>
-        <w:t>sdr</w:t>
-      </w:r>
-      <w:proofErr w:type="spellEnd"/>
-      <w:r>
-        <w:t>-monitor/</w:t>
-      </w:r>
-    </w:p>
-    <w:p>
-      <w:r>
-        <w:t>cp: cannot stat '</w:t>
-      </w:r>
-      <w:proofErr w:type="spellStart"/>
-      <w:r>
-        <w:t>rtl-sdr</w:t>
-      </w:r>
-      <w:proofErr w:type="spellEnd"/>
-      <w:r>
-        <w:t>/</w:t>
-      </w:r>
-      <w:proofErr w:type="spellStart"/>
-      <w:r>
-        <w:t>rtl_power</w:t>
-      </w:r>
-      <w:proofErr w:type="spellEnd"/>
-      <w:r>
-        <w:t>/heatmap.py': No such file or directory</w:t>
-      </w:r>
-    </w:p>
-    <w:p>
-      <w:r>
-        <w:t>unicycle9312@</w:t>
-      </w:r>
-      <w:proofErr w:type="gramStart"/>
-      <w:r>
-        <w:t>Frequency:~</w:t>
-      </w:r>
-      <w:proofErr w:type="gramEnd"/>
-      <w:r>
-        <w:t xml:space="preserve"> $ ls</w:t>
-      </w:r>
-    </w:p>
-    <w:p>
-      <w:proofErr w:type="gramStart"/>
-      <w:r>
-        <w:t>Bookshelf  Desktop</w:t>
-      </w:r>
-      <w:proofErr w:type="gramEnd"/>
-      <w:r>
-        <w:t xml:space="preserve">  </w:t>
-      </w:r>
-      <w:proofErr w:type="gramStart"/>
-      <w:r>
-        <w:t>Documents  Downloads</w:t>
-      </w:r>
-      <w:proofErr w:type="gramEnd"/>
-      <w:r>
-        <w:t xml:space="preserve">  </w:t>
-      </w:r>
-      <w:proofErr w:type="gramStart"/>
-      <w:r>
-        <w:t>Music  Pictures</w:t>
-      </w:r>
-      <w:proofErr w:type="gramEnd"/>
-      <w:r>
-        <w:t xml:space="preserve">  </w:t>
-      </w:r>
-      <w:proofErr w:type="gramStart"/>
-      <w:r>
-        <w:t xml:space="preserve">Public  </w:t>
-      </w:r>
-      <w:proofErr w:type="spellStart"/>
-      <w:r>
-        <w:t>rtl</w:t>
-      </w:r>
-      <w:proofErr w:type="gramEnd"/>
-      <w:r>
-        <w:t>-</w:t>
-      </w:r>
-      <w:proofErr w:type="gramStart"/>
-      <w:r>
-        <w:t>sdr</w:t>
-      </w:r>
-      <w:proofErr w:type="spellEnd"/>
-      <w:r>
-        <w:t xml:space="preserve">  Templates</w:t>
-      </w:r>
-      <w:proofErr w:type="gramEnd"/>
-      <w:r>
-        <w:t xml:space="preserve">  Videos</w:t>
-      </w:r>
-    </w:p>
-    <w:p>
-      <w:r>
-        <w:t>unicycle9312@</w:t>
-      </w:r>
-      <w:proofErr w:type="gramStart"/>
-      <w:r>
-        <w:t>Frequency:~</w:t>
-      </w:r>
-      <w:proofErr w:type="gramEnd"/>
-      <w:r>
-        <w:t xml:space="preserve"> $ cd </w:t>
-      </w:r>
-      <w:proofErr w:type="spellStart"/>
-      <w:r>
-        <w:t>rtl-sdr</w:t>
-      </w:r>
-      <w:proofErr w:type="spellEnd"/>
-    </w:p>
-    <w:p>
-      <w:r>
-        <w:t>unicycle9312@</w:t>
-      </w:r>
-      <w:proofErr w:type="gramStart"/>
-      <w:r>
-        <w:t>Frequency:~</w:t>
-      </w:r>
-      <w:proofErr w:type="gramEnd"/>
-      <w:r>
-        <w:t>/</w:t>
-      </w:r>
-      <w:proofErr w:type="spellStart"/>
-      <w:r>
-        <w:t>rtl-sdr</w:t>
-      </w:r>
-      <w:proofErr w:type="spellEnd"/>
-      <w:r>
-        <w:t xml:space="preserve"> $ ls</w:t>
-      </w:r>
-    </w:p>
-    <w:p>
-      <w:proofErr w:type="gramStart"/>
-      <w:r>
-        <w:t>AUTHORS  CMakeLists.txt</w:t>
-      </w:r>
-      <w:proofErr w:type="gramEnd"/>
-      <w:r>
-        <w:t xml:space="preserve">  COPYING      git-version-</w:t>
-      </w:r>
-      <w:proofErr w:type="gramStart"/>
-      <w:r>
-        <w:t>gen  librtlsdr.pc.in</w:t>
-      </w:r>
-      <w:proofErr w:type="gramEnd"/>
-      <w:r>
-        <w:t xml:space="preserve">  </w:t>
-      </w:r>
-      <w:proofErr w:type="gramStart"/>
-      <w:r>
-        <w:t xml:space="preserve">Makefile.am  </w:t>
-      </w:r>
-      <w:proofErr w:type="spellStart"/>
-      <w:r>
-        <w:t>rtlsdr</w:t>
-      </w:r>
-      <w:proofErr w:type="gramEnd"/>
-      <w:r>
-        <w:t>.conf</w:t>
-      </w:r>
-      <w:proofErr w:type="spellEnd"/>
-      <w:r>
-        <w:t xml:space="preserve">    </w:t>
-      </w:r>
-      <w:proofErr w:type="spellStart"/>
-      <w:r>
-        <w:t>src</w:t>
-      </w:r>
-      <w:proofErr w:type="spellEnd"/>
-    </w:p>
-    <w:p>
-      <w:proofErr w:type="spellStart"/>
-      <w:r>
-        <w:t>cmake</w:t>
-      </w:r>
-      <w:proofErr w:type="spellEnd"/>
-      <w:r>
-        <w:t xml:space="preserve">    configure.ac    </w:t>
-      </w:r>
-      <w:proofErr w:type="gramStart"/>
-      <w:r>
-        <w:t>Doxyfile.in  include</w:t>
-      </w:r>
-      <w:proofErr w:type="gramEnd"/>
-      <w:r>
-        <w:t xml:space="preserve">          m4               README       </w:t>
-      </w:r>
-      <w:proofErr w:type="spellStart"/>
-      <w:r>
-        <w:t>rtl-sdr.rules</w:t>
-      </w:r>
-      <w:proofErr w:type="spellEnd"/>
+        <w:t>unicycle9312@Frequency:~ $ cp rtl-sdr/rtl_power/heatmap.py ~/sdr-monitor/</w:t>
+      </w:r>
+    </w:p>
+    <w:p>
+      <w:r>
+        <w:t>cp: cannot stat 'rtl-sdr/rtl_power/heatmap.py': No such file or directory</w:t>
+      </w:r>
+    </w:p>
+    <w:p>
+      <w:r>
+        <w:t>unicycle9312@Frequency:~ $ ls</w:t>
+      </w:r>
+    </w:p>
+    <w:p>
+      <w:r>
+        <w:t>Bookshelf  Desktop  Documents  Downloads  Music  Pictures  Public  rtl-sdr  Templates  Videos</w:t>
+      </w:r>
+    </w:p>
+    <w:p>
+      <w:r>
+        <w:t>unicycle9312@Frequency:~ $ cd rtl-sdr</w:t>
+      </w:r>
+    </w:p>
+    <w:p>
+      <w:r>
+        <w:t>unicycle9312@Frequency:~/rtl-sdr $ ls</w:t>
+      </w:r>
+    </w:p>
+    <w:p>
+      <w:r>
+        <w:t>AUTHORS  CMakeLists.txt  COPYING      git-version-gen  librtlsdr.pc.in  Makefile.am  rtlsdr.conf    src</w:t>
+      </w:r>
+    </w:p>
+    <w:p>
+      <w:r>
+        <w:t>cmake    configure.ac    Doxyfile.in  include          m4               README       rtl-sdr.rules</w:t>
+      </w:r>
     </w:p>
     <w:p/>
     <w:p>
@@ -2131,23 +1846,7 @@
     <w:p/>
     <w:p>
       <w:r>
-        <w:t>unicycle9312@</w:t>
-      </w:r>
-      <w:proofErr w:type="gramStart"/>
-      <w:r>
-        <w:t>Frequency:~</w:t>
-      </w:r>
-      <w:proofErr w:type="gramEnd"/>
-      <w:r>
-        <w:t>/</w:t>
-      </w:r>
-      <w:proofErr w:type="spellStart"/>
-      <w:r>
-        <w:t>rtl-sdr</w:t>
-      </w:r>
-      <w:proofErr w:type="spellEnd"/>
-      <w:r>
-        <w:t xml:space="preserve"> $ shutdown -h now</w:t>
+        <w:t>unicycle9312@Frequency:~/rtl-sdr $ shutdown -h now</w:t>
       </w:r>
     </w:p>
     <w:p>
@@ -2157,45 +1856,13 @@
     </w:p>
     <w:p>
       <w:r>
-        <w:t>unicycle9312@</w:t>
-      </w:r>
-      <w:proofErr w:type="gramStart"/>
-      <w:r>
-        <w:t>Frequency:~</w:t>
-      </w:r>
-      <w:proofErr w:type="gramEnd"/>
-      <w:r>
-        <w:t>/</w:t>
-      </w:r>
-      <w:proofErr w:type="spellStart"/>
-      <w:r>
-        <w:t>rtl-sdr</w:t>
-      </w:r>
-      <w:proofErr w:type="spellEnd"/>
-      <w:r>
-        <w:t xml:space="preserve"> $ </w:t>
-      </w:r>
-      <w:proofErr w:type="spellStart"/>
-      <w:r>
-        <w:t>sudo</w:t>
-      </w:r>
-      <w:proofErr w:type="spellEnd"/>
-      <w:r>
-        <w:t xml:space="preserve"> shutdown -h now</w:t>
-      </w:r>
-    </w:p>
-    <w:p/>
-    <w:p>
-      <w:r>
-        <w:t xml:space="preserve">Broadcast message from </w:t>
-      </w:r>
-      <w:proofErr w:type="spellStart"/>
-      <w:r>
-        <w:t>root@Frequency</w:t>
-      </w:r>
-      <w:proofErr w:type="spellEnd"/>
-      <w:r>
-        <w:t xml:space="preserve"> on pts/1 (Wed 2025-04-23 20:49:50 CDT):</w:t>
+        <w:t>unicycle9312@Frequency:~/rtl-sdr $ sudo shutdown -h now</w:t>
+      </w:r>
+    </w:p>
+    <w:p/>
+    <w:p>
+      <w:r>
+        <w:t>Broadcast message from root@Frequency on pts/1 (Wed 2025-04-23 20:49:50 CDT):</w:t>
       </w:r>
     </w:p>
     <w:p/>
@@ -2210,7 +1877,23 @@
       </w:r>
     </w:p>
     <w:p>
-      <w:r>
+      <w:pPr>
+        <w:rPr>
+          <w:b/>
+          <w:bCs/>
+          <w:sz w:val="32"/>
+          <w:szCs w:val="32"/>
+          <w:u w:val="single"/>
+        </w:rPr>
+      </w:pPr>
+      <w:r>
+        <w:rPr>
+          <w:b/>
+          <w:bCs/>
+          <w:sz w:val="32"/>
+          <w:szCs w:val="32"/>
+          <w:u w:val="single"/>
+        </w:rPr>
         <w:lastRenderedPageBreak/>
         <w:t>4/24/25</w:t>
       </w:r>
@@ -2251,35 +1934,7 @@
         <w:rPr>
           <w:rFonts w:ascii="Calibri" w:hAnsi="Calibri" w:cs="Calibri"/>
         </w:rPr>
-        <w:t xml:space="preserve">Enable VNC Server with </w:t>
-      </w:r>
-      <w:proofErr w:type="spellStart"/>
-      <w:r>
-        <w:rPr>
-          <w:rFonts w:ascii="Calibri" w:hAnsi="Calibri" w:cs="Calibri"/>
-        </w:rPr>
-        <w:t>sudo</w:t>
-      </w:r>
-      <w:proofErr w:type="spellEnd"/>
-      <w:r>
-        <w:rPr>
-          <w:rFonts w:ascii="Calibri" w:hAnsi="Calibri" w:cs="Calibri"/>
-        </w:rPr>
-        <w:t xml:space="preserve"> </w:t>
-      </w:r>
-      <w:proofErr w:type="spellStart"/>
-      <w:r>
-        <w:rPr>
-          <w:rFonts w:ascii="Calibri" w:hAnsi="Calibri" w:cs="Calibri"/>
-        </w:rPr>
-        <w:t>raspi</w:t>
-      </w:r>
-      <w:proofErr w:type="spellEnd"/>
-      <w:r>
-        <w:rPr>
-          <w:rFonts w:ascii="Calibri" w:hAnsi="Calibri" w:cs="Calibri"/>
-        </w:rPr>
-        <w:t>-config</w:t>
+        <w:t>Enable VNC Server with sudo raspi-config</w:t>
       </w:r>
     </w:p>
     <w:p/>
@@ -2329,67 +1984,20 @@
     <w:p/>
     <w:p/>
     <w:p>
-      <w:proofErr w:type="spellStart"/>
-      <w:r>
-        <w:t>sudo</w:t>
-      </w:r>
-      <w:proofErr w:type="spellEnd"/>
-      <w:r>
-        <w:t xml:space="preserve"> apt install </w:t>
-      </w:r>
-      <w:proofErr w:type="spellStart"/>
-      <w:r>
-        <w:t>rtl-sdr</w:t>
-      </w:r>
-      <w:proofErr w:type="spellEnd"/>
-      <w:r>
-        <w:t xml:space="preserve"> sox git python3-pip screen</w:t>
-      </w:r>
-    </w:p>
-    <w:p/>
-    <w:p>
-      <w:r>
-        <w:t xml:space="preserve">echo 'blacklist dvb_usb_rtl28xxu' | </w:t>
-      </w:r>
-      <w:proofErr w:type="spellStart"/>
-      <w:r>
-        <w:t>sudo</w:t>
-      </w:r>
-      <w:proofErr w:type="spellEnd"/>
-      <w:r>
-        <w:t xml:space="preserve"> tee /</w:t>
-      </w:r>
-      <w:proofErr w:type="spellStart"/>
-      <w:r>
-        <w:t>etc</w:t>
-      </w:r>
-      <w:proofErr w:type="spellEnd"/>
-      <w:r>
-        <w:t>/</w:t>
-      </w:r>
-      <w:proofErr w:type="spellStart"/>
-      <w:r>
-        <w:t>modprobe.d</w:t>
-      </w:r>
-      <w:proofErr w:type="spellEnd"/>
-      <w:r>
-        <w:t>/no-</w:t>
-      </w:r>
-      <w:proofErr w:type="spellStart"/>
-      <w:r>
-        <w:t>rtl.conf</w:t>
-      </w:r>
-      <w:proofErr w:type="spellEnd"/>
-    </w:p>
-    <w:p/>
-    <w:p>
-      <w:proofErr w:type="spellStart"/>
-      <w:r>
-        <w:t>sudo</w:t>
-      </w:r>
-      <w:proofErr w:type="spellEnd"/>
-      <w:r>
-        <w:t xml:space="preserve"> reboot</w:t>
+      <w:r>
+        <w:t>sudo apt install rtl-sdr sox git python3-pip screen</w:t>
+      </w:r>
+    </w:p>
+    <w:p/>
+    <w:p>
+      <w:r>
+        <w:t>echo 'blacklist dvb_usb_rtl28xxu' | sudo tee /etc/modprobe.d/no-rtl.conf</w:t>
+      </w:r>
+    </w:p>
+    <w:p/>
+    <w:p>
+      <w:r>
+        <w:t>sudo reboot</w:t>
       </w:r>
     </w:p>
     <w:p/>
@@ -2401,66 +2009,25 @@
           <w:strike/>
         </w:rPr>
       </w:pPr>
-      <w:proofErr w:type="spellStart"/>
       <w:r>
         <w:rPr>
           <w:i/>
           <w:iCs/>
           <w:strike/>
         </w:rPr>
-        <w:t>rtl_power</w:t>
-      </w:r>
-      <w:proofErr w:type="spellEnd"/>
-      <w:r>
-        <w:rPr>
-          <w:i/>
-          <w:iCs/>
-          <w:strike/>
-        </w:rPr>
-        <w:t xml:space="preserve"> -f 440M:450M:25k -</w:t>
-      </w:r>
-      <w:proofErr w:type="spellStart"/>
-      <w:r>
-        <w:rPr>
-          <w:i/>
-          <w:iCs/>
-          <w:strike/>
-        </w:rPr>
-        <w:t>i</w:t>
-      </w:r>
-      <w:proofErr w:type="spellEnd"/>
-      <w:r>
-        <w:rPr>
-          <w:i/>
-          <w:iCs/>
-          <w:strike/>
-        </w:rPr>
-        <w:t xml:space="preserve"> 15s -e 1h traffic.csv</w:t>
-      </w:r>
-    </w:p>
-    <w:p>
-      <w:proofErr w:type="spellStart"/>
+        <w:t>rtl_power -f 440M:450M:25k -i 15s -e 1h traffic.csv</w:t>
+      </w:r>
+    </w:p>
+    <w:p>
       <w:r>
         <w:lastRenderedPageBreak/>
-        <w:t>rtl_power</w:t>
-      </w:r>
-      <w:proofErr w:type="spellEnd"/>
-      <w:r>
-        <w:t xml:space="preserve"> -f 4</w:t>
+        <w:t>rtl_power -f 4</w:t>
       </w:r>
       <w:r>
         <w:t>3</w:t>
       </w:r>
       <w:r>
-        <w:t>0M:450M:25k -</w:t>
-      </w:r>
-      <w:proofErr w:type="spellStart"/>
-      <w:r>
-        <w:t>i</w:t>
-      </w:r>
-      <w:proofErr w:type="spellEnd"/>
-      <w:r>
-        <w:t xml:space="preserve"> 15s -e 1h traffic.csv</w:t>
+        <w:t>0M:450M:25k -i 15s -e 1h traffic.csv</w:t>
       </w:r>
     </w:p>
     <w:p/>
@@ -2515,13 +2082,8 @@
     </w:p>
     <w:p/>
     <w:p>
-      <w:proofErr w:type="spellStart"/>
-      <w:r>
-        <w:t>rtl_power</w:t>
-      </w:r>
-      <w:proofErr w:type="spellEnd"/>
-      <w:r>
-        <w:t xml:space="preserve"> -f 4</w:t>
+      <w:r>
+        <w:t>rtl_power -f 4</w:t>
       </w:r>
       <w:r>
         <w:t>3</w:t>
@@ -2545,15 +2107,7 @@
         <w:t>000</w:t>
       </w:r>
       <w:r>
-        <w:t xml:space="preserve"> -</w:t>
-      </w:r>
-      <w:proofErr w:type="spellStart"/>
-      <w:r>
-        <w:t>i</w:t>
-      </w:r>
-      <w:proofErr w:type="spellEnd"/>
-      <w:r>
-        <w:t xml:space="preserve"> 15s -e 1h traffic</w:t>
+        <w:t xml:space="preserve"> -i 15s -e 1h traffic</w:t>
       </w:r>
       <w:r>
         <w:t>2</w:t>
@@ -2569,7 +2123,23 @@
       </w:r>
     </w:p>
     <w:p>
-      <w:r>
+      <w:pPr>
+        <w:rPr>
+          <w:b/>
+          <w:bCs/>
+          <w:sz w:val="32"/>
+          <w:szCs w:val="32"/>
+          <w:u w:val="single"/>
+        </w:rPr>
+      </w:pPr>
+      <w:r>
+        <w:rPr>
+          <w:b/>
+          <w:bCs/>
+          <w:sz w:val="32"/>
+          <w:szCs w:val="32"/>
+          <w:u w:val="single"/>
+        </w:rPr>
         <w:lastRenderedPageBreak/>
         <w:t>04/25/25</w:t>
       </w:r>
@@ -2631,15 +2201,7 @@
     <w:p/>
     <w:p>
       <w:r>
-        <w:t>heatmap.py': [</w:t>
-      </w:r>
-      <w:proofErr w:type="spellStart"/>
-      <w:r>
-        <w:t>Errno</w:t>
-      </w:r>
-      <w:proofErr w:type="spellEnd"/>
-      <w:r>
-        <w:t xml:space="preserve"> 2] No such file or directory</w:t>
+        <w:t>heatmap.py': [Errno 2] No such file or directory</w:t>
       </w:r>
     </w:p>
     <w:p/>
@@ -2650,29 +2212,13 @@
     </w:p>
     <w:p>
       <w:r>
-        <w:t>cd ~/</w:t>
-      </w:r>
-      <w:proofErr w:type="spellStart"/>
-      <w:r>
-        <w:t>sdr</w:t>
-      </w:r>
-      <w:proofErr w:type="spellEnd"/>
-      <w:r>
-        <w:t>-monitor</w:t>
-      </w:r>
-    </w:p>
-    <w:p/>
-    <w:p>
-      <w:r>
-        <w:t>~/Documents/Repositories/D-Star/</w:t>
-      </w:r>
-      <w:proofErr w:type="spellStart"/>
-      <w:r>
-        <w:t>Frequency_Survey</w:t>
-      </w:r>
-      <w:proofErr w:type="spellEnd"/>
-      <w:r>
-        <w:t>/Data/2025_04_24</w:t>
+        <w:t>cd ~/sdr-monitor</w:t>
+      </w:r>
+    </w:p>
+    <w:p/>
+    <w:p>
+      <w:r>
+        <w:t>~/Documents/Repositories/D-Star/Frequency_Survey/Data/2025_04_24</w:t>
       </w:r>
     </w:p>
     <w:p>
@@ -2695,68 +2241,32 @@
           <w:bCs/>
           <w:color w:val="00B050"/>
         </w:rPr>
-        <w:t>cd ~/</w:t>
-      </w:r>
-      <w:proofErr w:type="spellStart"/>
-      <w:r>
+        <w:t>cd ~/sdr-monitor</w:t>
+      </w:r>
+    </w:p>
+    <w:p>
+      <w:pPr>
         <w:rPr>
           <w:b/>
           <w:bCs/>
           <w:color w:val="00B050"/>
         </w:rPr>
-        <w:t>sdr</w:t>
-      </w:r>
-      <w:proofErr w:type="spellEnd"/>
+      </w:pPr>
       <w:r>
         <w:rPr>
           <w:b/>
           <w:bCs/>
           <w:color w:val="00B050"/>
         </w:rPr>
-        <w:t>-monitor</w:t>
-      </w:r>
-    </w:p>
-    <w:p>
-      <w:pPr>
+        <w:t xml:space="preserve">python3 heatmap.py  </w:t>
+      </w:r>
+      <w:r>
         <w:rPr>
           <w:b/>
           <w:bCs/>
           <w:color w:val="00B050"/>
         </w:rPr>
-      </w:pPr>
-      <w:r>
-        <w:rPr>
-          <w:b/>
-          <w:bCs/>
-          <w:color w:val="00B050"/>
-        </w:rPr>
-        <w:t xml:space="preserve">python3 </w:t>
-      </w:r>
-      <w:proofErr w:type="gramStart"/>
-      <w:r>
-        <w:rPr>
-          <w:b/>
-          <w:bCs/>
-          <w:color w:val="00B050"/>
-        </w:rPr>
-        <w:t xml:space="preserve">heatmap.py  </w:t>
-      </w:r>
-      <w:r>
-        <w:rPr>
-          <w:b/>
-          <w:bCs/>
-          <w:color w:val="00B050"/>
-        </w:rPr>
-        <w:t>~</w:t>
-      </w:r>
-      <w:proofErr w:type="gramEnd"/>
-      <w:r>
-        <w:rPr>
-          <w:b/>
-          <w:bCs/>
-          <w:color w:val="00B050"/>
-        </w:rPr>
-        <w:t>/Documents/Repositories/D-Star/Frequency_Survey/Data/2025_04_24</w:t>
+        <w:t>~/Documents/Repositories/D-Star/Frequency_Survey/Data/2025_04_24</w:t>
       </w:r>
       <w:r>
         <w:rPr>
@@ -2823,133 +2333,22 @@
     </w:p>
     <w:p>
       <w:r>
-        <w:t>/home/unicycle9312/</w:t>
-      </w:r>
-      <w:proofErr w:type="spellStart"/>
-      <w:r>
-        <w:t>sdr</w:t>
-      </w:r>
-      <w:proofErr w:type="spellEnd"/>
-      <w:r>
-        <w:t xml:space="preserve">-monitor/heatmap.py:470: </w:t>
-      </w:r>
-      <w:proofErr w:type="spellStart"/>
-      <w:r>
-        <w:t>DeprecationWarning</w:t>
-      </w:r>
-      <w:proofErr w:type="spellEnd"/>
-      <w:r>
-        <w:t xml:space="preserve">: </w:t>
-      </w:r>
-      <w:proofErr w:type="spellStart"/>
-      <w:r>
-        <w:t>getsize</w:t>
-      </w:r>
-      <w:proofErr w:type="spellEnd"/>
-      <w:r>
-        <w:t xml:space="preserve"> is deprecated and will be removed in Pillow 10 (2023-07-01). Use </w:t>
-      </w:r>
-      <w:proofErr w:type="spellStart"/>
-      <w:r>
-        <w:t>getbbox</w:t>
-      </w:r>
-      <w:proofErr w:type="spellEnd"/>
-      <w:r>
-        <w:t xml:space="preserve"> or </w:t>
-      </w:r>
-      <w:proofErr w:type="spellStart"/>
-      <w:r>
-        <w:t>getlength</w:t>
-      </w:r>
-      <w:proofErr w:type="spellEnd"/>
-      <w:r>
-        <w:t xml:space="preserve"> instead.</w:t>
-      </w:r>
-    </w:p>
-    <w:p>
-      <w:r>
-        <w:t xml:space="preserve">  s = </w:t>
-      </w:r>
-      <w:proofErr w:type="spellStart"/>
-      <w:proofErr w:type="gramStart"/>
-      <w:r>
-        <w:t>f.getsize</w:t>
-      </w:r>
-      <w:proofErr w:type="spellEnd"/>
-      <w:proofErr w:type="gramEnd"/>
-      <w:r>
-        <w:t>(label)</w:t>
-      </w:r>
-    </w:p>
-    <w:p>
-      <w:r>
-        <w:t>/home/unicycle9312/</w:t>
-      </w:r>
-      <w:proofErr w:type="spellStart"/>
-      <w:r>
-        <w:t>sdr</w:t>
-      </w:r>
-      <w:proofErr w:type="spellEnd"/>
-      <w:r>
-        <w:t xml:space="preserve">-monitor/heatmap.py:475: </w:t>
-      </w:r>
-      <w:proofErr w:type="spellStart"/>
-      <w:r>
-        <w:t>DeprecationWarning</w:t>
-      </w:r>
-      <w:proofErr w:type="spellEnd"/>
-      <w:r>
-        <w:t xml:space="preserve">: ANTIALIAS is deprecated and will be removed in Pillow 10 (2023-07-01). Use LANCZOS or </w:t>
-      </w:r>
-      <w:proofErr w:type="spellStart"/>
-      <w:r>
-        <w:t>Resampling.LANCZOS</w:t>
-      </w:r>
-      <w:proofErr w:type="spellEnd"/>
-      <w:r>
-        <w:t xml:space="preserve"> instead.</w:t>
-      </w:r>
-    </w:p>
-    <w:p>
-      <w:r>
-        <w:t xml:space="preserve">  return </w:t>
-      </w:r>
-      <w:proofErr w:type="spellStart"/>
-      <w:r>
-        <w:t>w_</w:t>
-      </w:r>
-      <w:proofErr w:type="gramStart"/>
-      <w:r>
-        <w:t>img.resize</w:t>
-      </w:r>
-      <w:proofErr w:type="spellEnd"/>
-      <w:proofErr w:type="gramEnd"/>
-      <w:r>
-        <w:t>((</w:t>
-      </w:r>
-      <w:proofErr w:type="gramStart"/>
-      <w:r>
-        <w:t>s[0]/</w:t>
-      </w:r>
-      <w:proofErr w:type="gramEnd"/>
-      <w:r>
-        <w:t xml:space="preserve">/3, </w:t>
-      </w:r>
-      <w:proofErr w:type="gramStart"/>
-      <w:r>
-        <w:t>s[</w:t>
-      </w:r>
-      <w:proofErr w:type="gramEnd"/>
-      <w:r>
-        <w:t xml:space="preserve">1]//3), </w:t>
-      </w:r>
-      <w:proofErr w:type="spellStart"/>
-      <w:r>
-        <w:t>Image.ANTIALIAS</w:t>
-      </w:r>
-      <w:proofErr w:type="spellEnd"/>
-      <w:r>
-        <w:t>)</w:t>
+        <w:t>/home/unicycle9312/sdr-monitor/heatmap.py:470: DeprecationWarning: getsize is deprecated and will be removed in Pillow 10 (2023-07-01). Use getbbox or getlength instead.</w:t>
+      </w:r>
+    </w:p>
+    <w:p>
+      <w:r>
+        <w:t xml:space="preserve">  s = f.getsize(label)</w:t>
+      </w:r>
+    </w:p>
+    <w:p>
+      <w:r>
+        <w:t>/home/unicycle9312/sdr-monitor/heatmap.py:475: DeprecationWarning: ANTIALIAS is deprecated and will be removed in Pillow 10 (2023-07-01). Use LANCZOS or Resampling.LANCZOS instead.</w:t>
+      </w:r>
+    </w:p>
+    <w:p>
+      <w:r>
+        <w:t xml:space="preserve">  return w_img.resize((s[0]//3, s[1]//3), Image.ANTIALIAS)</w:t>
       </w:r>
     </w:p>
     <w:p>
@@ -2994,25 +2393,23 @@
           <w:bCs/>
           <w:color w:val="00B050"/>
         </w:rPr>
-        <w:t xml:space="preserve">python3 </w:t>
-      </w:r>
-      <w:proofErr w:type="gramStart"/>
+        <w:t>python3 heatmap.py  ~/Documents/Repositories/D-Star/Frequency_Survey/Data/2025_04_24/traffic</w:t>
+      </w:r>
       <w:r>
         <w:rPr>
           <w:b/>
           <w:bCs/>
           <w:color w:val="00B050"/>
         </w:rPr>
-        <w:t>heatmap.py  ~</w:t>
-      </w:r>
-      <w:proofErr w:type="gramEnd"/>
+        <w:t>2</w:t>
+      </w:r>
       <w:r>
         <w:rPr>
           <w:b/>
           <w:bCs/>
           <w:color w:val="00B050"/>
         </w:rPr>
-        <w:t>/Documents/Repositories/D-Star/Frequency_Survey/Data/2025_04_24/traffic</w:t>
+        <w:t>.csv ~/Documents/Repositories/D-Star/Frequency_Survey/Data/2025_04_24/Traffic_Map</w:t>
       </w:r>
       <w:r>
         <w:rPr>
@@ -3028,28 +2425,15 @@
           <w:bCs/>
           <w:color w:val="00B050"/>
         </w:rPr>
-        <w:t>.csv ~/Documents/Repositories/D-Star/Frequency_Survey/Data/2025_04_24/Traffic_Map</w:t>
-      </w:r>
-      <w:r>
-        <w:rPr>
-          <w:b/>
-          <w:bCs/>
-          <w:color w:val="00B050"/>
-        </w:rPr>
-        <w:t>2</w:t>
-      </w:r>
-      <w:r>
-        <w:rPr>
-          <w:b/>
-          <w:bCs/>
-          <w:color w:val="00B050"/>
-        </w:rPr>
         <w:t>.png</w:t>
       </w:r>
     </w:p>
     <w:p/>
     <w:p>
       <w:r>
+        <w:rPr>
+          <w:noProof/>
+        </w:rPr>
         <w:drawing>
           <wp:inline distT="0" distB="0" distL="0" distR="0" wp14:anchorId="7CDF07F4" wp14:editId="611F6A90">
             <wp:extent cx="5943600" cy="1537970"/>
@@ -3090,6 +2474,9 @@
     <w:p/>
     <w:p>
       <w:r>
+        <w:rPr>
+          <w:noProof/>
+        </w:rPr>
         <w:lastRenderedPageBreak/>
         <w:drawing>
           <wp:inline distT="0" distB="0" distL="0" distR="0" wp14:anchorId="49594325" wp14:editId="45E9794E">
@@ -3723,15 +3110,7 @@
         <w:t>No major new signals</w:t>
       </w:r>
       <w:r>
-        <w:t xml:space="preserve">, suggesting low variation in traffic during this </w:t>
-      </w:r>
-      <w:proofErr w:type="gramStart"/>
-      <w:r>
-        <w:t>time period</w:t>
-      </w:r>
-      <w:proofErr w:type="gramEnd"/>
-      <w:r>
-        <w:t>.</w:t>
+        <w:t>, suggesting low variation in traffic during this time period.</w:t>
       </w:r>
     </w:p>
     <w:p>
@@ -4028,15 +3407,7 @@
           </w:tcPr>
           <w:p>
             <w:r>
-              <w:t xml:space="preserve">Possible </w:t>
-            </w:r>
-            <w:proofErr w:type="gramStart"/>
-            <w:r>
-              <w:t>repeater</w:t>
-            </w:r>
-            <w:proofErr w:type="gramEnd"/>
-            <w:r>
-              <w:t xml:space="preserve"> outputs or unused frequencies</w:t>
+              <w:t>Possible repeater outputs or unused frequencies</w:t>
             </w:r>
           </w:p>
         </w:tc>
@@ -4196,15 +3567,7 @@
         <w:t>tuning in live</w:t>
       </w:r>
       <w:r>
-        <w:t xml:space="preserve"> with </w:t>
-      </w:r>
-      <w:proofErr w:type="spellStart"/>
-      <w:r>
-        <w:t>gqrx</w:t>
-      </w:r>
-      <w:proofErr w:type="spellEnd"/>
-      <w:r>
-        <w:t xml:space="preserve"> or SDR++</w:t>
+        <w:t xml:space="preserve"> with gqrx or SDR++</w:t>
       </w:r>
     </w:p>
     <w:p>
@@ -4225,15 +3588,7 @@
         <w:t>dstar_demod.py</w:t>
       </w:r>
       <w:r>
-        <w:t xml:space="preserve"> or </w:t>
-      </w:r>
-      <w:proofErr w:type="spellStart"/>
-      <w:r>
-        <w:t>dsd</w:t>
-      </w:r>
-      <w:proofErr w:type="spellEnd"/>
-      <w:r>
-        <w:t xml:space="preserve"> to try decoding</w:t>
+        <w:t xml:space="preserve"> or dsd to try decoding</w:t>
       </w:r>
     </w:p>
     <w:p>
@@ -4279,6 +3634,323 @@
     </w:p>
     <w:p/>
     <w:p/>
+    <w:p>
+      <w:pPr>
+        <w:rPr>
+          <w:b/>
+          <w:bCs/>
+          <w:sz w:val="32"/>
+          <w:szCs w:val="32"/>
+          <w:u w:val="single"/>
+        </w:rPr>
+      </w:pPr>
+      <w:r>
+        <w:rPr>
+          <w:b/>
+          <w:bCs/>
+          <w:sz w:val="32"/>
+          <w:szCs w:val="32"/>
+          <w:u w:val="single"/>
+        </w:rPr>
+        <w:t>Steve’s Next Steps</w:t>
+      </w:r>
+      <w:r>
+        <w:rPr>
+          <w:b/>
+          <w:bCs/>
+          <w:sz w:val="32"/>
+          <w:szCs w:val="32"/>
+          <w:u w:val="single"/>
+        </w:rPr>
+        <w:t>:</w:t>
+      </w:r>
+    </w:p>
+    <w:p/>
+    <w:p>
+      <w:r>
+        <w:t>RTL-SDR Above:</w:t>
+      </w:r>
+    </w:p>
+    <w:p>
+      <w:pPr>
+        <w:pStyle w:val="ListParagraph"/>
+        <w:numPr>
+          <w:ilvl w:val="0"/>
+          <w:numId w:val="12"/>
+        </w:numPr>
+      </w:pPr>
+      <w:r>
+        <w:t xml:space="preserve">Eliminate 430 – 439 due to continuous strong activity </w:t>
+      </w:r>
+    </w:p>
+    <w:p>
+      <w:pPr>
+        <w:pStyle w:val="ListParagraph"/>
+        <w:numPr>
+          <w:ilvl w:val="0"/>
+          <w:numId w:val="12"/>
+        </w:numPr>
+      </w:pPr>
+      <w:r>
+        <w:t>Even if I don’t interfere with them, they might interfere enough to mess me up at low power</w:t>
+      </w:r>
+    </w:p>
+    <w:p/>
+    <w:p>
+      <w:r>
+        <w:t>Previous ChatGPT Targets</w:t>
+      </w:r>
+      <w:r>
+        <w:t>:</w:t>
+      </w:r>
+    </w:p>
+    <w:p>
+      <w:pPr>
+        <w:pStyle w:val="ListParagraph"/>
+        <w:numPr>
+          <w:ilvl w:val="0"/>
+          <w:numId w:val="12"/>
+        </w:numPr>
+      </w:pPr>
+      <w:r>
+        <w:t>Remaining Recommendations</w:t>
+      </w:r>
+    </w:p>
+    <w:p>
+      <w:pPr>
+        <w:pStyle w:val="ListParagraph"/>
+        <w:numPr>
+          <w:ilvl w:val="1"/>
+          <w:numId w:val="12"/>
+        </w:numPr>
+      </w:pPr>
+      <w:r>
+        <w:t>446.5</w:t>
+      </w:r>
+      <w:r>
+        <w:t>00</w:t>
+      </w:r>
+    </w:p>
+    <w:p>
+      <w:pPr>
+        <w:pStyle w:val="ListParagraph"/>
+        <w:numPr>
+          <w:ilvl w:val="1"/>
+          <w:numId w:val="12"/>
+        </w:numPr>
+      </w:pPr>
+      <w:r>
+        <w:t>446.525</w:t>
+      </w:r>
+    </w:p>
+    <w:p>
+      <w:pPr>
+        <w:pStyle w:val="ListParagraph"/>
+        <w:numPr>
+          <w:ilvl w:val="1"/>
+          <w:numId w:val="12"/>
+        </w:numPr>
+      </w:pPr>
+      <w:r>
+        <w:t>446.550</w:t>
+      </w:r>
+    </w:p>
+    <w:p/>
+    <w:p>
+      <w:r>
+        <w:t>Band Plan:</w:t>
+      </w:r>
+    </w:p>
+    <w:tbl>
+      <w:tblPr>
+        <w:tblW w:w="0" w:type="auto"/>
+        <w:tblCellSpacing w:w="15" w:type="dxa"/>
+        <w:tblCellMar>
+          <w:top w:w="15" w:type="dxa"/>
+          <w:left w:w="15" w:type="dxa"/>
+          <w:bottom w:w="15" w:type="dxa"/>
+          <w:right w:w="15" w:type="dxa"/>
+        </w:tblCellMar>
+        <w:tblLook w:val="04A0" w:firstRow="1" w:lastRow="0" w:firstColumn="1" w:lastColumn="0" w:noHBand="0" w:noVBand="1"/>
+      </w:tblPr>
+      <w:tblGrid>
+        <w:gridCol w:w="3920"/>
+        <w:gridCol w:w="5440"/>
+      </w:tblGrid>
+      <w:tr>
+        <w:trPr>
+          <w:tblCellSpacing w:w="15" w:type="dxa"/>
+        </w:trPr>
+        <w:tc>
+          <w:tcPr>
+            <w:tcW w:w="0" w:type="auto"/>
+            <w:vAlign w:val="center"/>
+            <w:hideMark/>
+          </w:tcPr>
+          <w:p>
+            <w:r>
+              <w:lastRenderedPageBreak/>
+              <w:t>445.00-447.00</w:t>
+            </w:r>
+          </w:p>
+        </w:tc>
+        <w:tc>
+          <w:tcPr>
+            <w:tcW w:w="0" w:type="auto"/>
+            <w:vAlign w:val="center"/>
+            <w:hideMark/>
+          </w:tcPr>
+          <w:p>
+            <w:r>
+              <w:t>Shared by auxiliary and control links, repeaters and simplex (local option)</w:t>
+            </w:r>
+          </w:p>
+        </w:tc>
+      </w:tr>
+      <w:tr>
+        <w:trPr>
+          <w:tblCellSpacing w:w="15" w:type="dxa"/>
+        </w:trPr>
+        <w:tc>
+          <w:tcPr>
+            <w:tcW w:w="0" w:type="auto"/>
+            <w:vAlign w:val="center"/>
+          </w:tcPr>
+          <w:p>
+            <w:r>
+              <w:t>KF5</w:t>
+            </w:r>
+            <w:r>
+              <w:t xml:space="preserve">SCI  B </w:t>
+            </w:r>
+            <w:r>
+              <w:t xml:space="preserve">  44</w:t>
+            </w:r>
+            <w:r>
+              <w:t>7.750</w:t>
+            </w:r>
+            <w:r>
+              <w:t xml:space="preserve"> – 5.000  </w:t>
+            </w:r>
+            <w:r>
+              <w:sym w:font="Wingdings" w:char="F0E0"/>
+            </w:r>
+            <w:r>
+              <w:t xml:space="preserve"> </w:t>
+            </w:r>
+            <w:r>
+              <w:t>447.750 and 442.750</w:t>
+            </w:r>
+          </w:p>
+          <w:p/>
+          <w:p/>
+          <w:p>
+            <w:r>
+              <w:t>A</w:t>
+            </w:r>
+            <w:r>
+              <w:t xml:space="preserve">F5SH-D  449.600 </w:t>
+            </w:r>
+            <w:r>
+              <w:t>–</w:t>
+            </w:r>
+            <w:r>
+              <w:t xml:space="preserve"> </w:t>
+            </w:r>
+            <w:r>
+              <w:t xml:space="preserve">6.00 </w:t>
+            </w:r>
+            <w:r>
+              <w:sym w:font="Wingdings" w:char="F0E0"/>
+            </w:r>
+            <w:r>
+              <w:t xml:space="preserve"> 449.600 and </w:t>
+            </w:r>
+            <w:r>
+              <w:t>443.600</w:t>
+            </w:r>
+          </w:p>
+        </w:tc>
+        <w:tc>
+          <w:tcPr>
+            <w:tcW w:w="0" w:type="auto"/>
+            <w:vAlign w:val="center"/>
+          </w:tcPr>
+          <w:p/>
+        </w:tc>
+      </w:tr>
+    </w:tbl>
+    <w:p>
+      <w:pPr>
+        <w:ind w:left="720"/>
+      </w:pPr>
+    </w:p>
+    <w:p/>
+    <w:p>
+      <w:r>
+        <w:t xml:space="preserve">Scan </w:t>
+      </w:r>
+      <w:r>
+        <w:t>445.000 – 447.000</w:t>
+      </w:r>
+    </w:p>
+    <w:p/>
+    <w:p>
+      <w:r>
+        <w:t>rtl_power -f 4</w:t>
+      </w:r>
+      <w:r>
+        <w:t>45</w:t>
+      </w:r>
+      <w:r>
+        <w:t>M:4</w:t>
+      </w:r>
+      <w:r>
+        <w:t>47</w:t>
+      </w:r>
+      <w:r>
+        <w:t xml:space="preserve">M:25k -i 15s -e 1h </w:t>
+      </w:r>
+      <w:r>
+        <w:t>simplex1</w:t>
+      </w:r>
+      <w:r>
+        <w:t>.csv</w:t>
+      </w:r>
+    </w:p>
+    <w:p/>
+    <w:p>
+      <w:r>
+        <w:t>rtl_power -f 4</w:t>
+      </w:r>
+      <w:r>
+        <w:t>45</w:t>
+      </w:r>
+      <w:r>
+        <w:t>M:4</w:t>
+      </w:r>
+      <w:r>
+        <w:t>47</w:t>
+      </w:r>
+      <w:r>
+        <w:t xml:space="preserve">M:25k -i 15s -e </w:t>
+      </w:r>
+      <w:r>
+        <w:t>24</w:t>
+      </w:r>
+      <w:r>
+        <w:t xml:space="preserve">h </w:t>
+      </w:r>
+      <w:r>
+        <w:t>simplex</w:t>
+      </w:r>
+      <w:r>
+        <w:t>24</w:t>
+      </w:r>
+      <w:r>
+        <w:t>.csv</w:t>
+      </w:r>
+    </w:p>
     <w:p/>
     <w:p/>
     <w:sectPr>
@@ -5188,6 +4860,119 @@
     </w:lvl>
   </w:abstractNum>
   <w:abstractNum w:abstractNumId="6" w15:restartNumberingAfterBreak="0">
+    <w:nsid w:val="55364149"/>
+    <w:multiLevelType w:val="hybridMultilevel"/>
+    <w:tmpl w:val="8EEEC712"/>
+    <w:lvl w:ilvl="0" w:tplc="04090001">
+      <w:start w:val="1"/>
+      <w:numFmt w:val="bullet"/>
+      <w:lvlText w:val=""/>
+      <w:lvlJc w:val="left"/>
+      <w:pPr>
+        <w:ind w:left="720" w:hanging="360"/>
+      </w:pPr>
+      <w:rPr>
+        <w:rFonts w:ascii="Symbol" w:hAnsi="Symbol" w:hint="default"/>
+      </w:rPr>
+    </w:lvl>
+    <w:lvl w:ilvl="1" w:tplc="04090003">
+      <w:start w:val="1"/>
+      <w:numFmt w:val="bullet"/>
+      <w:lvlText w:val="o"/>
+      <w:lvlJc w:val="left"/>
+      <w:pPr>
+        <w:ind w:left="1440" w:hanging="360"/>
+      </w:pPr>
+      <w:rPr>
+        <w:rFonts w:ascii="Courier New" w:hAnsi="Courier New" w:cs="Courier New" w:hint="default"/>
+      </w:rPr>
+    </w:lvl>
+    <w:lvl w:ilvl="2" w:tplc="04090005" w:tentative="1">
+      <w:start w:val="1"/>
+      <w:numFmt w:val="bullet"/>
+      <w:lvlText w:val=""/>
+      <w:lvlJc w:val="left"/>
+      <w:pPr>
+        <w:ind w:left="2160" w:hanging="360"/>
+      </w:pPr>
+      <w:rPr>
+        <w:rFonts w:ascii="Wingdings" w:hAnsi="Wingdings" w:hint="default"/>
+      </w:rPr>
+    </w:lvl>
+    <w:lvl w:ilvl="3" w:tplc="04090001" w:tentative="1">
+      <w:start w:val="1"/>
+      <w:numFmt w:val="bullet"/>
+      <w:lvlText w:val=""/>
+      <w:lvlJc w:val="left"/>
+      <w:pPr>
+        <w:ind w:left="2880" w:hanging="360"/>
+      </w:pPr>
+      <w:rPr>
+        <w:rFonts w:ascii="Symbol" w:hAnsi="Symbol" w:hint="default"/>
+      </w:rPr>
+    </w:lvl>
+    <w:lvl w:ilvl="4" w:tplc="04090003" w:tentative="1">
+      <w:start w:val="1"/>
+      <w:numFmt w:val="bullet"/>
+      <w:lvlText w:val="o"/>
+      <w:lvlJc w:val="left"/>
+      <w:pPr>
+        <w:ind w:left="3600" w:hanging="360"/>
+      </w:pPr>
+      <w:rPr>
+        <w:rFonts w:ascii="Courier New" w:hAnsi="Courier New" w:cs="Courier New" w:hint="default"/>
+      </w:rPr>
+    </w:lvl>
+    <w:lvl w:ilvl="5" w:tplc="04090005" w:tentative="1">
+      <w:start w:val="1"/>
+      <w:numFmt w:val="bullet"/>
+      <w:lvlText w:val=""/>
+      <w:lvlJc w:val="left"/>
+      <w:pPr>
+        <w:ind w:left="4320" w:hanging="360"/>
+      </w:pPr>
+      <w:rPr>
+        <w:rFonts w:ascii="Wingdings" w:hAnsi="Wingdings" w:hint="default"/>
+      </w:rPr>
+    </w:lvl>
+    <w:lvl w:ilvl="6" w:tplc="04090001" w:tentative="1">
+      <w:start w:val="1"/>
+      <w:numFmt w:val="bullet"/>
+      <w:lvlText w:val=""/>
+      <w:lvlJc w:val="left"/>
+      <w:pPr>
+        <w:ind w:left="5040" w:hanging="360"/>
+      </w:pPr>
+      <w:rPr>
+        <w:rFonts w:ascii="Symbol" w:hAnsi="Symbol" w:hint="default"/>
+      </w:rPr>
+    </w:lvl>
+    <w:lvl w:ilvl="7" w:tplc="04090003" w:tentative="1">
+      <w:start w:val="1"/>
+      <w:numFmt w:val="bullet"/>
+      <w:lvlText w:val="o"/>
+      <w:lvlJc w:val="left"/>
+      <w:pPr>
+        <w:ind w:left="5760" w:hanging="360"/>
+      </w:pPr>
+      <w:rPr>
+        <w:rFonts w:ascii="Courier New" w:hAnsi="Courier New" w:cs="Courier New" w:hint="default"/>
+      </w:rPr>
+    </w:lvl>
+    <w:lvl w:ilvl="8" w:tplc="04090005" w:tentative="1">
+      <w:start w:val="1"/>
+      <w:numFmt w:val="bullet"/>
+      <w:lvlText w:val=""/>
+      <w:lvlJc w:val="left"/>
+      <w:pPr>
+        <w:ind w:left="6480" w:hanging="360"/>
+      </w:pPr>
+      <w:rPr>
+        <w:rFonts w:ascii="Wingdings" w:hAnsi="Wingdings" w:hint="default"/>
+      </w:rPr>
+    </w:lvl>
+  </w:abstractNum>
+  <w:abstractNum w:abstractNumId="7" w15:restartNumberingAfterBreak="0">
     <w:nsid w:val="56E54577"/>
     <w:multiLevelType w:val="multilevel"/>
     <w:tmpl w:val="3110975A"/>
@@ -5336,7 +5121,7 @@
       </w:rPr>
     </w:lvl>
   </w:abstractNum>
-  <w:abstractNum w:abstractNumId="7" w15:restartNumberingAfterBreak="0">
+  <w:abstractNum w:abstractNumId="8" w15:restartNumberingAfterBreak="0">
     <w:nsid w:val="5EB80AEC"/>
     <w:multiLevelType w:val="multilevel"/>
     <w:tmpl w:val="7B700978"/>
@@ -5485,7 +5270,7 @@
       </w:rPr>
     </w:lvl>
   </w:abstractNum>
-  <w:abstractNum w:abstractNumId="8" w15:restartNumberingAfterBreak="0">
+  <w:abstractNum w:abstractNumId="9" w15:restartNumberingAfterBreak="0">
     <w:nsid w:val="615F4899"/>
     <w:multiLevelType w:val="multilevel"/>
     <w:tmpl w:val="C9266CD0"/>
@@ -5625,7 +5410,7 @@
       </w:rPr>
     </w:lvl>
   </w:abstractNum>
-  <w:abstractNum w:abstractNumId="9" w15:restartNumberingAfterBreak="0">
+  <w:abstractNum w:abstractNumId="10" w15:restartNumberingAfterBreak="0">
     <w:nsid w:val="728521D6"/>
     <w:multiLevelType w:val="multilevel"/>
     <w:tmpl w:val="7A00D950"/>
@@ -5774,7 +5559,7 @@
       </w:rPr>
     </w:lvl>
   </w:abstractNum>
-  <w:abstractNum w:abstractNumId="10" w15:restartNumberingAfterBreak="0">
+  <w:abstractNum w:abstractNumId="11" w15:restartNumberingAfterBreak="0">
     <w:nsid w:val="7A9E54C7"/>
     <w:multiLevelType w:val="multilevel"/>
     <w:tmpl w:val="5C34A218"/>
@@ -5942,19 +5727,22 @@
     <w:abstractNumId w:val="0"/>
   </w:num>
   <w:num w:numId="7" w16cid:durableId="751925626">
+    <w:abstractNumId w:val="9"/>
+  </w:num>
+  <w:num w:numId="8" w16cid:durableId="916011410">
+    <w:abstractNumId w:val="10"/>
+  </w:num>
+  <w:num w:numId="9" w16cid:durableId="1542210779">
     <w:abstractNumId w:val="8"/>
   </w:num>
-  <w:num w:numId="8" w16cid:durableId="916011410">
-    <w:abstractNumId w:val="9"/>
-  </w:num>
-  <w:num w:numId="9" w16cid:durableId="1542210779">
+  <w:num w:numId="10" w16cid:durableId="51738587">
     <w:abstractNumId w:val="7"/>
   </w:num>
-  <w:num w:numId="10" w16cid:durableId="51738587">
+  <w:num w:numId="11" w16cid:durableId="1922643781">
+    <w:abstractNumId w:val="11"/>
+  </w:num>
+  <w:num w:numId="12" w16cid:durableId="2051178246">
     <w:abstractNumId w:val="6"/>
-  </w:num>
-  <w:num w:numId="11" w16cid:durableId="1922643781">
-    <w:abstractNumId w:val="10"/>
   </w:num>
 </w:numbering>
 </file>

</xml_diff>